<commit_message>
docs: aggiornamento manuali con URL online Cloudflare
Aggiornati URL accesso per tunnel Cloudflare:
- Studio Legale AI: https://studio-legale.geneforge.eu
- Notaio AI: https://notaio-ai.geneforge.eu

File aggiornati:
- STUDIO_LEGALE_AI_MANUALE_IT.md + .docx
- NOTAIO_AI_MANUALE_IT.md + .docx
</commit_message>
<xml_diff>
--- a/NOTAIO_AI_MANUALE_IT.docx
+++ b/NOTAIO_AI_MANUALE_IT.docx
@@ -527,6 +527,25 @@
         <w:pStyle w:val="FirstParagraph"/>
       </w:pPr>
       <w:r>
+        <w:t xml:space="preserve">Se usi il tunnel Cloudflare (accesso online):</w:t>
+      </w:r>
+    </w:p>
+    <w:p>
+      <w:pPr>
+        <w:pStyle w:val="SourceCode"/>
+      </w:pPr>
+      <w:r>
+        <w:rPr>
+          <w:rStyle w:val="VerbatimChar"/>
+        </w:rPr>
+        <w:t xml:space="preserve">https://notaio-ai.geneforge.eu</w:t>
+      </w:r>
+    </w:p>
+    <w:p>
+      <w:pPr>
+        <w:pStyle w:val="FirstParagraph"/>
+      </w:pPr>
+      <w:r>
         <w:t xml:space="preserve">Non serve password. L’applicazione è pronta all’uso.</w:t>
       </w:r>
     </w:p>
@@ -699,7 +718,25 @@
         <w:t xml:space="preserve">http://localhost:8507</w:t>
       </w:r>
       <w:r>
-        <w:t xml:space="preserve">)</w:t>
+        <w:t xml:space="preserve"> </w:t>
+      </w:r>
+      <w:r>
+        <w:t xml:space="preserve">o</w:t>
+      </w:r>
+      <w:r>
+        <w:t xml:space="preserve"> </w:t>
+      </w:r>
+      <w:r>
+        <w:rPr>
+          <w:rStyle w:val="VerbatimChar"/>
+        </w:rPr>
+        <w:t xml:space="preserve">https://notaio-ai.geneforge.eu</w:t>
+      </w:r>
+      <w:r>
+        <w:t xml:space="preserve"> </w:t>
+      </w:r>
+      <w:r>
+        <w:t xml:space="preserve">se online)</w:t>
       </w:r>
     </w:p>
     <w:p>
@@ -1181,6 +1218,27 @@
           <w:rStyle w:val="VerbatimChar"/>
         </w:rPr>
         <w:t xml:space="preserve">http://localhost:8507</w:t>
+      </w:r>
+      <w:r>
+        <w:t xml:space="preserve"> </w:t>
+      </w:r>
+      <w:r>
+        <w:t xml:space="preserve">(o</w:t>
+      </w:r>
+      <w:r>
+        <w:t xml:space="preserve"> </w:t>
+      </w:r>
+      <w:r>
+        <w:rPr>
+          <w:rStyle w:val="VerbatimChar"/>
+        </w:rPr>
+        <w:t xml:space="preserve">https://notaio-ai.geneforge.eu</w:t>
+      </w:r>
+      <w:r>
+        <w:t xml:space="preserve"> </w:t>
+      </w:r>
+      <w:r>
+        <w:t xml:space="preserve">se online)</w:t>
       </w:r>
     </w:p>
     <w:p>

</xml_diff>

<commit_message>
Aggiorna manuale Notaio AI v1.1 — selettore tipo atto, 7 form dedicate, workflow adattivo
</commit_message>
<xml_diff>
--- a/NOTAIO_AI_MANUALE_IT.docx
+++ b/NOTAIO_AI_MANUALE_IT.docx
@@ -2,7 +2,7 @@
 <file path=word/document.xml><?xml version="1.0" encoding="utf-8"?>
 <w:document xmlns:w="http://schemas.openxmlformats.org/wordprocessingml/2006/main" xmlns:m="http://schemas.openxmlformats.org/officeDocument/2006/math" xmlns:r="http://schemas.openxmlformats.org/officeDocument/2006/relationships" xmlns:o="urn:schemas-microsoft-com:office:office" xmlns:v="urn:schemas-microsoft-com:vml" xmlns:w10="urn:schemas-microsoft-com:office:word" xmlns:a="http://schemas.openxmlformats.org/drawingml/2006/main" xmlns:pic="http://schemas.openxmlformats.org/drawingml/2006/picture" xmlns:wp="http://schemas.openxmlformats.org/drawingml/2006/wordprocessingDrawing">
   <w:body>
-    <w:bookmarkStart w:id="62" w:name="notaio-ai-manuale-utente"/>
+    <w:bookmarkStart w:id="67" w:name="notaio-ai-manuale-utente"/>
     <w:p>
       <w:pPr>
         <w:pStyle w:val="Heading1"/>
@@ -26,10 +26,10 @@
         <w:t xml:space="preserve"> </w:t>
       </w:r>
       <w:r>
-        <w:t xml:space="preserve">1.0</w:t>
-      </w:r>
-      <w:r>
-        <w:br/>
+        <w:t xml:space="preserve">1.1</w:t>
+      </w:r>
+      <w:r>
+        <w:t xml:space="preserve"> </w:t>
       </w:r>
       <w:r>
         <w:rPr>
@@ -42,10 +42,10 @@
         <w:t xml:space="preserve"> </w:t>
       </w:r>
       <w:r>
-        <w:t xml:space="preserve">3 Maggio 2026</w:t>
-      </w:r>
-      <w:r>
-        <w:br/>
+        <w:t xml:space="preserve">26 Aprile 2026</w:t>
+      </w:r>
+      <w:r>
+        <w:t xml:space="preserve"> </w:t>
       </w:r>
       <w:r>
         <w:rPr>
@@ -61,7 +61,7 @@
         <w:t xml:space="preserve">GeneForge AI — Notaio AI</w:t>
       </w:r>
       <w:r>
-        <w:br/>
+        <w:t xml:space="preserve"> </w:t>
       </w:r>
       <w:r>
         <w:rPr>
@@ -157,7 +157,7 @@
         <w:t xml:space="preserve"> </w:t>
       </w:r>
       <w:r>
-        <w:t xml:space="preserve">con agenti AI specializzati (compravendite, società, testamenti, mutui)</w:t>
+        <w:t xml:space="preserve">con agenti AI specializzati per 7 tipi di atto</w:t>
       </w:r>
     </w:p>
     <w:p>
@@ -179,7 +179,7 @@
         <w:t xml:space="preserve"> </w:t>
       </w:r>
       <w:r>
-        <w:t xml:space="preserve">con report strutturati e checklist</w:t>
+        <w:t xml:space="preserve">con report strutturati e checklist (atti immobiliari)</w:t>
       </w:r>
     </w:p>
     <w:p>
@@ -201,7 +201,7 @@
         <w:t xml:space="preserve"> </w:t>
       </w:r>
       <w:r>
-        <w:t xml:space="preserve">con verifica agevolazioni</w:t>
+        <w:t xml:space="preserve">con verifica agevolazioni (atti immobiliari)</w:t>
       </w:r>
     </w:p>
     <w:p>
@@ -397,7 +397,7 @@
               <w:jc w:val="left"/>
             </w:pPr>
             <w:r>
-              <w:t xml:space="preserve">Un atto di compravendita si genera in 2-3 minuti</w:t>
+              <w:t xml:space="preserve">Un atto si genera in 2–3 minuti (5 fasi) o 1–2 minuti (3 fasi)</w:t>
             </w:r>
           </w:p>
         </w:tc>
@@ -1160,175 +1160,506 @@
       </w:r>
     </w:p>
     <w:bookmarkEnd w:id="28"/>
-    <w:bookmarkStart w:id="34" w:name="workflow-compravendita-guida-passo-passo"/>
+    <w:bookmarkStart w:id="30" w:name="selettore-tipo-atto-e-form-dedicate"/>
     <w:p>
       <w:pPr>
         <w:pStyle w:val="Heading2"/>
       </w:pPr>
       <w:r>
-        <w:t xml:space="preserve">4. Workflow Compravendita — Guida Passo-passo</w:t>
-      </w:r>
-    </w:p>
-    <w:bookmarkStart w:id="29" w:name="panoramica-del-flusso"/>
+        <w:t xml:space="preserve">4. Selettore Tipo Atto e Form Dedicate</w:t>
+      </w:r>
+    </w:p>
+    <w:bookmarkStart w:id="29" w:name="panoramica"/>
     <w:p>
       <w:pPr>
         <w:pStyle w:val="Heading3"/>
       </w:pPr>
       <w:r>
-        <w:t xml:space="preserve">Panoramica del flusso</w:t>
-      </w:r>
-    </w:p>
-    <w:p>
-      <w:pPr>
-        <w:pStyle w:val="SourceCode"/>
-      </w:pPr>
-      <w:r>
-        <w:rPr>
-          <w:rStyle w:val="VerbatimChar"/>
-        </w:rPr>
-        <w:t xml:space="preserve">Inserimento dati → Verifica Catastale → Conformità → Stesura Atto → Controllo → Scadenze</w:t>
-      </w:r>
-    </w:p>
-    <w:bookmarkEnd w:id="29"/>
-    <w:bookmarkStart w:id="30" w:name="passo-1-inserimento-dati"/>
-    <w:p>
-      <w:pPr>
-        <w:pStyle w:val="Heading3"/>
-      </w:pPr>
-      <w:r>
-        <w:t xml:space="preserve">Passo 1 — Inserimento dati</w:t>
-      </w:r>
-    </w:p>
-    <w:p>
-      <w:pPr>
-        <w:numPr>
-          <w:ilvl w:val="0"/>
-          <w:numId w:val="1004"/>
-        </w:numPr>
-        <w:pStyle w:val="Compact"/>
-      </w:pPr>
-      <w:r>
-        <w:t xml:space="preserve">Apri Notaio AI su</w:t>
-      </w:r>
-      <w:r>
-        <w:t xml:space="preserve"> </w:t>
-      </w:r>
-      <w:r>
-        <w:rPr>
-          <w:rStyle w:val="VerbatimChar"/>
-        </w:rPr>
-        <w:t xml:space="preserve">http://localhost:8507</w:t>
-      </w:r>
-      <w:r>
-        <w:t xml:space="preserve"> </w:t>
-      </w:r>
-      <w:r>
-        <w:t xml:space="preserve">(o</w:t>
-      </w:r>
-      <w:r>
-        <w:t xml:space="preserve"> </w:t>
-      </w:r>
-      <w:r>
-        <w:rPr>
-          <w:rStyle w:val="VerbatimChar"/>
-        </w:rPr>
-        <w:t xml:space="preserve">https://notaio-ai.geneforge.eu</w:t>
-      </w:r>
-      <w:r>
-        <w:t xml:space="preserve"> </w:t>
-      </w:r>
-      <w:r>
-        <w:t xml:space="preserve">se online)</w:t>
-      </w:r>
-    </w:p>
-    <w:p>
-      <w:pPr>
-        <w:numPr>
-          <w:ilvl w:val="0"/>
-          <w:numId w:val="1004"/>
-        </w:numPr>
-        <w:pStyle w:val="Compact"/>
-      </w:pPr>
-      <w:r>
-        <w:t xml:space="preserve">Compila il form in 4 sezioni:</w:t>
-      </w:r>
-    </w:p>
-    <w:p>
-      <w:pPr>
-        <w:numPr>
-          <w:ilvl w:val="1"/>
-          <w:numId w:val="1005"/>
-        </w:numPr>
-        <w:pStyle w:val="Compact"/>
-      </w:pPr>
-      <w:r>
-        <w:rPr>
-          <w:bCs/>
-          <w:b/>
-        </w:rPr>
-        <w:t xml:space="preserve">Dati Venditore</w:t>
-      </w:r>
-      <w:r>
-        <w:t xml:space="preserve">: Nome, Cognome, CF, Nato a, Residente in</w:t>
-      </w:r>
-    </w:p>
-    <w:p>
-      <w:pPr>
-        <w:numPr>
-          <w:ilvl w:val="1"/>
-          <w:numId w:val="1005"/>
-        </w:numPr>
-        <w:pStyle w:val="Compact"/>
-      </w:pPr>
-      <w:r>
-        <w:rPr>
-          <w:bCs/>
-          <w:b/>
-        </w:rPr>
-        <w:t xml:space="preserve">Dati Acquirente</w:t>
-      </w:r>
-      <w:r>
-        <w:t xml:space="preserve">: Nome, Cognome, CF, Nato a, Residente in, Età, ISEE</w:t>
-      </w:r>
-    </w:p>
-    <w:p>
-      <w:pPr>
-        <w:numPr>
-          <w:ilvl w:val="1"/>
-          <w:numId w:val="1005"/>
-        </w:numPr>
-        <w:pStyle w:val="Compact"/>
-      </w:pPr>
-      <w:r>
-        <w:rPr>
-          <w:bCs/>
-          <w:b/>
-        </w:rPr>
-        <w:t xml:space="preserve">Dati Immobile</w:t>
-      </w:r>
-      <w:r>
-        <w:t xml:space="preserve">: Comune, Indirizzo, Foglio, Mappa, Sub, Categoria, Consistenza, Rendita</w:t>
-      </w:r>
-    </w:p>
-    <w:p>
-      <w:pPr>
-        <w:numPr>
-          <w:ilvl w:val="1"/>
-          <w:numId w:val="1005"/>
-        </w:numPr>
-        <w:pStyle w:val="Compact"/>
-      </w:pPr>
-      <w:r>
-        <w:rPr>
-          <w:bCs/>
-          <w:b/>
-        </w:rPr>
-        <w:t xml:space="preserve">Dati Economici</w:t>
-      </w:r>
-      <w:r>
-        <w:t xml:space="preserve">: Prezzo, Onorario Notaio, Clausole particolari</w:t>
-      </w:r>
-    </w:p>
+        <w:t xml:space="preserve">Panoramica</w:t>
+      </w:r>
+    </w:p>
+    <w:p>
+      <w:pPr>
+        <w:pStyle w:val="FirstParagraph"/>
+      </w:pPr>
+      <w:r>
+        <w:t xml:space="preserve">Notaio AI supporta</w:t>
+      </w:r>
+      <w:r>
+        <w:t xml:space="preserve"> </w:t>
+      </w:r>
+      <w:r>
+        <w:rPr>
+          <w:bCs/>
+          <w:b/>
+        </w:rPr>
+        <w:t xml:space="preserve">7 tipi di atto notarile</w:t>
+      </w:r>
+      <w:r>
+        <w:t xml:space="preserve">. Al centro della schermata principale trovi il selettore</w:t>
+      </w:r>
+      <w:r>
+        <w:t xml:space="preserve"> </w:t>
+      </w:r>
+      <w:r>
+        <w:rPr>
+          <w:bCs/>
+          <w:b/>
+        </w:rPr>
+        <w:t xml:space="preserve">⚖️ Tipo di Atto</w:t>
+      </w:r>
+      <w:r>
+        <w:t xml:space="preserve"> </w:t>
+      </w:r>
+      <w:r>
+        <w:t xml:space="preserve">— scegli quello che ti serve e il form si adatta automaticamente.</w:t>
+      </w:r>
+    </w:p>
+    <w:tbl>
+      <w:tblPr>
+        <w:tblStyle w:val="Table"/>
+        <w:tblW w:type="pct" w:w="5000"/>
+        <w:tblLook w:firstRow="1" w:lastRow="0" w:firstColumn="0" w:lastColumn="0" w:noHBand="0" w:noVBand="0" w:val="0020"/>
+        <w:jc w:val="start"/>
+      </w:tblPr>
+      <w:tblGrid>
+        <w:gridCol w:w="505"/>
+        <w:gridCol w:w="2359"/>
+        <w:gridCol w:w="2527"/>
+        <w:gridCol w:w="2527"/>
+      </w:tblGrid>
+      <w:tr>
+        <w:trPr>
+          <w:tblHeader w:val="true"/>
+        </w:trPr>
+        <w:tc>
+          <w:tcPr/>
+          <w:p>
+            <w:pPr>
+              <w:pStyle w:val="Compact"/>
+              <w:jc w:val="left"/>
+            </w:pPr>
+            <w:r>
+              <w:t xml:space="preserve">#</w:t>
+            </w:r>
+          </w:p>
+        </w:tc>
+        <w:tc>
+          <w:tcPr/>
+          <w:p>
+            <w:pPr>
+              <w:pStyle w:val="Compact"/>
+              <w:jc w:val="left"/>
+            </w:pPr>
+            <w:r>
+              <w:t xml:space="preserve">Tipo di Atto</w:t>
+            </w:r>
+          </w:p>
+        </w:tc>
+        <w:tc>
+          <w:tcPr/>
+          <w:p>
+            <w:pPr>
+              <w:pStyle w:val="Compact"/>
+              <w:jc w:val="left"/>
+            </w:pPr>
+            <w:r>
+              <w:t xml:space="preserve">Form dedicate</w:t>
+            </w:r>
+          </w:p>
+        </w:tc>
+        <w:tc>
+          <w:tcPr/>
+          <w:p>
+            <w:pPr>
+              <w:pStyle w:val="Compact"/>
+              <w:jc w:val="left"/>
+            </w:pPr>
+            <w:r>
+              <w:t xml:space="preserve">Fasi workflow</w:t>
+            </w:r>
+          </w:p>
+        </w:tc>
+      </w:tr>
+      <w:tr>
+        <w:tc>
+          <w:tcPr/>
+          <w:p>
+            <w:pPr>
+              <w:pStyle w:val="Compact"/>
+              <w:jc w:val="left"/>
+            </w:pPr>
+            <w:r>
+              <w:t xml:space="preserve">1</w:t>
+            </w:r>
+          </w:p>
+        </w:tc>
+        <w:tc>
+          <w:tcPr/>
+          <w:p>
+            <w:pPr>
+              <w:pStyle w:val="Compact"/>
+              <w:jc w:val="left"/>
+            </w:pPr>
+            <w:r>
+              <w:rPr>
+                <w:bCs/>
+                <w:b/>
+              </w:rPr>
+              <w:t xml:space="preserve">Compravendita immobiliare</w:t>
+            </w:r>
+          </w:p>
+        </w:tc>
+        <w:tc>
+          <w:tcPr/>
+          <w:p>
+            <w:pPr>
+              <w:pStyle w:val="Compact"/>
+              <w:jc w:val="left"/>
+            </w:pPr>
+            <w:r>
+              <w:t xml:space="preserve">Venditore, Acquirente, Immobile, Economico</w:t>
+            </w:r>
+          </w:p>
+        </w:tc>
+        <w:tc>
+          <w:tcPr/>
+          <w:p>
+            <w:pPr>
+              <w:pStyle w:val="Compact"/>
+              <w:jc w:val="left"/>
+            </w:pPr>
+            <w:r>
+              <w:t xml:space="preserve">5 fasi</w:t>
+            </w:r>
+          </w:p>
+        </w:tc>
+      </w:tr>
+      <w:tr>
+        <w:tc>
+          <w:tcPr/>
+          <w:p>
+            <w:pPr>
+              <w:pStyle w:val="Compact"/>
+              <w:jc w:val="left"/>
+            </w:pPr>
+            <w:r>
+              <w:t xml:space="preserve">2</w:t>
+            </w:r>
+          </w:p>
+        </w:tc>
+        <w:tc>
+          <w:tcPr/>
+          <w:p>
+            <w:pPr>
+              <w:pStyle w:val="Compact"/>
+              <w:jc w:val="left"/>
+            </w:pPr>
+            <w:r>
+              <w:rPr>
+                <w:bCs/>
+                <w:b/>
+              </w:rPr>
+              <w:t xml:space="preserve">Costituzione SRL</w:t>
+            </w:r>
+          </w:p>
+        </w:tc>
+        <w:tc>
+          <w:tcPr/>
+          <w:p>
+            <w:pPr>
+              <w:pStyle w:val="Compact"/>
+              <w:jc w:val="left"/>
+            </w:pPr>
+            <w:r>
+              <w:t xml:space="preserve">Soci, Denominazione, Sede, Oggetto, Capitale, Amministratore, Statuto</w:t>
+            </w:r>
+          </w:p>
+        </w:tc>
+        <w:tc>
+          <w:tcPr/>
+          <w:p>
+            <w:pPr>
+              <w:pStyle w:val="Compact"/>
+              <w:jc w:val="left"/>
+            </w:pPr>
+            <w:r>
+              <w:t xml:space="preserve">3 fasi</w:t>
+            </w:r>
+          </w:p>
+        </w:tc>
+      </w:tr>
+      <w:tr>
+        <w:tc>
+          <w:tcPr/>
+          <w:p>
+            <w:pPr>
+              <w:pStyle w:val="Compact"/>
+              <w:jc w:val="left"/>
+            </w:pPr>
+            <w:r>
+              <w:t xml:space="preserve">3</w:t>
+            </w:r>
+          </w:p>
+        </w:tc>
+        <w:tc>
+          <w:tcPr/>
+          <w:p>
+            <w:pPr>
+              <w:pStyle w:val="Compact"/>
+              <w:jc w:val="left"/>
+            </w:pPr>
+            <w:r>
+              <w:rPr>
+                <w:bCs/>
+                <w:b/>
+              </w:rPr>
+              <w:t xml:space="preserve">Testamento</w:t>
+            </w:r>
+          </w:p>
+        </w:tc>
+        <w:tc>
+          <w:tcPr/>
+          <w:p>
+            <w:pPr>
+              <w:pStyle w:val="Compact"/>
+              <w:jc w:val="left"/>
+            </w:pPr>
+            <w:r>
+              <w:t xml:space="preserve">Testatore, Eredi, Legati, Esecutore, Disposizioni</w:t>
+            </w:r>
+          </w:p>
+        </w:tc>
+        <w:tc>
+          <w:tcPr/>
+          <w:p>
+            <w:pPr>
+              <w:pStyle w:val="Compact"/>
+              <w:jc w:val="left"/>
+            </w:pPr>
+            <w:r>
+              <w:t xml:space="preserve">3 fasi</w:t>
+            </w:r>
+          </w:p>
+        </w:tc>
+      </w:tr>
+      <w:tr>
+        <w:tc>
+          <w:tcPr/>
+          <w:p>
+            <w:pPr>
+              <w:pStyle w:val="Compact"/>
+              <w:jc w:val="left"/>
+            </w:pPr>
+            <w:r>
+              <w:t xml:space="preserve">4</w:t>
+            </w:r>
+          </w:p>
+        </w:tc>
+        <w:tc>
+          <w:tcPr/>
+          <w:p>
+            <w:pPr>
+              <w:pStyle w:val="Compact"/>
+              <w:jc w:val="left"/>
+            </w:pPr>
+            <w:r>
+              <w:rPr>
+                <w:bCs/>
+                <w:b/>
+              </w:rPr>
+              <w:t xml:space="preserve">Patto di famiglia</w:t>
+            </w:r>
+          </w:p>
+        </w:tc>
+        <w:tc>
+          <w:tcPr/>
+          <w:p>
+            <w:pPr>
+              <w:pStyle w:val="Compact"/>
+              <w:jc w:val="left"/>
+            </w:pPr>
+            <w:r>
+              <w:t xml:space="preserve">Contraenti, Bene, Regime, Durata, Successori</w:t>
+            </w:r>
+          </w:p>
+        </w:tc>
+        <w:tc>
+          <w:tcPr/>
+          <w:p>
+            <w:pPr>
+              <w:pStyle w:val="Compact"/>
+              <w:jc w:val="left"/>
+            </w:pPr>
+            <w:r>
+              <w:t xml:space="preserve">3 fasi</w:t>
+            </w:r>
+          </w:p>
+        </w:tc>
+      </w:tr>
+      <w:tr>
+        <w:tc>
+          <w:tcPr/>
+          <w:p>
+            <w:pPr>
+              <w:pStyle w:val="Compact"/>
+              <w:jc w:val="left"/>
+            </w:pPr>
+            <w:r>
+              <w:t xml:space="preserve">5</w:t>
+            </w:r>
+          </w:p>
+        </w:tc>
+        <w:tc>
+          <w:tcPr/>
+          <w:p>
+            <w:pPr>
+              <w:pStyle w:val="Compact"/>
+              <w:jc w:val="left"/>
+            </w:pPr>
+            <w:r>
+              <w:rPr>
+                <w:bCs/>
+                <w:b/>
+              </w:rPr>
+              <w:t xml:space="preserve">Mutuo ipotecario</w:t>
+            </w:r>
+          </w:p>
+        </w:tc>
+        <w:tc>
+          <w:tcPr/>
+          <w:p>
+            <w:pPr>
+              <w:pStyle w:val="Compact"/>
+              <w:jc w:val="left"/>
+            </w:pPr>
+            <w:r>
+              <w:t xml:space="preserve">Mutuatario, Istituto, Importo, Tasso, Durata, Immobile garanzia</w:t>
+            </w:r>
+          </w:p>
+        </w:tc>
+        <w:tc>
+          <w:tcPr/>
+          <w:p>
+            <w:pPr>
+              <w:pStyle w:val="Compact"/>
+              <w:jc w:val="left"/>
+            </w:pPr>
+            <w:r>
+              <w:t xml:space="preserve">5 fasi</w:t>
+            </w:r>
+          </w:p>
+        </w:tc>
+      </w:tr>
+      <w:tr>
+        <w:tc>
+          <w:tcPr/>
+          <w:p>
+            <w:pPr>
+              <w:pStyle w:val="Compact"/>
+              <w:jc w:val="left"/>
+            </w:pPr>
+            <w:r>
+              <w:t xml:space="preserve">6</w:t>
+            </w:r>
+          </w:p>
+        </w:tc>
+        <w:tc>
+          <w:tcPr/>
+          <w:p>
+            <w:pPr>
+              <w:pStyle w:val="Compact"/>
+              <w:jc w:val="left"/>
+            </w:pPr>
+            <w:r>
+              <w:rPr>
+                <w:bCs/>
+                <w:b/>
+              </w:rPr>
+              <w:t xml:space="preserve">Divisione</w:t>
+            </w:r>
+          </w:p>
+        </w:tc>
+        <w:tc>
+          <w:tcPr/>
+          <w:p>
+            <w:pPr>
+              <w:pStyle w:val="Compact"/>
+              <w:jc w:val="left"/>
+            </w:pPr>
+            <w:r>
+              <w:t xml:space="preserve">Coeredi, Bene, Quote, Modalità</w:t>
+            </w:r>
+          </w:p>
+        </w:tc>
+        <w:tc>
+          <w:tcPr/>
+          <w:p>
+            <w:pPr>
+              <w:pStyle w:val="Compact"/>
+              <w:jc w:val="left"/>
+            </w:pPr>
+            <w:r>
+              <w:t xml:space="preserve">5 fasi</w:t>
+            </w:r>
+          </w:p>
+        </w:tc>
+      </w:tr>
+      <w:tr>
+        <w:tc>
+          <w:tcPr/>
+          <w:p>
+            <w:pPr>
+              <w:pStyle w:val="Compact"/>
+              <w:jc w:val="left"/>
+            </w:pPr>
+            <w:r>
+              <w:t xml:space="preserve">7</w:t>
+            </w:r>
+          </w:p>
+        </w:tc>
+        <w:tc>
+          <w:tcPr/>
+          <w:p>
+            <w:pPr>
+              <w:pStyle w:val="Compact"/>
+              <w:jc w:val="left"/>
+            </w:pPr>
+            <w:r>
+              <w:rPr>
+                <w:bCs/>
+                <w:b/>
+              </w:rPr>
+              <w:t xml:space="preserve">Donazione</w:t>
+            </w:r>
+          </w:p>
+        </w:tc>
+        <w:tc>
+          <w:tcPr/>
+          <w:p>
+            <w:pPr>
+              <w:pStyle w:val="Compact"/>
+              <w:jc w:val="left"/>
+            </w:pPr>
+            <w:r>
+              <w:t xml:space="preserve">Donante, Donatario, Bene, Regime fiscale, Oneri</w:t>
+            </w:r>
+          </w:p>
+        </w:tc>
+        <w:tc>
+          <w:tcPr/>
+          <w:p>
+            <w:pPr>
+              <w:pStyle w:val="Compact"/>
+              <w:jc w:val="left"/>
+            </w:pPr>
+            <w:r>
+              <w:t xml:space="preserve">5 fasi</w:t>
+            </w:r>
+          </w:p>
+        </w:tc>
+      </w:tr>
+    </w:tbl>
     <w:p>
       <w:pPr>
         <w:pStyle w:val="BlockText"/>
@@ -1344,458 +1675,13 @@
           <w:bCs/>
           <w:b/>
         </w:rPr>
-        <w:t xml:space="preserve">Suggerimento:</w:t>
-      </w:r>
-      <w:r>
-        <w:t xml:space="preserve"> </w:t>
-      </w:r>
-      <w:r>
-        <w:t xml:space="preserve">Seleziona il cliente dall’anagrafica (se disponibile) per pre-compilare i dati.</w:t>
-      </w:r>
-    </w:p>
-    <w:bookmarkEnd w:id="30"/>
-    <w:bookmarkStart w:id="31" w:name="passo-2-generazione"/>
-    <w:p>
-      <w:pPr>
-        <w:pStyle w:val="Heading3"/>
-      </w:pPr>
-      <w:r>
-        <w:t xml:space="preserve">Passo 2 — Generazione</w:t>
-      </w:r>
-    </w:p>
-    <w:p>
-      <w:pPr>
-        <w:numPr>
-          <w:ilvl w:val="0"/>
-          <w:numId w:val="1006"/>
-        </w:numPr>
-        <w:pStyle w:val="Compact"/>
-      </w:pPr>
-      <w:r>
-        <w:t xml:space="preserve">Clicca su</w:t>
-      </w:r>
-      <w:r>
-        <w:t xml:space="preserve"> </w:t>
-      </w:r>
-      <w:r>
-        <w:rPr>
-          <w:bCs/>
-          <w:b/>
-        </w:rPr>
-        <w:t xml:space="preserve">“</w:t>
-      </w:r>
-      <w:r>
-        <w:rPr>
-          <w:bCs/>
-          <w:b/>
-        </w:rPr>
-        <w:t xml:space="preserve">⚖️ Genera Atto di Compravendita</w:t>
-      </w:r>
-      <w:r>
-        <w:rPr>
-          <w:bCs/>
-          <w:b/>
-        </w:rPr>
-        <w:t xml:space="preserve">”</w:t>
-      </w:r>
-    </w:p>
-    <w:p>
-      <w:pPr>
-        <w:numPr>
-          <w:ilvl w:val="0"/>
-          <w:numId w:val="1006"/>
-        </w:numPr>
-        <w:pStyle w:val="Compact"/>
-      </w:pPr>
-      <w:r>
-        <w:t xml:space="preserve">Il sistema esegue 5 fasi in sequenza:</w:t>
-      </w:r>
-    </w:p>
-    <w:p>
-      <w:pPr>
-        <w:numPr>
-          <w:ilvl w:val="1"/>
-          <w:numId w:val="1007"/>
-        </w:numPr>
-        <w:pStyle w:val="Compact"/>
-      </w:pPr>
-      <w:r>
-        <w:rPr>
-          <w:bCs/>
-          <w:b/>
-        </w:rPr>
-        <w:t xml:space="preserve">Fase 1/5: Verifica Catastale</w:t>
-      </w:r>
-      <w:r>
-        <w:t xml:space="preserve"> </w:t>
-      </w:r>
-      <w:r>
-        <w:t xml:space="preserve">(~15-20s)</w:t>
-      </w:r>
-    </w:p>
-    <w:p>
-      <w:pPr>
-        <w:numPr>
-          <w:ilvl w:val="1"/>
-          <w:numId w:val="1007"/>
-        </w:numPr>
-        <w:pStyle w:val="Compact"/>
-      </w:pPr>
-      <w:r>
-        <w:rPr>
-          <w:bCs/>
-          <w:b/>
-        </w:rPr>
-        <w:t xml:space="preserve">Fase 2/5: Verifica Conformità</w:t>
-      </w:r>
-      <w:r>
-        <w:t xml:space="preserve"> </w:t>
-      </w:r>
-      <w:r>
-        <w:t xml:space="preserve">(~50-70s)</w:t>
-      </w:r>
-    </w:p>
-    <w:p>
-      <w:pPr>
-        <w:numPr>
-          <w:ilvl w:val="1"/>
-          <w:numId w:val="1007"/>
-        </w:numPr>
-        <w:pStyle w:val="Compact"/>
-      </w:pPr>
-      <w:r>
-        <w:rPr>
-          <w:bCs/>
-          <w:b/>
-        </w:rPr>
-        <w:t xml:space="preserve">Fase 3/5: Stesura Atto</w:t>
-      </w:r>
-      <w:r>
-        <w:t xml:space="preserve"> </w:t>
-      </w:r>
-      <w:r>
-        <w:t xml:space="preserve">(~50-70s)</w:t>
-      </w:r>
-    </w:p>
-    <w:p>
-      <w:pPr>
-        <w:numPr>
-          <w:ilvl w:val="1"/>
-          <w:numId w:val="1007"/>
-        </w:numPr>
-        <w:pStyle w:val="Compact"/>
-      </w:pPr>
-      <w:r>
-        <w:rPr>
-          <w:bCs/>
-          <w:b/>
-        </w:rPr>
-        <w:t xml:space="preserve">Fase 4/5: Controllo Documenti</w:t>
-      </w:r>
-      <w:r>
-        <w:t xml:space="preserve"> </w:t>
-      </w:r>
-      <w:r>
-        <w:t xml:space="preserve">(~15-20s)</w:t>
-      </w:r>
-    </w:p>
-    <w:p>
-      <w:pPr>
-        <w:numPr>
-          <w:ilvl w:val="1"/>
-          <w:numId w:val="1007"/>
-        </w:numPr>
-        <w:pStyle w:val="Compact"/>
-      </w:pPr>
-      <w:r>
-        <w:rPr>
-          <w:bCs/>
-          <w:b/>
-        </w:rPr>
-        <w:t xml:space="preserve">Fase 5/5: Cronoprogramma Scadenze</w:t>
-      </w:r>
-      <w:r>
-        <w:t xml:space="preserve"> </w:t>
-      </w:r>
-      <w:r>
-        <w:t xml:space="preserve">(~15-20s)</w:t>
-      </w:r>
-    </w:p>
-    <w:p>
-      <w:pPr>
-        <w:numPr>
-          <w:ilvl w:val="0"/>
-          <w:numId w:val="1006"/>
-        </w:numPr>
-        <w:pStyle w:val="Compact"/>
-      </w:pPr>
-      <w:r>
-        <w:t xml:space="preserve">Il documento completo apparirà nell’area risultato</w:t>
-      </w:r>
-    </w:p>
-    <w:bookmarkEnd w:id="31"/>
-    <w:bookmarkStart w:id="32" w:name="passo-3-revisione"/>
-    <w:p>
-      <w:pPr>
-        <w:pStyle w:val="Heading3"/>
-      </w:pPr>
-      <w:r>
-        <w:t xml:space="preserve">Passo 3 — Revisione</w:t>
-      </w:r>
-    </w:p>
-    <w:p>
-      <w:pPr>
-        <w:numPr>
-          <w:ilvl w:val="0"/>
-          <w:numId w:val="1008"/>
-        </w:numPr>
-        <w:pStyle w:val="Compact"/>
-      </w:pPr>
-      <w:r>
-        <w:rPr>
-          <w:bCs/>
-          <w:b/>
-        </w:rPr>
-        <w:t xml:space="preserve">Leggi il report catastale</w:t>
-      </w:r>
-      <w:r>
-        <w:t xml:space="preserve">: verifica che i dati siano coerenti con la visura reale</w:t>
-      </w:r>
-    </w:p>
-    <w:p>
-      <w:pPr>
-        <w:numPr>
-          <w:ilvl w:val="0"/>
-          <w:numId w:val="1008"/>
-        </w:numPr>
-        <w:pStyle w:val="Compact"/>
-      </w:pPr>
-      <w:r>
-        <w:rPr>
-          <w:bCs/>
-          <w:b/>
-        </w:rPr>
-        <w:t xml:space="preserve">Leggi il report conformità</w:t>
-      </w:r>
-      <w:r>
-        <w:t xml:space="preserve">: controlla i documenti mancanti evidenziati (es. APE, agibilità)</w:t>
-      </w:r>
-    </w:p>
-    <w:p>
-      <w:pPr>
-        <w:numPr>
-          <w:ilvl w:val="0"/>
-          <w:numId w:val="1008"/>
-        </w:numPr>
-        <w:pStyle w:val="Compact"/>
-      </w:pPr>
-      <w:r>
-        <w:rPr>
-          <w:bCs/>
-          <w:b/>
-        </w:rPr>
-        <w:t xml:space="preserve">Leggi l’atto</w:t>
-      </w:r>
-      <w:r>
-        <w:t xml:space="preserve">: verifica che il corpo giuridico sia corretto</w:t>
-      </w:r>
-    </w:p>
-    <w:p>
-      <w:pPr>
-        <w:numPr>
-          <w:ilvl w:val="0"/>
-          <w:numId w:val="1008"/>
-        </w:numPr>
-        <w:pStyle w:val="Compact"/>
-      </w:pPr>
-      <w:r>
-        <w:rPr>
-          <w:bCs/>
-          <w:b/>
-        </w:rPr>
-        <w:t xml:space="preserve">Leggi il controllo</w:t>
-      </w:r>
-      <w:r>
-        <w:t xml:space="preserve">: assicurati che tutti i documenti obbligatori siano presenti</w:t>
-      </w:r>
-    </w:p>
-    <w:p>
-      <w:pPr>
-        <w:numPr>
-          <w:ilvl w:val="0"/>
-          <w:numId w:val="1008"/>
-        </w:numPr>
-        <w:pStyle w:val="Compact"/>
-      </w:pPr>
-      <w:r>
-        <w:rPr>
-          <w:bCs/>
-          <w:b/>
-        </w:rPr>
-        <w:t xml:space="preserve">Leggi le scadenze</w:t>
-      </w:r>
-      <w:r>
-        <w:t xml:space="preserve">: verifica le date calcolate</w:t>
-      </w:r>
-    </w:p>
-    <w:p>
-      <w:pPr>
-        <w:pStyle w:val="BlockText"/>
-      </w:pPr>
-      <w:r>
-        <w:t xml:space="preserve">⚠️</w:t>
-      </w:r>
-      <w:r>
-        <w:t xml:space="preserve"> </w:t>
-      </w:r>
-      <w:r>
-        <w:rPr>
-          <w:bCs/>
-          <w:b/>
-        </w:rPr>
-        <w:t xml:space="preserve">Attenzione:</w:t>
-      </w:r>
-      <w:r>
-        <w:t xml:space="preserve"> </w:t>
-      </w:r>
-      <w:r>
-        <w:t xml:space="preserve">L’AI genera SOLO il corpo giuridico. Intestazione, procura e firma sono pre-compilate dal codice Python in modo deterministico.</w:t>
-      </w:r>
-    </w:p>
-    <w:bookmarkEnd w:id="32"/>
-    <w:bookmarkStart w:id="33" w:name="passo-4-export"/>
-    <w:p>
-      <w:pPr>
-        <w:pStyle w:val="Heading3"/>
-      </w:pPr>
-      <w:r>
-        <w:t xml:space="preserve">Passo 4 — Export</w:t>
-      </w:r>
-    </w:p>
-    <w:p>
-      <w:pPr>
-        <w:numPr>
-          <w:ilvl w:val="0"/>
-          <w:numId w:val="1009"/>
-        </w:numPr>
-        <w:pStyle w:val="Compact"/>
-      </w:pPr>
-      <w:r>
-        <w:t xml:space="preserve">Clicca su</w:t>
-      </w:r>
-      <w:r>
-        <w:t xml:space="preserve"> </w:t>
-      </w:r>
-      <w:r>
-        <w:rPr>
-          <w:bCs/>
-          <w:b/>
-        </w:rPr>
-        <w:t xml:space="preserve">“</w:t>
-      </w:r>
-      <w:r>
-        <w:rPr>
-          <w:bCs/>
-          <w:b/>
-        </w:rPr>
-        <w:t xml:space="preserve">📄 Scarica PDF</w:t>
-      </w:r>
-      <w:r>
-        <w:rPr>
-          <w:bCs/>
-          <w:b/>
-        </w:rPr>
-        <w:t xml:space="preserve">”</w:t>
-      </w:r>
-      <w:r>
-        <w:t xml:space="preserve"> </w:t>
-      </w:r>
-      <w:r>
-        <w:t xml:space="preserve">per la stampa</w:t>
-      </w:r>
-    </w:p>
-    <w:p>
-      <w:pPr>
-        <w:numPr>
-          <w:ilvl w:val="0"/>
-          <w:numId w:val="1009"/>
-        </w:numPr>
-        <w:pStyle w:val="Compact"/>
-      </w:pPr>
-      <w:r>
-        <w:t xml:space="preserve">Clicca su</w:t>
-      </w:r>
-      <w:r>
-        <w:t xml:space="preserve"> </w:t>
-      </w:r>
-      <w:r>
-        <w:rPr>
-          <w:bCs/>
-          <w:b/>
-        </w:rPr>
-        <w:t xml:space="preserve">“</w:t>
-      </w:r>
-      <w:r>
-        <w:rPr>
-          <w:bCs/>
-          <w:b/>
-        </w:rPr>
-        <w:t xml:space="preserve">📄 Scarica DOCX</w:t>
-      </w:r>
-      <w:r>
-        <w:rPr>
-          <w:bCs/>
-          <w:b/>
-        </w:rPr>
-        <w:t xml:space="preserve">”</w:t>
-      </w:r>
-      <w:r>
-        <w:t xml:space="preserve"> </w:t>
-      </w:r>
-      <w:r>
-        <w:t xml:space="preserve">per modifiche in Word/LibreOffice</w:t>
-      </w:r>
-    </w:p>
-    <w:p>
-      <w:pPr>
-        <w:numPr>
-          <w:ilvl w:val="0"/>
-          <w:numId w:val="1009"/>
-        </w:numPr>
-        <w:pStyle w:val="Compact"/>
-      </w:pPr>
-      <w:r>
-        <w:t xml:space="preserve">Clicca su</w:t>
-      </w:r>
-      <w:r>
-        <w:t xml:space="preserve"> </w:t>
-      </w:r>
-      <w:r>
-        <w:rPr>
-          <w:bCs/>
-          <w:b/>
-        </w:rPr>
-        <w:t xml:space="preserve">“</w:t>
-      </w:r>
-      <w:r>
-        <w:rPr>
-          <w:bCs/>
-          <w:b/>
-        </w:rPr>
-        <w:t xml:space="preserve">📧 Invia per Email</w:t>
-      </w:r>
-      <w:r>
-        <w:rPr>
-          <w:bCs/>
-          <w:b/>
-        </w:rPr>
-        <w:t xml:space="preserve">”</w:t>
-      </w:r>
-      <w:r>
-        <w:t xml:space="preserve"> </w:t>
-      </w:r>
-      <w:r>
-        <w:t xml:space="preserve">per inviare al cliente</w:t>
+        <w:t xml:space="preserve">Come funziona:</w:t>
+      </w:r>
+      <w:r>
+        <w:t xml:space="preserve"> </w:t>
+      </w:r>
+      <w:r>
+        <w:t xml:space="preserve">quando cambi tipo di atto, le card del form appaiono e scompaiono automaticamente. Compila solo i campi visibili.</w:t>
       </w:r>
     </w:p>
     <w:p>
@@ -1805,51 +1691,752 @@
         </w:pict>
       </w:r>
     </w:p>
+    <w:bookmarkEnd w:id="29"/>
+    <w:bookmarkEnd w:id="30"/>
+    <w:bookmarkStart w:id="36" w:name="Xd5f55d4fdeb3b3364a4d8aa1778895de4dc96c2"/>
+    <w:p>
+      <w:pPr>
+        <w:pStyle w:val="Heading2"/>
+      </w:pPr>
+      <w:r>
+        <w:t xml:space="preserve">5. Workflow per Tipo di Atto — Guida Passo-passo</w:t>
+      </w:r>
+    </w:p>
+    <w:bookmarkStart w:id="31" w:name="panoramica-del-flusso"/>
+    <w:p>
+      <w:pPr>
+        <w:pStyle w:val="Heading3"/>
+      </w:pPr>
+      <w:r>
+        <w:t xml:space="preserve">Panoramica del flusso</w:t>
+      </w:r>
+    </w:p>
+    <w:p>
+      <w:pPr>
+        <w:pStyle w:val="FirstParagraph"/>
+      </w:pPr>
+      <w:r>
+        <w:rPr>
+          <w:bCs/>
+          <w:b/>
+        </w:rPr>
+        <w:t xml:space="preserve">Atti immobiliari</w:t>
+      </w:r>
+      <w:r>
+        <w:t xml:space="preserve"> </w:t>
+      </w:r>
+      <w:r>
+        <w:t xml:space="preserve">(Compravendita, Mutuo, Divisione, Donazione):</w:t>
+      </w:r>
+    </w:p>
+    <w:p>
+      <w:pPr>
+        <w:pStyle w:val="SourceCode"/>
+      </w:pPr>
+      <w:r>
+        <w:rPr>
+          <w:rStyle w:val="VerbatimChar"/>
+        </w:rPr>
+        <w:t xml:space="preserve">Inserimento dati → Verifica Catastale → Conformità → Stesura Atto → Controllo → Scadenze</w:t>
+      </w:r>
+      <w:r>
+        <w:br/>
+      </w:r>
+      <w:r>
+        <w:rPr>
+          <w:rStyle w:val="VerbatimChar"/>
+        </w:rPr>
+        <w:t xml:space="preserve">                              ↑_____________↑</w:t>
+      </w:r>
+      <w:r>
+        <w:br/>
+      </w:r>
+      <w:r>
+        <w:rPr>
+          <w:rStyle w:val="VerbatimChar"/>
+        </w:rPr>
+        <w:t xml:space="preserve">                        (solo per atti con immobile)</w:t>
+      </w:r>
+    </w:p>
+    <w:p>
+      <w:pPr>
+        <w:pStyle w:val="FirstParagraph"/>
+      </w:pPr>
+      <w:r>
+        <w:rPr>
+          <w:bCs/>
+          <w:b/>
+        </w:rPr>
+        <w:t xml:space="preserve">Atti non immobiliari</w:t>
+      </w:r>
+      <w:r>
+        <w:t xml:space="preserve"> </w:t>
+      </w:r>
+      <w:r>
+        <w:t xml:space="preserve">(Costituzione SRL, Testamento, Patto di famiglia):</w:t>
+      </w:r>
+    </w:p>
+    <w:p>
+      <w:pPr>
+        <w:pStyle w:val="SourceCode"/>
+      </w:pPr>
+      <w:r>
+        <w:rPr>
+          <w:rStyle w:val="VerbatimChar"/>
+        </w:rPr>
+        <w:t xml:space="preserve">Inserimento dati → Stesura Atto → Controllo → Scadenze</w:t>
+      </w:r>
+    </w:p>
+    <w:bookmarkEnd w:id="31"/>
+    <w:bookmarkStart w:id="32" w:name="passo-1-selezione-e-inserimento-dati"/>
+    <w:p>
+      <w:pPr>
+        <w:pStyle w:val="Heading3"/>
+      </w:pPr>
+      <w:r>
+        <w:t xml:space="preserve">Passo 1 — Selezione e inserimento dati</w:t>
+      </w:r>
+    </w:p>
+    <w:p>
+      <w:pPr>
+        <w:numPr>
+          <w:ilvl w:val="0"/>
+          <w:numId w:val="1004"/>
+        </w:numPr>
+        <w:pStyle w:val="Compact"/>
+      </w:pPr>
+      <w:r>
+        <w:t xml:space="preserve">Apri Notaio AI su</w:t>
+      </w:r>
+      <w:r>
+        <w:t xml:space="preserve"> </w:t>
+      </w:r>
+      <w:r>
+        <w:rPr>
+          <w:rStyle w:val="VerbatimChar"/>
+        </w:rPr>
+        <w:t xml:space="preserve">http://localhost:8507</w:t>
+      </w:r>
+    </w:p>
+    <w:p>
+      <w:pPr>
+        <w:numPr>
+          <w:ilvl w:val="0"/>
+          <w:numId w:val="1004"/>
+        </w:numPr>
+        <w:pStyle w:val="Compact"/>
+      </w:pPr>
+      <w:r>
+        <w:t xml:space="preserve">Seleziona il</w:t>
+      </w:r>
+      <w:r>
+        <w:t xml:space="preserve"> </w:t>
+      </w:r>
+      <w:r>
+        <w:rPr>
+          <w:bCs/>
+          <w:b/>
+        </w:rPr>
+        <w:t xml:space="preserve">Tipo di Atto</w:t>
+      </w:r>
+      <w:r>
+        <w:t xml:space="preserve"> </w:t>
+      </w:r>
+      <w:r>
+        <w:t xml:space="preserve">dal menu a tendina in cima alla colonna sinistra</w:t>
+      </w:r>
+    </w:p>
+    <w:p>
+      <w:pPr>
+        <w:numPr>
+          <w:ilvl w:val="0"/>
+          <w:numId w:val="1004"/>
+        </w:numPr>
+        <w:pStyle w:val="Compact"/>
+      </w:pPr>
+      <w:r>
+        <w:t xml:space="preserve">Compila le card dedicate che compaiono:</w:t>
+      </w:r>
+    </w:p>
+    <w:p>
+      <w:pPr>
+        <w:numPr>
+          <w:ilvl w:val="1"/>
+          <w:numId w:val="1005"/>
+        </w:numPr>
+        <w:pStyle w:val="Compact"/>
+      </w:pPr>
+      <w:r>
+        <w:rPr>
+          <w:bCs/>
+          <w:b/>
+        </w:rPr>
+        <w:t xml:space="preserve">Compravendita</w:t>
+      </w:r>
+      <w:r>
+        <w:t xml:space="preserve">: Dati Venditore, Acquirente, Immobile, Economico</w:t>
+      </w:r>
+    </w:p>
+    <w:p>
+      <w:pPr>
+        <w:numPr>
+          <w:ilvl w:val="1"/>
+          <w:numId w:val="1005"/>
+        </w:numPr>
+        <w:pStyle w:val="Compact"/>
+      </w:pPr>
+      <w:r>
+        <w:rPr>
+          <w:bCs/>
+          <w:b/>
+        </w:rPr>
+        <w:t xml:space="preserve">Costituzione SRL</w:t>
+      </w:r>
+      <w:r>
+        <w:t xml:space="preserve">: Dati Società (soci, denominazione, sede, oggetto, capitale, amministratore, statuto)</w:t>
+      </w:r>
+    </w:p>
+    <w:p>
+      <w:pPr>
+        <w:numPr>
+          <w:ilvl w:val="1"/>
+          <w:numId w:val="1005"/>
+        </w:numPr>
+        <w:pStyle w:val="Compact"/>
+      </w:pPr>
+      <w:r>
+        <w:rPr>
+          <w:bCs/>
+          <w:b/>
+        </w:rPr>
+        <w:t xml:space="preserve">Testamento</w:t>
+      </w:r>
+      <w:r>
+        <w:t xml:space="preserve">: Dati Testatore, Eredi, Legati, Esecutore, Disposizioni</w:t>
+      </w:r>
+    </w:p>
+    <w:p>
+      <w:pPr>
+        <w:numPr>
+          <w:ilvl w:val="1"/>
+          <w:numId w:val="1005"/>
+        </w:numPr>
+        <w:pStyle w:val="Compact"/>
+      </w:pPr>
+      <w:r>
+        <w:rPr>
+          <w:bCs/>
+          <w:b/>
+        </w:rPr>
+        <w:t xml:space="preserve">Patto di famiglia</w:t>
+      </w:r>
+      <w:r>
+        <w:t xml:space="preserve">: Dati Contraenti, Bene, Regime, Durata, Successori</w:t>
+      </w:r>
+    </w:p>
+    <w:p>
+      <w:pPr>
+        <w:numPr>
+          <w:ilvl w:val="1"/>
+          <w:numId w:val="1005"/>
+        </w:numPr>
+        <w:pStyle w:val="Compact"/>
+      </w:pPr>
+      <w:r>
+        <w:rPr>
+          <w:bCs/>
+          <w:b/>
+        </w:rPr>
+        <w:t xml:space="preserve">Mutuo ipotecario</w:t>
+      </w:r>
+      <w:r>
+        <w:t xml:space="preserve">: Dati Mutuo (mutuatario, istituto, importo, tasso, durata, immobile garanzia)</w:t>
+      </w:r>
+    </w:p>
+    <w:p>
+      <w:pPr>
+        <w:numPr>
+          <w:ilvl w:val="1"/>
+          <w:numId w:val="1005"/>
+        </w:numPr>
+        <w:pStyle w:val="Compact"/>
+      </w:pPr>
+      <w:r>
+        <w:rPr>
+          <w:bCs/>
+          <w:b/>
+        </w:rPr>
+        <w:t xml:space="preserve">Divisione</w:t>
+      </w:r>
+      <w:r>
+        <w:t xml:space="preserve">: Dati Divisione (coeredi, bene, quote, modalità)</w:t>
+      </w:r>
+    </w:p>
+    <w:p>
+      <w:pPr>
+        <w:numPr>
+          <w:ilvl w:val="1"/>
+          <w:numId w:val="1005"/>
+        </w:numPr>
+        <w:pStyle w:val="Compact"/>
+      </w:pPr>
+      <w:r>
+        <w:rPr>
+          <w:bCs/>
+          <w:b/>
+        </w:rPr>
+        <w:t xml:space="preserve">Donazione</w:t>
+      </w:r>
+      <w:r>
+        <w:t xml:space="preserve">: Dati Donazione (donante, donatario, bene, regime fiscale, oneri)</w:t>
+      </w:r>
+    </w:p>
+    <w:p>
+      <w:pPr>
+        <w:numPr>
+          <w:ilvl w:val="0"/>
+          <w:numId w:val="1004"/>
+        </w:numPr>
+        <w:pStyle w:val="Compact"/>
+      </w:pPr>
+      <w:r>
+        <w:t xml:space="preserve">Compila sempre la card</w:t>
+      </w:r>
+      <w:r>
+        <w:t xml:space="preserve"> </w:t>
+      </w:r>
+      <w:r>
+        <w:rPr>
+          <w:bCs/>
+          <w:b/>
+        </w:rPr>
+        <w:t xml:space="preserve">💶 Dati Economici e Clausole</w:t>
+      </w:r>
+      <w:r>
+        <w:t xml:space="preserve"> </w:t>
+      </w:r>
+      <w:r>
+        <w:t xml:space="preserve">(condivisa per tutti i tipi)</w:t>
+      </w:r>
+    </w:p>
+    <w:p>
+      <w:pPr>
+        <w:pStyle w:val="BlockText"/>
+      </w:pPr>
+      <w:r>
+        <w:t xml:space="preserve">💡</w:t>
+      </w:r>
+      <w:r>
+        <w:t xml:space="preserve"> </w:t>
+      </w:r>
+      <w:r>
+        <w:rPr>
+          <w:bCs/>
+          <w:b/>
+        </w:rPr>
+        <w:t xml:space="preserve">Suggerimento:</w:t>
+      </w:r>
+      <w:r>
+        <w:t xml:space="preserve"> </w:t>
+      </w:r>
+      <w:r>
+        <w:t xml:space="preserve">Seleziona il cliente dall’anagrafica (se disponibile) per pre-compilare i dati.</w:t>
+      </w:r>
+    </w:p>
+    <w:bookmarkEnd w:id="32"/>
+    <w:bookmarkStart w:id="33" w:name="passo-2-generazione"/>
+    <w:p>
+      <w:pPr>
+        <w:pStyle w:val="Heading3"/>
+      </w:pPr>
+      <w:r>
+        <w:t xml:space="preserve">Passo 2 — Generazione</w:t>
+      </w:r>
+    </w:p>
+    <w:p>
+      <w:pPr>
+        <w:numPr>
+          <w:ilvl w:val="0"/>
+          <w:numId w:val="1006"/>
+        </w:numPr>
+      </w:pPr>
+      <w:r>
+        <w:t xml:space="preserve">Clicca su</w:t>
+      </w:r>
+      <w:r>
+        <w:t xml:space="preserve"> </w:t>
+      </w:r>
+      <w:r>
+        <w:rPr>
+          <w:bCs/>
+          <w:b/>
+        </w:rPr>
+        <w:t xml:space="preserve">“</w:t>
+      </w:r>
+      <w:r>
+        <w:rPr>
+          <w:bCs/>
+          <w:b/>
+        </w:rPr>
+        <w:t xml:space="preserve">⚖️ Genera Atto: [Tipo selezionato]</w:t>
+      </w:r>
+      <w:r>
+        <w:rPr>
+          <w:bCs/>
+          <w:b/>
+        </w:rPr>
+        <w:t xml:space="preserve">”</w:t>
+      </w:r>
+    </w:p>
+    <w:p>
+      <w:pPr>
+        <w:numPr>
+          <w:ilvl w:val="0"/>
+          <w:numId w:val="1006"/>
+        </w:numPr>
+      </w:pPr>
+      <w:r>
+        <w:t xml:space="preserve">Il sistema esegue le fasi in sequenza:</w:t>
+      </w:r>
+    </w:p>
+    <w:p>
+      <w:pPr>
+        <w:numPr>
+          <w:ilvl w:val="0"/>
+          <w:numId w:val="1000"/>
+        </w:numPr>
+      </w:pPr>
+      <w:r>
+        <w:rPr>
+          <w:bCs/>
+          <w:b/>
+        </w:rPr>
+        <w:t xml:space="preserve">Per atti immobiliari (5 fasi):</w:t>
+      </w:r>
+    </w:p>
+    <w:p>
+      <w:pPr>
+        <w:numPr>
+          <w:ilvl w:val="1"/>
+          <w:numId w:val="1007"/>
+        </w:numPr>
+        <w:pStyle w:val="Compact"/>
+      </w:pPr>
+      <w:r>
+        <w:rPr>
+          <w:bCs/>
+          <w:b/>
+        </w:rPr>
+        <w:t xml:space="preserve">Fase 1/5: Verifica Catastale</w:t>
+      </w:r>
+      <w:r>
+        <w:t xml:space="preserve"> </w:t>
+      </w:r>
+      <w:r>
+        <w:t xml:space="preserve">(~15–20s)</w:t>
+      </w:r>
+    </w:p>
+    <w:p>
+      <w:pPr>
+        <w:numPr>
+          <w:ilvl w:val="1"/>
+          <w:numId w:val="1007"/>
+        </w:numPr>
+        <w:pStyle w:val="Compact"/>
+      </w:pPr>
+      <w:r>
+        <w:rPr>
+          <w:bCs/>
+          <w:b/>
+        </w:rPr>
+        <w:t xml:space="preserve">Fase 2/5: Verifica Conformità</w:t>
+      </w:r>
+      <w:r>
+        <w:t xml:space="preserve"> </w:t>
+      </w:r>
+      <w:r>
+        <w:t xml:space="preserve">(~50–70s)</w:t>
+      </w:r>
+    </w:p>
+    <w:p>
+      <w:pPr>
+        <w:numPr>
+          <w:ilvl w:val="1"/>
+          <w:numId w:val="1007"/>
+        </w:numPr>
+        <w:pStyle w:val="Compact"/>
+      </w:pPr>
+      <w:r>
+        <w:rPr>
+          <w:bCs/>
+          <w:b/>
+        </w:rPr>
+        <w:t xml:space="preserve">Fase 3/5: Stesura Atto</w:t>
+      </w:r>
+      <w:r>
+        <w:t xml:space="preserve"> </w:t>
+      </w:r>
+      <w:r>
+        <w:t xml:space="preserve">(~50–70s)</w:t>
+      </w:r>
+    </w:p>
+    <w:p>
+      <w:pPr>
+        <w:numPr>
+          <w:ilvl w:val="1"/>
+          <w:numId w:val="1007"/>
+        </w:numPr>
+        <w:pStyle w:val="Compact"/>
+      </w:pPr>
+      <w:r>
+        <w:rPr>
+          <w:bCs/>
+          <w:b/>
+        </w:rPr>
+        <w:t xml:space="preserve">Fase 4/5: Controllo Documenti</w:t>
+      </w:r>
+      <w:r>
+        <w:t xml:space="preserve"> </w:t>
+      </w:r>
+      <w:r>
+        <w:t xml:space="preserve">(~15–20s)</w:t>
+      </w:r>
+    </w:p>
+    <w:p>
+      <w:pPr>
+        <w:numPr>
+          <w:ilvl w:val="1"/>
+          <w:numId w:val="1007"/>
+        </w:numPr>
+        <w:pStyle w:val="Compact"/>
+      </w:pPr>
+      <w:r>
+        <w:rPr>
+          <w:bCs/>
+          <w:b/>
+        </w:rPr>
+        <w:t xml:space="preserve">Fase 5/5: Cronoprogramma Scadenze</w:t>
+      </w:r>
+      <w:r>
+        <w:t xml:space="preserve"> </w:t>
+      </w:r>
+      <w:r>
+        <w:t xml:space="preserve">(~15–20s)</w:t>
+      </w:r>
+    </w:p>
+    <w:p>
+      <w:pPr>
+        <w:numPr>
+          <w:ilvl w:val="0"/>
+          <w:numId w:val="1000"/>
+        </w:numPr>
+      </w:pPr>
+      <w:r>
+        <w:rPr>
+          <w:bCs/>
+          <w:b/>
+        </w:rPr>
+        <w:t xml:space="preserve">Per atti non immobiliari (3 fasi):</w:t>
+      </w:r>
+    </w:p>
+    <w:p>
+      <w:pPr>
+        <w:numPr>
+          <w:ilvl w:val="1"/>
+          <w:numId w:val="1008"/>
+        </w:numPr>
+        <w:pStyle w:val="Compact"/>
+      </w:pPr>
+      <w:r>
+        <w:rPr>
+          <w:bCs/>
+          <w:b/>
+        </w:rPr>
+        <w:t xml:space="preserve">Fase 1/3: Stesura Atto</w:t>
+      </w:r>
+      <w:r>
+        <w:t xml:space="preserve"> </w:t>
+      </w:r>
+      <w:r>
+        <w:t xml:space="preserve">(~50–70s)</w:t>
+      </w:r>
+    </w:p>
+    <w:p>
+      <w:pPr>
+        <w:numPr>
+          <w:ilvl w:val="1"/>
+          <w:numId w:val="1008"/>
+        </w:numPr>
+        <w:pStyle w:val="Compact"/>
+      </w:pPr>
+      <w:r>
+        <w:rPr>
+          <w:bCs/>
+          <w:b/>
+        </w:rPr>
+        <w:t xml:space="preserve">Fase 2/3: Controllo Documenti</w:t>
+      </w:r>
+      <w:r>
+        <w:t xml:space="preserve"> </w:t>
+      </w:r>
+      <w:r>
+        <w:t xml:space="preserve">(~15–20s)</w:t>
+      </w:r>
+    </w:p>
+    <w:p>
+      <w:pPr>
+        <w:numPr>
+          <w:ilvl w:val="1"/>
+          <w:numId w:val="1008"/>
+        </w:numPr>
+        <w:pStyle w:val="Compact"/>
+      </w:pPr>
+      <w:r>
+        <w:rPr>
+          <w:bCs/>
+          <w:b/>
+        </w:rPr>
+        <w:t xml:space="preserve">Fase 3/3: Cronoprogramma Scadenze</w:t>
+      </w:r>
+      <w:r>
+        <w:t xml:space="preserve"> </w:t>
+      </w:r>
+      <w:r>
+        <w:t xml:space="preserve">(~15–20s)</w:t>
+      </w:r>
+    </w:p>
+    <w:p>
+      <w:pPr>
+        <w:numPr>
+          <w:ilvl w:val="0"/>
+          <w:numId w:val="1006"/>
+        </w:numPr>
+      </w:pPr>
+      <w:r>
+        <w:t xml:space="preserve">Il documento completo apparirà nell’area risultato</w:t>
+      </w:r>
+    </w:p>
     <w:bookmarkEnd w:id="33"/>
+    <w:bookmarkStart w:id="34" w:name="passo-3-revisione"/>
+    <w:p>
+      <w:pPr>
+        <w:pStyle w:val="Heading3"/>
+      </w:pPr>
+      <w:r>
+        <w:t xml:space="preserve">Passo 3 — Revisione</w:t>
+      </w:r>
+    </w:p>
+    <w:p>
+      <w:pPr>
+        <w:numPr>
+          <w:ilvl w:val="0"/>
+          <w:numId w:val="1009"/>
+        </w:numPr>
+        <w:pStyle w:val="Compact"/>
+      </w:pPr>
+      <w:r>
+        <w:rPr>
+          <w:bCs/>
+          <w:b/>
+        </w:rPr>
+        <w:t xml:space="preserve">Leggi i report preliminari</w:t>
+      </w:r>
+      <w:r>
+        <w:t xml:space="preserve"> </w:t>
+      </w:r>
+      <w:r>
+        <w:t xml:space="preserve">(catasto e conformità, se presenti): verifica coerenza con i dati reali</w:t>
+      </w:r>
+    </w:p>
+    <w:p>
+      <w:pPr>
+        <w:numPr>
+          <w:ilvl w:val="0"/>
+          <w:numId w:val="1009"/>
+        </w:numPr>
+        <w:pStyle w:val="Compact"/>
+      </w:pPr>
+      <w:r>
+        <w:rPr>
+          <w:bCs/>
+          <w:b/>
+        </w:rPr>
+        <w:t xml:space="preserve">Leggi l’atto</w:t>
+      </w:r>
+      <w:r>
+        <w:t xml:space="preserve">: verifica che il corpo giuridico sia corretto per il tipo di atto selezionato</w:t>
+      </w:r>
+    </w:p>
+    <w:p>
+      <w:pPr>
+        <w:numPr>
+          <w:ilvl w:val="0"/>
+          <w:numId w:val="1009"/>
+        </w:numPr>
+        <w:pStyle w:val="Compact"/>
+      </w:pPr>
+      <w:r>
+        <w:rPr>
+          <w:bCs/>
+          <w:b/>
+        </w:rPr>
+        <w:t xml:space="preserve">Leggi il controllo</w:t>
+      </w:r>
+      <w:r>
+        <w:t xml:space="preserve">: assicurati che tutti i documenti obbligatori siano presenti</w:t>
+      </w:r>
+    </w:p>
+    <w:p>
+      <w:pPr>
+        <w:numPr>
+          <w:ilvl w:val="0"/>
+          <w:numId w:val="1009"/>
+        </w:numPr>
+        <w:pStyle w:val="Compact"/>
+      </w:pPr>
+      <w:r>
+        <w:rPr>
+          <w:bCs/>
+          <w:b/>
+        </w:rPr>
+        <w:t xml:space="preserve">Leggi le scadenze</w:t>
+      </w:r>
+      <w:r>
+        <w:t xml:space="preserve">: verifica le date calcolate</w:t>
+      </w:r>
+    </w:p>
+    <w:p>
+      <w:pPr>
+        <w:pStyle w:val="BlockText"/>
+      </w:pPr>
+      <w:r>
+        <w:t xml:space="preserve">⚠️</w:t>
+      </w:r>
+      <w:r>
+        <w:t xml:space="preserve"> </w:t>
+      </w:r>
+      <w:r>
+        <w:rPr>
+          <w:bCs/>
+          <w:b/>
+        </w:rPr>
+        <w:t xml:space="preserve">Attenzione:</w:t>
+      </w:r>
+      <w:r>
+        <w:t xml:space="preserve"> </w:t>
+      </w:r>
+      <w:r>
+        <w:t xml:space="preserve">L’AI genera SOLO il corpo giuridico. Intestazione, procura e firma sono pre-compilate dal codice Python in modo deterministico.</w:t>
+      </w:r>
+    </w:p>
     <w:bookmarkEnd w:id="34"/>
-    <w:bookmarkStart w:id="35" w:name="esempio-concreto-prima-casa-under-36"/>
-    <w:p>
-      <w:pPr>
-        <w:pStyle w:val="Heading2"/>
-      </w:pPr>
-      <w:r>
-        <w:t xml:space="preserve">5. Esempio concreto: Prima Casa Under 36</w:t>
-      </w:r>
-    </w:p>
-    <w:p>
-      <w:pPr>
-        <w:pStyle w:val="BlockText"/>
-      </w:pPr>
-      <w:r>
-        <w:rPr>
-          <w:bCs/>
-          <w:b/>
-        </w:rPr>
-        <w:t xml:space="preserve">Caso:</w:t>
-      </w:r>
-      <w:r>
-        <w:t xml:space="preserve"> </w:t>
-      </w:r>
-      <w:r>
-        <w:t xml:space="preserve">Laura Verdi, 28 anni, ISEE €22.000, acquista la sua prima casa da Mario Rossi per €180.000.</w:t>
-      </w:r>
-    </w:p>
-    <w:p>
-      <w:pPr>
-        <w:pStyle w:val="BlockText"/>
-      </w:pPr>
-      <w:r>
-        <w:rPr>
-          <w:bCs/>
-          <w:b/>
-        </w:rPr>
-        <w:t xml:space="preserve">Agevolazione:</w:t>
-      </w:r>
-      <w:r>
-        <w:t xml:space="preserve"> </w:t>
-      </w:r>
-      <w:r>
-        <w:t xml:space="preserve">art. 1 commi 67-71 L. 234/2021 (prima casa under 36)</w:t>
+    <w:bookmarkStart w:id="35" w:name="passo-4-export"/>
+    <w:p>
+      <w:pPr>
+        <w:pStyle w:val="Heading3"/>
+      </w:pPr>
+      <w:r>
+        <w:t xml:space="preserve">Passo 4 — Export</w:t>
       </w:r>
     </w:p>
     <w:p>
@@ -1861,7 +2448,37 @@
         <w:pStyle w:val="Compact"/>
       </w:pPr>
       <w:r>
-        <w:t xml:space="preserve">Inserisci i dati nel form</w:t>
+        <w:t xml:space="preserve">Clicca su</w:t>
+      </w:r>
+      <w:r>
+        <w:t xml:space="preserve"> </w:t>
+      </w:r>
+      <w:r>
+        <w:rPr>
+          <w:bCs/>
+          <w:b/>
+        </w:rPr>
+        <w:t xml:space="preserve">“</w:t>
+      </w:r>
+      <w:r>
+        <w:rPr>
+          <w:bCs/>
+          <w:b/>
+        </w:rPr>
+        <w:t xml:space="preserve">📄 Scarica PDF</w:t>
+      </w:r>
+      <w:r>
+        <w:rPr>
+          <w:bCs/>
+          <w:b/>
+        </w:rPr>
+        <w:t xml:space="preserve">”</w:t>
+      </w:r>
+      <w:r>
+        <w:t xml:space="preserve"> </w:t>
+      </w:r>
+      <w:r>
+        <w:t xml:space="preserve">per la stampa</w:t>
       </w:r>
     </w:p>
     <w:p>
@@ -1873,7 +2490,7 @@
         <w:pStyle w:val="Compact"/>
       </w:pPr>
       <w:r>
-        <w:t xml:space="preserve">Clicca</w:t>
+        <w:t xml:space="preserve">Clicca su</w:t>
       </w:r>
       <w:r>
         <w:t xml:space="preserve"> </w:t>
@@ -1890,7 +2507,7 @@
           <w:bCs/>
           <w:b/>
         </w:rPr>
-        <w:t xml:space="preserve">Genera Atto di Compravendita</w:t>
+        <w:t xml:space="preserve">📄 Scarica DOCX</w:t>
       </w:r>
       <w:r>
         <w:rPr>
@@ -1899,6 +2516,12 @@
         </w:rPr>
         <w:t xml:space="preserve">”</w:t>
       </w:r>
+      <w:r>
+        <w:t xml:space="preserve"> </w:t>
+      </w:r>
+      <w:r>
+        <w:t xml:space="preserve">per modifiche in Word/LibreOffice</w:t>
+      </w:r>
     </w:p>
     <w:p>
       <w:pPr>
@@ -1909,91 +2532,37 @@
         <w:pStyle w:val="Compact"/>
       </w:pPr>
       <w:r>
-        <w:t xml:space="preserve">Il sistema genera:</w:t>
-      </w:r>
-    </w:p>
-    <w:p>
-      <w:pPr>
-        <w:numPr>
-          <w:ilvl w:val="1"/>
-          <w:numId w:val="1011"/>
-        </w:numPr>
-        <w:pStyle w:val="Compact"/>
-      </w:pPr>
-      <w:r>
-        <w:t xml:space="preserve">Report catastale con checklist</w:t>
-      </w:r>
-    </w:p>
-    <w:p>
-      <w:pPr>
-        <w:numPr>
-          <w:ilvl w:val="1"/>
-          <w:numId w:val="1011"/>
-        </w:numPr>
-        <w:pStyle w:val="Compact"/>
-      </w:pPr>
-      <w:r>
-        <w:t xml:space="preserve">Report conformità che evidenzia APE mancante e verifica l’ammissibilità under 36</w:t>
-      </w:r>
-    </w:p>
-    <w:p>
-      <w:pPr>
-        <w:numPr>
-          <w:ilvl w:val="1"/>
-          <w:numId w:val="1011"/>
-        </w:numPr>
-        <w:pStyle w:val="Compact"/>
-      </w:pPr>
-      <w:r>
-        <w:t xml:space="preserve">Corpo giuridico con normativa citata</w:t>
-      </w:r>
-    </w:p>
-    <w:p>
-      <w:pPr>
-        <w:numPr>
-          <w:ilvl w:val="1"/>
-          <w:numId w:val="1011"/>
-        </w:numPr>
-        <w:pStyle w:val="Compact"/>
-      </w:pPr>
-      <w:r>
-        <w:t xml:space="preserve">Checklist documenti</w:t>
-      </w:r>
-    </w:p>
-    <w:p>
-      <w:pPr>
-        <w:numPr>
-          <w:ilvl w:val="1"/>
-          <w:numId w:val="1011"/>
-        </w:numPr>
-        <w:pStyle w:val="Compact"/>
-      </w:pPr>
-      <w:r>
-        <w:t xml:space="preserve">Cronoprogramma scadenze</w:t>
-      </w:r>
-    </w:p>
-    <w:p>
-      <w:pPr>
-        <w:numPr>
-          <w:ilvl w:val="0"/>
-          <w:numId w:val="1010"/>
-        </w:numPr>
-        <w:pStyle w:val="Compact"/>
-      </w:pPr>
-      <w:r>
-        <w:t xml:space="preserve">Rivedi il documento</w:t>
-      </w:r>
-    </w:p>
-    <w:p>
-      <w:pPr>
-        <w:numPr>
-          <w:ilvl w:val="0"/>
-          <w:numId w:val="1010"/>
-        </w:numPr>
-        <w:pStyle w:val="Compact"/>
-      </w:pPr>
-      <w:r>
-        <w:t xml:space="preserve">Scarica in PDF o DOCX</w:t>
+        <w:t xml:space="preserve">Clicca su</w:t>
+      </w:r>
+      <w:r>
+        <w:t xml:space="preserve"> </w:t>
+      </w:r>
+      <w:r>
+        <w:rPr>
+          <w:bCs/>
+          <w:b/>
+        </w:rPr>
+        <w:t xml:space="preserve">“</w:t>
+      </w:r>
+      <w:r>
+        <w:rPr>
+          <w:bCs/>
+          <w:b/>
+        </w:rPr>
+        <w:t xml:space="preserve">📧 Invia per Email</w:t>
+      </w:r>
+      <w:r>
+        <w:rPr>
+          <w:bCs/>
+          <w:b/>
+        </w:rPr>
+        <w:t xml:space="preserve">”</w:t>
+      </w:r>
+      <w:r>
+        <w:t xml:space="preserve"> </w:t>
+      </w:r>
+      <w:r>
+        <w:t xml:space="preserve">per inviare al cliente</w:t>
       </w:r>
     </w:p>
     <w:p>
@@ -2004,30 +2573,213 @@
       </w:r>
     </w:p>
     <w:bookmarkEnd w:id="35"/>
-    <w:bookmarkStart w:id="38" w:name="verifica-e-controllo-qualità"/>
+    <w:bookmarkEnd w:id="36"/>
+    <w:bookmarkStart w:id="40" w:name="esempi-concreti"/>
     <w:p>
       <w:pPr>
         <w:pStyle w:val="Heading2"/>
       </w:pPr>
       <w:r>
-        <w:t xml:space="preserve">6. Verifica e Controllo Qualità</w:t>
-      </w:r>
-    </w:p>
-    <w:bookmarkStart w:id="36" w:name="placeholder-e-dati-da-verificare"/>
+        <w:t xml:space="preserve">6. Esempi Concreti</w:t>
+      </w:r>
+    </w:p>
+    <w:bookmarkStart w:id="37" w:name="prima-casa-under-36-compravendita"/>
     <w:p>
       <w:pPr>
         <w:pStyle w:val="Heading3"/>
       </w:pPr>
       <w:r>
-        <w:t xml:space="preserve">Placeholder e dati da verificare</w:t>
-      </w:r>
-    </w:p>
-    <w:p>
-      <w:pPr>
-        <w:pStyle w:val="FirstParagraph"/>
-      </w:pPr>
-      <w:r>
-        <w:t xml:space="preserve">Quando l’AI non ha accesso a una banca dati esterna, inserisce indicazioni di verifica:</w:t>
+        <w:t xml:space="preserve">6.1 Prima Casa Under 36 — Compravendita</w:t>
+      </w:r>
+    </w:p>
+    <w:p>
+      <w:pPr>
+        <w:pStyle w:val="BlockText"/>
+      </w:pPr>
+      <w:r>
+        <w:rPr>
+          <w:bCs/>
+          <w:b/>
+        </w:rPr>
+        <w:t xml:space="preserve">Caso:</w:t>
+      </w:r>
+      <w:r>
+        <w:t xml:space="preserve"> </w:t>
+      </w:r>
+      <w:r>
+        <w:t xml:space="preserve">Laura Verdi, 28 anni, ISEE €22.000, acquista la sua prima casa da Mario Rossi per €180.000.</w:t>
+      </w:r>
+    </w:p>
+    <w:p>
+      <w:pPr>
+        <w:pStyle w:val="BlockText"/>
+      </w:pPr>
+      <w:r>
+        <w:rPr>
+          <w:bCs/>
+          <w:b/>
+        </w:rPr>
+        <w:t xml:space="preserve">Agevolazione:</w:t>
+      </w:r>
+      <w:r>
+        <w:t xml:space="preserve"> </w:t>
+      </w:r>
+      <w:r>
+        <w:t xml:space="preserve">art. 1 commi 67-71 L. 234/2021 (prima casa under 36)</w:t>
+      </w:r>
+    </w:p>
+    <w:p>
+      <w:pPr>
+        <w:numPr>
+          <w:ilvl w:val="0"/>
+          <w:numId w:val="1011"/>
+        </w:numPr>
+        <w:pStyle w:val="Compact"/>
+      </w:pPr>
+      <w:r>
+        <w:t xml:space="preserve">Seleziona</w:t>
+      </w:r>
+      <w:r>
+        <w:t xml:space="preserve"> </w:t>
+      </w:r>
+      <w:r>
+        <w:rPr>
+          <w:bCs/>
+          <w:b/>
+        </w:rPr>
+        <w:t xml:space="preserve">“</w:t>
+      </w:r>
+      <w:r>
+        <w:rPr>
+          <w:bCs/>
+          <w:b/>
+        </w:rPr>
+        <w:t xml:space="preserve">Compravendita immobiliare</w:t>
+      </w:r>
+      <w:r>
+        <w:rPr>
+          <w:bCs/>
+          <w:b/>
+        </w:rPr>
+        <w:t xml:space="preserve">”</w:t>
+      </w:r>
+    </w:p>
+    <w:p>
+      <w:pPr>
+        <w:numPr>
+          <w:ilvl w:val="0"/>
+          <w:numId w:val="1011"/>
+        </w:numPr>
+        <w:pStyle w:val="Compact"/>
+      </w:pPr>
+      <w:r>
+        <w:t xml:space="preserve">Inserisci i dati nel form</w:t>
+      </w:r>
+    </w:p>
+    <w:p>
+      <w:pPr>
+        <w:numPr>
+          <w:ilvl w:val="0"/>
+          <w:numId w:val="1011"/>
+        </w:numPr>
+        <w:pStyle w:val="Compact"/>
+      </w:pPr>
+      <w:r>
+        <w:t xml:space="preserve">Clicca</w:t>
+      </w:r>
+      <w:r>
+        <w:t xml:space="preserve"> </w:t>
+      </w:r>
+      <w:r>
+        <w:rPr>
+          <w:bCs/>
+          <w:b/>
+        </w:rPr>
+        <w:t xml:space="preserve">“</w:t>
+      </w:r>
+      <w:r>
+        <w:rPr>
+          <w:bCs/>
+          <w:b/>
+        </w:rPr>
+        <w:t xml:space="preserve">Genera Atto</w:t>
+      </w:r>
+      <w:r>
+        <w:rPr>
+          <w:bCs/>
+          <w:b/>
+        </w:rPr>
+        <w:t xml:space="preserve">”</w:t>
+      </w:r>
+    </w:p>
+    <w:p>
+      <w:pPr>
+        <w:numPr>
+          <w:ilvl w:val="0"/>
+          <w:numId w:val="1011"/>
+        </w:numPr>
+        <w:pStyle w:val="Compact"/>
+      </w:pPr>
+      <w:r>
+        <w:t xml:space="preserve">Il sistema genera 5 sezioni: Catasto, Conformità, Atto, Controllo, Scadenze</w:t>
+      </w:r>
+    </w:p>
+    <w:p>
+      <w:pPr>
+        <w:numPr>
+          <w:ilvl w:val="0"/>
+          <w:numId w:val="1011"/>
+        </w:numPr>
+        <w:pStyle w:val="Compact"/>
+      </w:pPr>
+      <w:r>
+        <w:t xml:space="preserve">Rivedi il documento e scarica in PDF/DOCX</w:t>
+      </w:r>
+    </w:p>
+    <w:bookmarkEnd w:id="37"/>
+    <w:bookmarkStart w:id="38" w:name="costituzione-srl"/>
+    <w:p>
+      <w:pPr>
+        <w:pStyle w:val="Heading3"/>
+      </w:pPr>
+      <w:r>
+        <w:t xml:space="preserve">6.2 Costituzione SRL</w:t>
+      </w:r>
+    </w:p>
+    <w:p>
+      <w:pPr>
+        <w:pStyle w:val="BlockText"/>
+      </w:pPr>
+      <w:r>
+        <w:rPr>
+          <w:bCs/>
+          <w:b/>
+        </w:rPr>
+        <w:t xml:space="preserve">Caso:</w:t>
+      </w:r>
+      <w:r>
+        <w:t xml:space="preserve"> </w:t>
+      </w:r>
+      <w:r>
+        <w:t xml:space="preserve">Marco Rossi (60%) e Paolo Bianchi (40%) costituiscono la</w:t>
+      </w:r>
+      <w:r>
+        <w:t xml:space="preserve"> </w:t>
+      </w:r>
+      <w:r>
+        <w:t xml:space="preserve">“</w:t>
+      </w:r>
+      <w:r>
+        <w:t xml:space="preserve">Rossi &amp; Bianchi SRL</w:t>
+      </w:r>
+      <w:r>
+        <w:t xml:space="preserve">”</w:t>
+      </w:r>
+      <w:r>
+        <w:t xml:space="preserve"> </w:t>
+      </w:r>
+      <w:r>
+        <w:t xml:space="preserve">con capitale €10.000.</w:t>
       </w:r>
     </w:p>
     <w:p>
@@ -2039,14 +2791,31 @@
         <w:pStyle w:val="Compact"/>
       </w:pPr>
       <w:r>
-        <w:rPr>
-          <w:bCs/>
-          <w:b/>
-        </w:rPr>
-        <w:t xml:space="preserve">Visura catastale</w:t>
-      </w:r>
-      <w:r>
-        <w:t xml:space="preserve">: richiede verifica su Agenzia Entrate</w:t>
+        <w:t xml:space="preserve">Seleziona</w:t>
+      </w:r>
+      <w:r>
+        <w:t xml:space="preserve"> </w:t>
+      </w:r>
+      <w:r>
+        <w:rPr>
+          <w:bCs/>
+          <w:b/>
+        </w:rPr>
+        <w:t xml:space="preserve">“</w:t>
+      </w:r>
+      <w:r>
+        <w:rPr>
+          <w:bCs/>
+          <w:b/>
+        </w:rPr>
+        <w:t xml:space="preserve">Costituzione SRL</w:t>
+      </w:r>
+      <w:r>
+        <w:rPr>
+          <w:bCs/>
+          <w:b/>
+        </w:rPr>
+        <w:t xml:space="preserve">”</w:t>
       </w:r>
     </w:p>
     <w:p>
@@ -2058,14 +2827,7 @@
         <w:pStyle w:val="Compact"/>
       </w:pPr>
       <w:r>
-        <w:rPr>
-          <w:bCs/>
-          <w:b/>
-        </w:rPr>
-        <w:t xml:space="preserve">APE</w:t>
-      </w:r>
-      <w:r>
-        <w:t xml:space="preserve">: richiede commissione se mancante</w:t>
+        <w:t xml:space="preserve">Compila: Soci, Denominazione, Sede, Oggetto, Capitale, Amministratore, Statuto</w:t>
       </w:r>
     </w:p>
     <w:p>
@@ -2077,14 +2839,53 @@
         <w:pStyle w:val="Compact"/>
       </w:pPr>
       <w:r>
-        <w:rPr>
-          <w:bCs/>
-          <w:b/>
-        </w:rPr>
-        <w:t xml:space="preserve">Ipoteche</w:t>
-      </w:r>
-      <w:r>
-        <w:t xml:space="preserve">: richiede visura ipotecaria in Conservatoria</w:t>
+        <w:t xml:space="preserve">Clicca</w:t>
+      </w:r>
+      <w:r>
+        <w:t xml:space="preserve"> </w:t>
+      </w:r>
+      <w:r>
+        <w:rPr>
+          <w:bCs/>
+          <w:b/>
+        </w:rPr>
+        <w:t xml:space="preserve">“</w:t>
+      </w:r>
+      <w:r>
+        <w:rPr>
+          <w:bCs/>
+          <w:b/>
+        </w:rPr>
+        <w:t xml:space="preserve">Genera Atto</w:t>
+      </w:r>
+      <w:r>
+        <w:rPr>
+          <w:bCs/>
+          <w:b/>
+        </w:rPr>
+        <w:t xml:space="preserve">”</w:t>
+      </w:r>
+    </w:p>
+    <w:p>
+      <w:pPr>
+        <w:numPr>
+          <w:ilvl w:val="0"/>
+          <w:numId w:val="1012"/>
+        </w:numPr>
+        <w:pStyle w:val="Compact"/>
+      </w:pPr>
+      <w:r>
+        <w:t xml:space="preserve">Il sistema genera 3 sezioni: Atto di Costituzione SRL, Controllo Documenti, Scadenze (iscrizione REA, PEC, ecc.)</w:t>
+      </w:r>
+    </w:p>
+    <w:bookmarkEnd w:id="38"/>
+    <w:bookmarkStart w:id="39" w:name="testamento-olografo-pubblico"/>
+    <w:p>
+      <w:pPr>
+        <w:pStyle w:val="Heading3"/>
+      </w:pPr>
+      <w:r>
+        <w:t xml:space="preserve">6.3 Testamento Olografo Pubblico</w:t>
       </w:r>
     </w:p>
     <w:p>
@@ -2092,49 +2893,54 @@
         <w:pStyle w:val="BlockText"/>
       </w:pPr>
       <w:r>
-        <w:t xml:space="preserve">⚠️</w:t>
-      </w:r>
-      <w:r>
-        <w:t xml:space="preserve"> </w:t>
-      </w:r>
-      <w:r>
-        <w:rPr>
-          <w:bCs/>
-          <w:b/>
-        </w:rPr>
-        <w:t xml:space="preserve">L’AI non inventa mai dati catastali, numeri di sentenza o norme.</w:t>
-      </w:r>
-      <w:r>
-        <w:t xml:space="preserve"> </w:t>
-      </w:r>
-      <w:r>
-        <w:t xml:space="preserve">Se non è certa, indica</w:t>
-      </w:r>
-      <w:r>
-        <w:t xml:space="preserve"> </w:t>
-      </w:r>
-      <w:r>
+        <w:rPr>
+          <w:bCs/>
+          <w:b/>
+        </w:rPr>
+        <w:t xml:space="preserve">Caso:</w:t>
+      </w:r>
+      <w:r>
+        <w:t xml:space="preserve"> </w:t>
+      </w:r>
+      <w:r>
+        <w:t xml:space="preserve">Carlo Verdi, 70 anni, vuole lasciare i beni ai figli Marco e Anna in parti uguali.</w:t>
+      </w:r>
+    </w:p>
+    <w:p>
+      <w:pPr>
+        <w:numPr>
+          <w:ilvl w:val="0"/>
+          <w:numId w:val="1013"/>
+        </w:numPr>
+        <w:pStyle w:val="Compact"/>
+      </w:pPr>
+      <w:r>
+        <w:t xml:space="preserve">Seleziona</w:t>
+      </w:r>
+      <w:r>
+        <w:t xml:space="preserve"> </w:t>
+      </w:r>
+      <w:r>
+        <w:rPr>
+          <w:bCs/>
+          <w:b/>
+        </w:rPr>
         <w:t xml:space="preserve">“</w:t>
       </w:r>
       <w:r>
-        <w:t xml:space="preserve">da verificare</w:t>
-      </w:r>
-      <w:r>
+        <w:rPr>
+          <w:bCs/>
+          <w:b/>
+        </w:rPr>
+        <w:t xml:space="preserve">Testamento</w:t>
+      </w:r>
+      <w:r>
+        <w:rPr>
+          <w:bCs/>
+          <w:b/>
+        </w:rPr>
         <w:t xml:space="preserve">”</w:t>
       </w:r>
-      <w:r>
-        <w:t xml:space="preserve">.</w:t>
-      </w:r>
-    </w:p>
-    <w:bookmarkEnd w:id="36"/>
-    <w:bookmarkStart w:id="37" w:name="regole-di-sicurezza"/>
-    <w:p>
-      <w:pPr>
-        <w:pStyle w:val="Heading3"/>
-      </w:pPr>
-      <w:r>
-        <w:t xml:space="preserve">Regole di sicurezza</w:t>
-      </w:r>
     </w:p>
     <w:p>
       <w:pPr>
@@ -2145,11 +2951,7 @@
         <w:pStyle w:val="Compact"/>
       </w:pPr>
       <w:r>
-        <w:rPr>
-          <w:bCs/>
-          <w:b/>
-        </w:rPr>
-        <w:t xml:space="preserve">Non firmare mai un atto senza revisione umana</w:t>
+        <w:t xml:space="preserve">Compila: Testatore, Eredi, Legati, Esecutore, Disposizioni</w:t>
       </w:r>
     </w:p>
     <w:p>
@@ -2161,17 +2963,31 @@
         <w:pStyle w:val="Compact"/>
       </w:pPr>
       <w:r>
-        <w:rPr>
-          <w:bCs/>
-          <w:b/>
-        </w:rPr>
-        <w:t xml:space="preserve">Verificare sempre le citazioni giurisprudenziali</w:t>
-      </w:r>
-      <w:r>
-        <w:t xml:space="preserve"> </w:t>
-      </w:r>
-      <w:r>
-        <w:t xml:space="preserve">su database ufficiali</w:t>
+        <w:t xml:space="preserve">Clicca</w:t>
+      </w:r>
+      <w:r>
+        <w:t xml:space="preserve"> </w:t>
+      </w:r>
+      <w:r>
+        <w:rPr>
+          <w:bCs/>
+          <w:b/>
+        </w:rPr>
+        <w:t xml:space="preserve">“</w:t>
+      </w:r>
+      <w:r>
+        <w:rPr>
+          <w:bCs/>
+          <w:b/>
+        </w:rPr>
+        <w:t xml:space="preserve">Genera Atto</w:t>
+      </w:r>
+      <w:r>
+        <w:rPr>
+          <w:bCs/>
+          <w:b/>
+        </w:rPr>
+        <w:t xml:space="preserve">”</w:t>
       </w:r>
     </w:p>
     <w:p>
@@ -2183,39 +2999,7 @@
         <w:pStyle w:val="Compact"/>
       </w:pPr>
       <w:r>
-        <w:rPr>
-          <w:bCs/>
-          <w:b/>
-        </w:rPr>
-        <w:t xml:space="preserve">Controllare i calcoli fiscali</w:t>
-      </w:r>
-      <w:r>
-        <w:t xml:space="preserve"> </w:t>
-      </w:r>
-      <w:r>
-        <w:t xml:space="preserve">con il proprio software contabile</w:t>
-      </w:r>
-    </w:p>
-    <w:p>
-      <w:pPr>
-        <w:numPr>
-          <w:ilvl w:val="0"/>
-          <w:numId w:val="1013"/>
-        </w:numPr>
-        <w:pStyle w:val="Compact"/>
-      </w:pPr>
-      <w:r>
-        <w:rPr>
-          <w:bCs/>
-          <w:b/>
-        </w:rPr>
-        <w:t xml:space="preserve">Validare le date delle scadenze</w:t>
-      </w:r>
-      <w:r>
-        <w:t xml:space="preserve"> </w:t>
-      </w:r>
-      <w:r>
-        <w:t xml:space="preserve">con il calendario notarile</w:t>
+        <w:t xml:space="preserve">Il sistema genera il corpo giuridico del testamento con normativa artt. 587-602 c.c.</w:t>
       </w:r>
     </w:p>
     <w:p>
@@ -2225,29 +3009,283 @@
         </w:pict>
       </w:r>
     </w:p>
-    <w:bookmarkEnd w:id="37"/>
-    <w:bookmarkEnd w:id="38"/>
-    <w:bookmarkStart w:id="41" w:name="faq-e-troubleshooting"/>
+    <w:bookmarkEnd w:id="39"/>
+    <w:bookmarkEnd w:id="40"/>
+    <w:bookmarkStart w:id="43" w:name="verifica-e-controllo-qualità"/>
     <w:p>
       <w:pPr>
         <w:pStyle w:val="Heading2"/>
       </w:pPr>
       <w:r>
-        <w:t xml:space="preserve">7. FAQ e Troubleshooting</w:t>
-      </w:r>
-    </w:p>
-    <w:bookmarkStart w:id="39" w:name="domande-frequenti"/>
+        <w:t xml:space="preserve">7. Verifica e Controllo Qualità</w:t>
+      </w:r>
+    </w:p>
+    <w:bookmarkStart w:id="41" w:name="placeholder-e-dati-da-verificare"/>
     <w:p>
       <w:pPr>
         <w:pStyle w:val="Heading3"/>
       </w:pPr>
       <w:r>
+        <w:t xml:space="preserve">Placeholder e dati da verificare</w:t>
+      </w:r>
+    </w:p>
+    <w:p>
+      <w:pPr>
+        <w:pStyle w:val="FirstParagraph"/>
+      </w:pPr>
+      <w:r>
+        <w:t xml:space="preserve">Quando l’AI non ha accesso a una banca dati esterna, inserisce indicazioni di verifica:</w:t>
+      </w:r>
+    </w:p>
+    <w:p>
+      <w:pPr>
+        <w:numPr>
+          <w:ilvl w:val="0"/>
+          <w:numId w:val="1014"/>
+        </w:numPr>
+        <w:pStyle w:val="Compact"/>
+      </w:pPr>
+      <w:r>
+        <w:rPr>
+          <w:bCs/>
+          <w:b/>
+        </w:rPr>
+        <w:t xml:space="preserve">Visura catastale</w:t>
+      </w:r>
+      <w:r>
+        <w:t xml:space="preserve">: richiede verifica su Agenzia Entrate</w:t>
+      </w:r>
+    </w:p>
+    <w:p>
+      <w:pPr>
+        <w:numPr>
+          <w:ilvl w:val="0"/>
+          <w:numId w:val="1014"/>
+        </w:numPr>
+        <w:pStyle w:val="Compact"/>
+      </w:pPr>
+      <w:r>
+        <w:rPr>
+          <w:bCs/>
+          <w:b/>
+        </w:rPr>
+        <w:t xml:space="preserve">APE</w:t>
+      </w:r>
+      <w:r>
+        <w:t xml:space="preserve">: richiede commissione se mancante</w:t>
+      </w:r>
+    </w:p>
+    <w:p>
+      <w:pPr>
+        <w:numPr>
+          <w:ilvl w:val="0"/>
+          <w:numId w:val="1014"/>
+        </w:numPr>
+        <w:pStyle w:val="Compact"/>
+      </w:pPr>
+      <w:r>
+        <w:rPr>
+          <w:bCs/>
+          <w:b/>
+        </w:rPr>
+        <w:t xml:space="preserve">Ipoteche</w:t>
+      </w:r>
+      <w:r>
+        <w:t xml:space="preserve">: richiede visura ipotecaria in Conservatoria</w:t>
+      </w:r>
+    </w:p>
+    <w:p>
+      <w:pPr>
+        <w:pStyle w:val="BlockText"/>
+      </w:pPr>
+      <w:r>
+        <w:t xml:space="preserve">⚠️</w:t>
+      </w:r>
+      <w:r>
+        <w:t xml:space="preserve"> </w:t>
+      </w:r>
+      <w:r>
+        <w:rPr>
+          <w:bCs/>
+          <w:b/>
+        </w:rPr>
+        <w:t xml:space="preserve">L’AI non inventa mai dati catastali, numeri di sentenza o norme.</w:t>
+      </w:r>
+      <w:r>
+        <w:t xml:space="preserve"> </w:t>
+      </w:r>
+      <w:r>
+        <w:t xml:space="preserve">Se non è certa, indica</w:t>
+      </w:r>
+      <w:r>
+        <w:t xml:space="preserve"> </w:t>
+      </w:r>
+      <w:r>
+        <w:t xml:space="preserve">“</w:t>
+      </w:r>
+      <w:r>
+        <w:t xml:space="preserve">da verificare</w:t>
+      </w:r>
+      <w:r>
+        <w:t xml:space="preserve">”</w:t>
+      </w:r>
+      <w:r>
+        <w:t xml:space="preserve">.</w:t>
+      </w:r>
+    </w:p>
+    <w:bookmarkEnd w:id="41"/>
+    <w:bookmarkStart w:id="42" w:name="regole-di-sicurezza"/>
+    <w:p>
+      <w:pPr>
+        <w:pStyle w:val="Heading3"/>
+      </w:pPr>
+      <w:r>
+        <w:t xml:space="preserve">Regole di sicurezza</w:t>
+      </w:r>
+    </w:p>
+    <w:p>
+      <w:pPr>
+        <w:numPr>
+          <w:ilvl w:val="0"/>
+          <w:numId w:val="1015"/>
+        </w:numPr>
+        <w:pStyle w:val="Compact"/>
+      </w:pPr>
+      <w:r>
+        <w:rPr>
+          <w:bCs/>
+          <w:b/>
+        </w:rPr>
+        <w:t xml:space="preserve">Non firmare mai un atto senza revisione umana</w:t>
+      </w:r>
+    </w:p>
+    <w:p>
+      <w:pPr>
+        <w:numPr>
+          <w:ilvl w:val="0"/>
+          <w:numId w:val="1015"/>
+        </w:numPr>
+        <w:pStyle w:val="Compact"/>
+      </w:pPr>
+      <w:r>
+        <w:rPr>
+          <w:bCs/>
+          <w:b/>
+        </w:rPr>
+        <w:t xml:space="preserve">Verificare sempre le citazioni giurisprudenziali</w:t>
+      </w:r>
+      <w:r>
+        <w:t xml:space="preserve"> </w:t>
+      </w:r>
+      <w:r>
+        <w:t xml:space="preserve">su database ufficiali</w:t>
+      </w:r>
+    </w:p>
+    <w:p>
+      <w:pPr>
+        <w:numPr>
+          <w:ilvl w:val="0"/>
+          <w:numId w:val="1015"/>
+        </w:numPr>
+        <w:pStyle w:val="Compact"/>
+      </w:pPr>
+      <w:r>
+        <w:rPr>
+          <w:bCs/>
+          <w:b/>
+        </w:rPr>
+        <w:t xml:space="preserve">Controllare i calcoli fiscali</w:t>
+      </w:r>
+      <w:r>
+        <w:t xml:space="preserve"> </w:t>
+      </w:r>
+      <w:r>
+        <w:t xml:space="preserve">con il proprio software contabile</w:t>
+      </w:r>
+    </w:p>
+    <w:p>
+      <w:pPr>
+        <w:numPr>
+          <w:ilvl w:val="0"/>
+          <w:numId w:val="1015"/>
+        </w:numPr>
+        <w:pStyle w:val="Compact"/>
+      </w:pPr>
+      <w:r>
+        <w:rPr>
+          <w:bCs/>
+          <w:b/>
+        </w:rPr>
+        <w:t xml:space="preserve">Validare le date delle scadenze</w:t>
+      </w:r>
+      <w:r>
+        <w:t xml:space="preserve"> </w:t>
+      </w:r>
+      <w:r>
+        <w:t xml:space="preserve">con il calendario notarile</w:t>
+      </w:r>
+    </w:p>
+    <w:p>
+      <w:r>
+        <w:pict>
+          <v:rect style="width:0;height:1.5pt" o:hralign="center" o:hrstd="t" o:hr="t"/>
+        </w:pict>
+      </w:r>
+    </w:p>
+    <w:bookmarkEnd w:id="42"/>
+    <w:bookmarkEnd w:id="43"/>
+    <w:bookmarkStart w:id="46" w:name="faq-e-troubleshooting"/>
+    <w:p>
+      <w:pPr>
+        <w:pStyle w:val="Heading2"/>
+      </w:pPr>
+      <w:r>
+        <w:t xml:space="preserve">8. FAQ e Troubleshooting</w:t>
+      </w:r>
+    </w:p>
+    <w:bookmarkStart w:id="44" w:name="domande-frequenti"/>
+    <w:p>
+      <w:pPr>
+        <w:pStyle w:val="Heading3"/>
+      </w:pPr>
+      <w:r>
         <w:t xml:space="preserve">Domande frequenti</w:t>
       </w:r>
     </w:p>
     <w:p>
       <w:pPr>
         <w:pStyle w:val="FirstParagraph"/>
+      </w:pPr>
+      <w:r>
+        <w:rPr>
+          <w:bCs/>
+          <w:b/>
+        </w:rPr>
+        <w:t xml:space="preserve">D: Quanti tipi di atto sono supportati?</w:t>
+      </w:r>
+      <w:r>
+        <w:t xml:space="preserve"> </w:t>
+      </w:r>
+      <w:r>
+        <w:t xml:space="preserve">&gt; R:</w:t>
+      </w:r>
+      <w:r>
+        <w:t xml:space="preserve"> </w:t>
+      </w:r>
+      <w:r>
+        <w:rPr>
+          <w:bCs/>
+          <w:b/>
+        </w:rPr>
+        <w:t xml:space="preserve">7 tipi</w:t>
+      </w:r>
+      <w:r>
+        <w:t xml:space="preserve">: Compravendita immobiliare, Costituzione SRL, Testamento, Patto di famiglia, Mutuo ipotecario, Divisione, Donazione.</w:t>
+      </w:r>
+    </w:p>
+    <w:p>
+      <w:pPr>
+        <w:pStyle w:val="BodyText"/>
       </w:pPr>
       <w:r>
         <w:rPr>
@@ -2499,11 +3537,61 @@
         <w:t xml:space="preserve"> </w:t>
       </w:r>
       <w:r>
-        <w:t xml:space="preserve">&gt; R: 2-3 minuti per un atto di compravendita completo (5 fasi). La stesura dell’atto da sola richiede 50-70 secondi.</w:t>
-      </w:r>
-    </w:p>
-    <w:bookmarkEnd w:id="39"/>
-    <w:bookmarkStart w:id="40" w:name="errori-comuni-e-soluzioni"/>
+        <w:t xml:space="preserve">&gt; R:</w:t>
+      </w:r>
+      <w:r>
+        <w:t xml:space="preserve"> </w:t>
+      </w:r>
+      <w:r>
+        <w:rPr>
+          <w:bCs/>
+          <w:b/>
+        </w:rPr>
+        <w:t xml:space="preserve">Atti immobiliari</w:t>
+      </w:r>
+      <w:r>
+        <w:t xml:space="preserve"> </w:t>
+      </w:r>
+      <w:r>
+        <w:t xml:space="preserve">(5 fasi): 2–3 minuti.</w:t>
+      </w:r>
+      <w:r>
+        <w:t xml:space="preserve"> </w:t>
+      </w:r>
+      <w:r>
+        <w:rPr>
+          <w:bCs/>
+          <w:b/>
+        </w:rPr>
+        <w:t xml:space="preserve">Atti non immobiliari</w:t>
+      </w:r>
+      <w:r>
+        <w:t xml:space="preserve"> </w:t>
+      </w:r>
+      <w:r>
+        <w:t xml:space="preserve">(3 fasi): 1–2 minuti. La stesura dell’atto da sola richiede 50–70 secondi.</w:t>
+      </w:r>
+    </w:p>
+    <w:p>
+      <w:pPr>
+        <w:pStyle w:val="BodyText"/>
+      </w:pPr>
+      <w:r>
+        <w:rPr>
+          <w:bCs/>
+          <w:b/>
+        </w:rPr>
+        <w:t xml:space="preserve">D: Perché alcuni atti hanno 5 fasi e altri 3?</w:t>
+      </w:r>
+      <w:r>
+        <w:t xml:space="preserve"> </w:t>
+      </w:r>
+      <w:r>
+        <w:t xml:space="preserve">&gt; R: Gli atti che riguardano un immobile (Compravendita, Mutuo, Divisione, Donazione) richiedono Verifica Catastale e Conformità. Gli altri (SRL, Testamento, Patto di famiglia) non le richiedono.</w:t>
+      </w:r>
+    </w:p>
+    <w:bookmarkEnd w:id="44"/>
+    <w:bookmarkStart w:id="45" w:name="errori-comuni-e-soluzioni"/>
     <w:p>
       <w:pPr>
         <w:pStyle w:val="Heading3"/>
@@ -2645,7 +3733,7 @@
               <w:jc w:val="left"/>
             </w:pPr>
             <w:r>
-              <w:t xml:space="preserve">Nemtron sovraccarico</w:t>
+              <w:t xml:space="preserve">Nemotron sovraccarico</w:t>
             </w:r>
           </w:p>
         </w:tc>
@@ -2701,7 +3789,7 @@
               <w:jc w:val="left"/>
             </w:pPr>
             <w:r>
-              <w:t xml:space="preserve">Compila tutti i campi obbligatori</w:t>
+              <w:t xml:space="preserve">Compila tutti i campi del tipo di atto selezionato</w:t>
             </w:r>
           </w:p>
         </w:tc>
@@ -2745,7 +3833,7 @@
               <w:jc w:val="left"/>
             </w:pPr>
             <w:r>
-              <w:t xml:space="preserve">Verifica Venditore, Acquirente, Comune, Prezzo</w:t>
+              <w:t xml:space="preserve">Verifica che la card dedicata al tipo di atto sia compilata</w:t>
             </w:r>
           </w:p>
         </w:tc>
@@ -2802,18 +3890,18 @@
         </w:pict>
       </w:r>
     </w:p>
-    <w:bookmarkEnd w:id="40"/>
-    <w:bookmarkEnd w:id="41"/>
-    <w:bookmarkStart w:id="51" w:name="prezzi-e-servizi-commerciali"/>
+    <w:bookmarkEnd w:id="45"/>
+    <w:bookmarkEnd w:id="46"/>
+    <w:bookmarkStart w:id="56" w:name="prezzi-e-servizi-commerciali"/>
     <w:p>
       <w:pPr>
         <w:pStyle w:val="Heading2"/>
       </w:pPr>
       <w:r>
-        <w:t xml:space="preserve">8. Prezzi e Servizi Commerciali</w:t>
-      </w:r>
-    </w:p>
-    <w:bookmarkStart w:id="42" w:name="modello-di-business"/>
+        <w:t xml:space="preserve">9. Prezzi e Servizi Commerciali</w:t>
+      </w:r>
+    </w:p>
+    <w:bookmarkStart w:id="47" w:name="modello-di-business"/>
     <w:p>
       <w:pPr>
         <w:pStyle w:val="Heading3"/>
@@ -2843,8 +3931,8 @@
         <w:t xml:space="preserve">: il sistema viene installato fisicamente nello studio su hardware NVIDIA DGX SPARK (acquistato separatamente). I dati non escono mai dall’ufficio.</w:t>
       </w:r>
     </w:p>
-    <w:bookmarkEnd w:id="42"/>
-    <w:bookmarkStart w:id="43" w:name="pacchetti-disponibili"/>
+    <w:bookmarkEnd w:id="47"/>
+    <w:bookmarkStart w:id="48" w:name="pacchetti-disponibili"/>
     <w:p>
       <w:pPr>
         <w:pStyle w:val="Heading3"/>
@@ -3082,8 +4170,8 @@
         </w:tc>
       </w:tr>
     </w:tbl>
-    <w:bookmarkEnd w:id="43"/>
-    <w:bookmarkStart w:id="47" w:name="cosa-include-ogni-pacchetto"/>
+    <w:bookmarkEnd w:id="48"/>
+    <w:bookmarkStart w:id="52" w:name="cosa-include-ogni-pacchetto"/>
     <w:p>
       <w:pPr>
         <w:pStyle w:val="Heading3"/>
@@ -3092,7 +4180,7 @@
         <w:t xml:space="preserve">Cosa include ogni pacchetto</w:t>
       </w:r>
     </w:p>
-    <w:bookmarkStart w:id="44" w:name="base-500mese"/>
+    <w:bookmarkStart w:id="49" w:name="base-500mese"/>
     <w:p>
       <w:pPr>
         <w:pStyle w:val="Heading4"/>
@@ -3105,7 +4193,7 @@
       <w:pPr>
         <w:numPr>
           <w:ilvl w:val="0"/>
-          <w:numId w:val="1014"/>
+          <w:numId w:val="1016"/>
         </w:numPr>
         <w:pStyle w:val="Compact"/>
       </w:pPr>
@@ -3117,7 +4205,7 @@
       <w:pPr>
         <w:numPr>
           <w:ilvl w:val="0"/>
-          <w:numId w:val="1014"/>
+          <w:numId w:val="1016"/>
         </w:numPr>
         <w:pStyle w:val="Compact"/>
       </w:pPr>
@@ -3129,7 +4217,7 @@
       <w:pPr>
         <w:numPr>
           <w:ilvl w:val="0"/>
-          <w:numId w:val="1014"/>
+          <w:numId w:val="1016"/>
         </w:numPr>
         <w:pStyle w:val="Compact"/>
       </w:pPr>
@@ -3141,7 +4229,7 @@
       <w:pPr>
         <w:numPr>
           <w:ilvl w:val="0"/>
-          <w:numId w:val="1014"/>
+          <w:numId w:val="1016"/>
         </w:numPr>
         <w:pStyle w:val="Compact"/>
       </w:pPr>
@@ -3153,7 +4241,7 @@
       <w:pPr>
         <w:numPr>
           <w:ilvl w:val="0"/>
-          <w:numId w:val="1014"/>
+          <w:numId w:val="1016"/>
         </w:numPr>
         <w:pStyle w:val="Compact"/>
       </w:pPr>
@@ -3161,8 +4249,8 @@
         <w:t xml:space="preserve">Supporto email (24h SLA)</w:t>
       </w:r>
     </w:p>
-    <w:bookmarkEnd w:id="44"/>
-    <w:bookmarkStart w:id="45" w:name="professional-1.000mese"/>
+    <w:bookmarkEnd w:id="49"/>
+    <w:bookmarkStart w:id="50" w:name="professional-1.000mese"/>
     <w:p>
       <w:pPr>
         <w:pStyle w:val="Heading4"/>
@@ -3175,7 +4263,7 @@
       <w:pPr>
         <w:numPr>
           <w:ilvl w:val="0"/>
-          <w:numId w:val="1015"/>
+          <w:numId w:val="1017"/>
         </w:numPr>
         <w:pStyle w:val="Compact"/>
       </w:pPr>
@@ -3187,7 +4275,7 @@
       <w:pPr>
         <w:numPr>
           <w:ilvl w:val="0"/>
-          <w:numId w:val="1015"/>
+          <w:numId w:val="1017"/>
         </w:numPr>
         <w:pStyle w:val="Compact"/>
       </w:pPr>
@@ -3199,7 +4287,7 @@
       <w:pPr>
         <w:numPr>
           <w:ilvl w:val="0"/>
-          <w:numId w:val="1015"/>
+          <w:numId w:val="1017"/>
         </w:numPr>
         <w:pStyle w:val="Compact"/>
       </w:pPr>
@@ -3211,7 +4299,7 @@
       <w:pPr>
         <w:numPr>
           <w:ilvl w:val="0"/>
-          <w:numId w:val="1015"/>
+          <w:numId w:val="1017"/>
         </w:numPr>
         <w:pStyle w:val="Compact"/>
       </w:pPr>
@@ -3223,7 +4311,7 @@
       <w:pPr>
         <w:numPr>
           <w:ilvl w:val="0"/>
-          <w:numId w:val="1015"/>
+          <w:numId w:val="1017"/>
         </w:numPr>
         <w:pStyle w:val="Compact"/>
       </w:pPr>
@@ -3235,7 +4323,7 @@
       <w:pPr>
         <w:numPr>
           <w:ilvl w:val="0"/>
-          <w:numId w:val="1015"/>
+          <w:numId w:val="1017"/>
         </w:numPr>
         <w:pStyle w:val="Compact"/>
       </w:pPr>
@@ -3243,8 +4331,8 @@
         <w:t xml:space="preserve">2 sessioni di formazione</w:t>
       </w:r>
     </w:p>
-    <w:bookmarkEnd w:id="45"/>
-    <w:bookmarkStart w:id="46" w:name="enterprise-2.500mese"/>
+    <w:bookmarkEnd w:id="50"/>
+    <w:bookmarkStart w:id="51" w:name="enterprise-2.500mese"/>
     <w:p>
       <w:pPr>
         <w:pStyle w:val="Heading4"/>
@@ -3257,7 +4345,7 @@
       <w:pPr>
         <w:numPr>
           <w:ilvl w:val="0"/>
-          <w:numId w:val="1016"/>
+          <w:numId w:val="1018"/>
         </w:numPr>
         <w:pStyle w:val="Compact"/>
       </w:pPr>
@@ -3269,7 +4357,7 @@
       <w:pPr>
         <w:numPr>
           <w:ilvl w:val="0"/>
-          <w:numId w:val="1016"/>
+          <w:numId w:val="1018"/>
         </w:numPr>
         <w:pStyle w:val="Compact"/>
       </w:pPr>
@@ -3281,7 +4369,7 @@
       <w:pPr>
         <w:numPr>
           <w:ilvl w:val="0"/>
-          <w:numId w:val="1016"/>
+          <w:numId w:val="1018"/>
         </w:numPr>
         <w:pStyle w:val="Compact"/>
       </w:pPr>
@@ -3293,7 +4381,7 @@
       <w:pPr>
         <w:numPr>
           <w:ilvl w:val="0"/>
-          <w:numId w:val="1016"/>
+          <w:numId w:val="1018"/>
         </w:numPr>
         <w:pStyle w:val="Compact"/>
       </w:pPr>
@@ -3305,7 +4393,7 @@
       <w:pPr>
         <w:numPr>
           <w:ilvl w:val="0"/>
-          <w:numId w:val="1016"/>
+          <w:numId w:val="1018"/>
         </w:numPr>
         <w:pStyle w:val="Compact"/>
       </w:pPr>
@@ -3317,7 +4405,7 @@
       <w:pPr>
         <w:numPr>
           <w:ilvl w:val="0"/>
-          <w:numId w:val="1016"/>
+          <w:numId w:val="1018"/>
         </w:numPr>
         <w:pStyle w:val="Compact"/>
       </w:pPr>
@@ -3325,9 +4413,9 @@
         <w:t xml:space="preserve">Cluster HA (2 DGX SPARK)</w:t>
       </w:r>
     </w:p>
-    <w:bookmarkEnd w:id="46"/>
-    <w:bookmarkEnd w:id="47"/>
-    <w:bookmarkStart w:id="48" w:name="hardware-prerequisito"/>
+    <w:bookmarkEnd w:id="51"/>
+    <w:bookmarkEnd w:id="52"/>
+    <w:bookmarkStart w:id="53" w:name="hardware-prerequisito"/>
     <w:p>
       <w:pPr>
         <w:pStyle w:val="Heading3"/>
@@ -3368,8 +4456,8 @@
         <w:t xml:space="preserve">- &lt; 35 dB in operazione (adatto a ufficio)</w:t>
       </w:r>
     </w:p>
-    <w:bookmarkEnd w:id="48"/>
-    <w:bookmarkStart w:id="49" w:name="roi-stimato"/>
+    <w:bookmarkEnd w:id="53"/>
+    <w:bookmarkStart w:id="54" w:name="roi-stimato"/>
     <w:p>
       <w:pPr>
         <w:pStyle w:val="Heading3"/>
@@ -3537,8 +4625,8 @@
         </w:tc>
       </w:tr>
     </w:tbl>
-    <w:bookmarkEnd w:id="49"/>
-    <w:bookmarkStart w:id="50" w:name="contatti-commerciali"/>
+    <w:bookmarkEnd w:id="54"/>
+    <w:bookmarkStart w:id="55" w:name="contatti-commerciali"/>
     <w:p>
       <w:pPr>
         <w:pStyle w:val="Heading3"/>
@@ -3551,7 +4639,7 @@
       <w:pPr>
         <w:numPr>
           <w:ilvl w:val="0"/>
-          <w:numId w:val="1017"/>
+          <w:numId w:val="1019"/>
         </w:numPr>
         <w:pStyle w:val="Compact"/>
       </w:pPr>
@@ -3573,7 +4661,7 @@
       <w:pPr>
         <w:numPr>
           <w:ilvl w:val="0"/>
-          <w:numId w:val="1017"/>
+          <w:numId w:val="1019"/>
         </w:numPr>
         <w:pStyle w:val="Compact"/>
       </w:pPr>
@@ -3595,7 +4683,7 @@
       <w:pPr>
         <w:numPr>
           <w:ilvl w:val="0"/>
-          <w:numId w:val="1017"/>
+          <w:numId w:val="1019"/>
         </w:numPr>
         <w:pStyle w:val="Compact"/>
       </w:pPr>
@@ -3620,18 +4708,18 @@
         </w:pict>
       </w:r>
     </w:p>
-    <w:bookmarkEnd w:id="50"/>
-    <w:bookmarkEnd w:id="51"/>
-    <w:bookmarkStart w:id="61" w:name="gli-agenti-ai-di-notaio-ai-dettaglio"/>
+    <w:bookmarkEnd w:id="55"/>
+    <w:bookmarkEnd w:id="56"/>
+    <w:bookmarkStart w:id="66" w:name="gli-agenti-ai-di-notaio-ai-dettaglio"/>
     <w:p>
       <w:pPr>
         <w:pStyle w:val="Heading2"/>
       </w:pPr>
       <w:r>
-        <w:t xml:space="preserve">9. Gli Agenti AI di Notaio AI — Dettaglio</w:t>
-      </w:r>
-    </w:p>
-    <w:bookmarkStart w:id="52" w:name="panoramica"/>
+        <w:t xml:space="preserve">10. Gli Agenti AI di Notaio AI — Dettaglio</w:t>
+      </w:r>
+    </w:p>
+    <w:bookmarkStart w:id="57" w:name="panoramica-1"/>
     <w:p>
       <w:pPr>
         <w:pStyle w:val="Heading3"/>
@@ -3661,8 +4749,8 @@
         <w:t xml:space="preserve">, ciascuno con una propria identità, competenze e regole di comportamento. Il sistema sceglie automaticamente l’agente giusto per ogni compito.</w:t>
       </w:r>
     </w:p>
-    <w:bookmarkEnd w:id="52"/>
-    <w:bookmarkStart w:id="60" w:name="i-7-agenti"/>
+    <w:bookmarkEnd w:id="57"/>
+    <w:bookmarkStart w:id="65" w:name="i-7-agenti"/>
     <w:p>
       <w:pPr>
         <w:pStyle w:val="Heading3"/>
@@ -3671,7 +4759,7 @@
         <w:t xml:space="preserve">I 7 agenti</w:t>
       </w:r>
     </w:p>
-    <w:bookmarkStart w:id="53" w:name="attista"/>
+    <w:bookmarkStart w:id="58" w:name="attista"/>
     <w:p>
       <w:pPr>
         <w:pStyle w:val="Heading4"/>
@@ -3684,7 +4772,7 @@
       <w:pPr>
         <w:numPr>
           <w:ilvl w:val="0"/>
-          <w:numId w:val="1018"/>
+          <w:numId w:val="1020"/>
         </w:numPr>
         <w:pStyle w:val="Compact"/>
       </w:pPr>
@@ -3706,7 +4794,7 @@
       <w:pPr>
         <w:numPr>
           <w:ilvl w:val="0"/>
-          <w:numId w:val="1018"/>
+          <w:numId w:val="1020"/>
         </w:numPr>
         <w:pStyle w:val="Compact"/>
       </w:pPr>
@@ -3728,7 +4816,7 @@
       <w:pPr>
         <w:numPr>
           <w:ilvl w:val="0"/>
-          <w:numId w:val="1018"/>
+          <w:numId w:val="1020"/>
         </w:numPr>
         <w:pStyle w:val="Compact"/>
       </w:pPr>
@@ -3750,7 +4838,7 @@
       <w:pPr>
         <w:numPr>
           <w:ilvl w:val="0"/>
-          <w:numId w:val="1018"/>
+          <w:numId w:val="1020"/>
         </w:numPr>
         <w:pStyle w:val="Compact"/>
       </w:pPr>
@@ -3772,7 +4860,7 @@
       <w:pPr>
         <w:numPr>
           <w:ilvl w:val="0"/>
-          <w:numId w:val="1018"/>
+          <w:numId w:val="1020"/>
         </w:numPr>
         <w:pStyle w:val="Compact"/>
       </w:pPr>
@@ -3790,8 +4878,30 @@
         <w:t xml:space="preserve">Non inventa clausole, cita norma specifica, registro solenne</w:t>
       </w:r>
     </w:p>
-    <w:bookmarkEnd w:id="53"/>
-    <w:bookmarkStart w:id="54" w:name="catasto"/>
+    <w:p>
+      <w:pPr>
+        <w:numPr>
+          <w:ilvl w:val="0"/>
+          <w:numId w:val="1020"/>
+        </w:numPr>
+        <w:pStyle w:val="Compact"/>
+      </w:pPr>
+      <w:r>
+        <w:rPr>
+          <w:bCs/>
+          <w:b/>
+        </w:rPr>
+        <w:t xml:space="preserve">Tipi supportati:</w:t>
+      </w:r>
+      <w:r>
+        <w:t xml:space="preserve"> </w:t>
+      </w:r>
+      <w:r>
+        <w:t xml:space="preserve">Compravendita, Costituzione SRL, Testamento, Patto di famiglia, Mutuo, Divisione, Donazione</w:t>
+      </w:r>
+    </w:p>
+    <w:bookmarkEnd w:id="58"/>
+    <w:bookmarkStart w:id="59" w:name="catasto"/>
     <w:p>
       <w:pPr>
         <w:pStyle w:val="Heading4"/>
@@ -3804,7 +4914,7 @@
       <w:pPr>
         <w:numPr>
           <w:ilvl w:val="0"/>
-          <w:numId w:val="1019"/>
+          <w:numId w:val="1021"/>
         </w:numPr>
         <w:pStyle w:val="Compact"/>
       </w:pPr>
@@ -3826,7 +4936,7 @@
       <w:pPr>
         <w:numPr>
           <w:ilvl w:val="0"/>
-          <w:numId w:val="1019"/>
+          <w:numId w:val="1021"/>
         </w:numPr>
         <w:pStyle w:val="Compact"/>
       </w:pPr>
@@ -3841,6 +4951,148 @@
         <w:t xml:space="preserve"> </w:t>
       </w:r>
       <w:r>
+        <w:t xml:space="preserve">Qwen-72B</w:t>
+      </w:r>
+    </w:p>
+    <w:p>
+      <w:pPr>
+        <w:numPr>
+          <w:ilvl w:val="0"/>
+          <w:numId w:val="1021"/>
+        </w:numPr>
+        <w:pStyle w:val="Compact"/>
+      </w:pPr>
+      <w:r>
+        <w:rPr>
+          <w:bCs/>
+          <w:b/>
+        </w:rPr>
+        <w:t xml:space="preserve">Temperatura:</w:t>
+      </w:r>
+      <w:r>
+        <w:t xml:space="preserve"> </w:t>
+      </w:r>
+      <w:r>
+        <w:t xml:space="preserve">0.1 (massima precisione)</w:t>
+      </w:r>
+    </w:p>
+    <w:p>
+      <w:pPr>
+        <w:numPr>
+          <w:ilvl w:val="0"/>
+          <w:numId w:val="1021"/>
+        </w:numPr>
+        <w:pStyle w:val="Compact"/>
+      </w:pPr>
+      <w:r>
+        <w:rPr>
+          <w:bCs/>
+          <w:b/>
+        </w:rPr>
+        <w:t xml:space="preserve">Output:</w:t>
+      </w:r>
+      <w:r>
+        <w:t xml:space="preserve"> </w:t>
+      </w:r>
+      <w:r>
+        <w:t xml:space="preserve">Report con checklist e anomalie</w:t>
+      </w:r>
+    </w:p>
+    <w:p>
+      <w:pPr>
+        <w:numPr>
+          <w:ilvl w:val="0"/>
+          <w:numId w:val="1021"/>
+        </w:numPr>
+        <w:pStyle w:val="Compact"/>
+      </w:pPr>
+      <w:r>
+        <w:rPr>
+          <w:bCs/>
+          <w:b/>
+        </w:rPr>
+        <w:t xml:space="preserve">Regole critiche:</w:t>
+      </w:r>
+      <w:r>
+        <w:t xml:space="preserve"> </w:t>
+      </w:r>
+      <w:r>
+        <w:t xml:space="preserve">Non inventa dati catastali, usa placeholder per verifiche esterne</w:t>
+      </w:r>
+    </w:p>
+    <w:p>
+      <w:pPr>
+        <w:numPr>
+          <w:ilvl w:val="0"/>
+          <w:numId w:val="1021"/>
+        </w:numPr>
+        <w:pStyle w:val="Compact"/>
+      </w:pPr>
+      <w:r>
+        <w:rPr>
+          <w:bCs/>
+          <w:b/>
+        </w:rPr>
+        <w:t xml:space="preserve">Quando viene chiamato:</w:t>
+      </w:r>
+      <w:r>
+        <w:t xml:space="preserve"> </w:t>
+      </w:r>
+      <w:r>
+        <w:t xml:space="preserve">Solo per atti immobiliari (Compravendita, Mutuo, Divisione, Donazione)</w:t>
+      </w:r>
+    </w:p>
+    <w:bookmarkEnd w:id="59"/>
+    <w:bookmarkStart w:id="60" w:name="conformità"/>
+    <w:p>
+      <w:pPr>
+        <w:pStyle w:val="Heading4"/>
+      </w:pPr>
+      <w:r>
+        <w:t xml:space="preserve">✅ 3. Conformità</w:t>
+      </w:r>
+    </w:p>
+    <w:p>
+      <w:pPr>
+        <w:numPr>
+          <w:ilvl w:val="0"/>
+          <w:numId w:val="1022"/>
+        </w:numPr>
+        <w:pStyle w:val="Compact"/>
+      </w:pPr>
+      <w:r>
+        <w:rPr>
+          <w:bCs/>
+          <w:b/>
+        </w:rPr>
+        <w:t xml:space="preserve">Ruolo:</w:t>
+      </w:r>
+      <w:r>
+        <w:t xml:space="preserve"> </w:t>
+      </w:r>
+      <w:r>
+        <w:t xml:space="preserve">Conformità urbanistica, edilizia, fiscale</w:t>
+      </w:r>
+    </w:p>
+    <w:p>
+      <w:pPr>
+        <w:numPr>
+          <w:ilvl w:val="0"/>
+          <w:numId w:val="1022"/>
+        </w:numPr>
+        <w:pStyle w:val="Compact"/>
+      </w:pPr>
+      <w:r>
+        <w:rPr>
+          <w:bCs/>
+          <w:b/>
+        </w:rPr>
+        <w:t xml:space="preserve">Modello:</w:t>
+      </w:r>
+      <w:r>
+        <w:t xml:space="preserve"> </w:t>
+      </w:r>
+      <w:r>
         <w:t xml:space="preserve">Nemotron-70B</w:t>
       </w:r>
     </w:p>
@@ -3848,7 +5100,7 @@
       <w:pPr>
         <w:numPr>
           <w:ilvl w:val="0"/>
-          <w:numId w:val="1019"/>
+          <w:numId w:val="1022"/>
         </w:numPr>
         <w:pStyle w:val="Compact"/>
       </w:pPr>
@@ -3863,14 +5115,14 @@
         <w:t xml:space="preserve"> </w:t>
       </w:r>
       <w:r>
-        <w:t xml:space="preserve">0.1 (massima precisione)</w:t>
-      </w:r>
-    </w:p>
-    <w:p>
-      <w:pPr>
-        <w:numPr>
-          <w:ilvl w:val="0"/>
-          <w:numId w:val="1019"/>
+        <w:t xml:space="preserve">0.15</w:t>
+      </w:r>
+    </w:p>
+    <w:p>
+      <w:pPr>
+        <w:numPr>
+          <w:ilvl w:val="0"/>
+          <w:numId w:val="1022"/>
         </w:numPr>
         <w:pStyle w:val="Compact"/>
       </w:pPr>
@@ -3885,14 +5137,14 @@
         <w:t xml:space="preserve"> </w:t>
       </w:r>
       <w:r>
-        <w:t xml:space="preserve">Report con checklist e anomalie</w:t>
-      </w:r>
-    </w:p>
-    <w:p>
-      <w:pPr>
-        <w:numPr>
-          <w:ilvl w:val="0"/>
-          <w:numId w:val="1019"/>
+        <w:t xml:space="preserve">Report con documenti mancanti e agevolazioni</w:t>
+      </w:r>
+    </w:p>
+    <w:p>
+      <w:pPr>
+        <w:numPr>
+          <w:ilvl w:val="0"/>
+          <w:numId w:val="1022"/>
         </w:numPr>
         <w:pStyle w:val="Compact"/>
       </w:pPr>
@@ -3907,24 +5159,46 @@
         <w:t xml:space="preserve"> </w:t>
       </w:r>
       <w:r>
-        <w:t xml:space="preserve">Non inventa dati catastali, usa placeholder per verifiche esterne</w:t>
-      </w:r>
-    </w:p>
-    <w:bookmarkEnd w:id="54"/>
-    <w:bookmarkStart w:id="55" w:name="conformità"/>
+        <w:t xml:space="preserve">Non dà parere positivo assoluto se manca documentazione</w:t>
+      </w:r>
+    </w:p>
+    <w:p>
+      <w:pPr>
+        <w:numPr>
+          <w:ilvl w:val="0"/>
+          <w:numId w:val="1022"/>
+        </w:numPr>
+        <w:pStyle w:val="Compact"/>
+      </w:pPr>
+      <w:r>
+        <w:rPr>
+          <w:bCs/>
+          <w:b/>
+        </w:rPr>
+        <w:t xml:space="preserve">Quando viene chiamato:</w:t>
+      </w:r>
+      <w:r>
+        <w:t xml:space="preserve"> </w:t>
+      </w:r>
+      <w:r>
+        <w:t xml:space="preserve">Solo per atti immobiliari</w:t>
+      </w:r>
+    </w:p>
+    <w:bookmarkEnd w:id="60"/>
+    <w:bookmarkStart w:id="61" w:name="controllo"/>
     <w:p>
       <w:pPr>
         <w:pStyle w:val="Heading4"/>
       </w:pPr>
       <w:r>
-        <w:t xml:space="preserve">✅ 3. Conformità</w:t>
-      </w:r>
-    </w:p>
-    <w:p>
-      <w:pPr>
-        <w:numPr>
-          <w:ilvl w:val="0"/>
-          <w:numId w:val="1020"/>
+        <w:t xml:space="preserve">📋 4. Controllo</w:t>
+      </w:r>
+    </w:p>
+    <w:p>
+      <w:pPr>
+        <w:numPr>
+          <w:ilvl w:val="0"/>
+          <w:numId w:val="1023"/>
         </w:numPr>
         <w:pStyle w:val="Compact"/>
       </w:pPr>
@@ -3939,14 +5213,14 @@
         <w:t xml:space="preserve"> </w:t>
       </w:r>
       <w:r>
-        <w:t xml:space="preserve">Conformità urbanistica, edilizia, fiscale</w:t>
-      </w:r>
-    </w:p>
-    <w:p>
-      <w:pPr>
-        <w:numPr>
-          <w:ilvl w:val="0"/>
-          <w:numId w:val="1020"/>
+        <w:t xml:space="preserve">Controllo documenti e coerenza</w:t>
+      </w:r>
+    </w:p>
+    <w:p>
+      <w:pPr>
+        <w:numPr>
+          <w:ilvl w:val="0"/>
+          <w:numId w:val="1023"/>
         </w:numPr>
         <w:pStyle w:val="Compact"/>
       </w:pPr>
@@ -3961,6 +5235,246 @@
         <w:t xml:space="preserve"> </w:t>
       </w:r>
       <w:r>
+        <w:t xml:space="preserve">Qwen-72B</w:t>
+      </w:r>
+    </w:p>
+    <w:p>
+      <w:pPr>
+        <w:numPr>
+          <w:ilvl w:val="0"/>
+          <w:numId w:val="1023"/>
+        </w:numPr>
+        <w:pStyle w:val="Compact"/>
+      </w:pPr>
+      <w:r>
+        <w:rPr>
+          <w:bCs/>
+          <w:b/>
+        </w:rPr>
+        <w:t xml:space="preserve">Temperatura:</w:t>
+      </w:r>
+      <w:r>
+        <w:t xml:space="preserve"> </w:t>
+      </w:r>
+      <w:r>
+        <w:t xml:space="preserve">0.1</w:t>
+      </w:r>
+    </w:p>
+    <w:p>
+      <w:pPr>
+        <w:numPr>
+          <w:ilvl w:val="0"/>
+          <w:numId w:val="1023"/>
+        </w:numPr>
+        <w:pStyle w:val="Compact"/>
+      </w:pPr>
+      <w:r>
+        <w:rPr>
+          <w:bCs/>
+          <w:b/>
+        </w:rPr>
+        <w:t xml:space="preserve">Output:</w:t>
+      </w:r>
+      <w:r>
+        <w:t xml:space="preserve"> </w:t>
+      </w:r>
+      <w:r>
+        <w:t xml:space="preserve">Checklist obbligatori/facoltativi, alert firme</w:t>
+      </w:r>
+    </w:p>
+    <w:p>
+      <w:pPr>
+        <w:numPr>
+          <w:ilvl w:val="0"/>
+          <w:numId w:val="1023"/>
+        </w:numPr>
+        <w:pStyle w:val="Compact"/>
+      </w:pPr>
+      <w:r>
+        <w:rPr>
+          <w:bCs/>
+          <w:b/>
+        </w:rPr>
+        <w:t xml:space="preserve">Regole critiche:</w:t>
+      </w:r>
+      <w:r>
+        <w:t xml:space="preserve"> </w:t>
+      </w:r>
+      <w:r>
+        <w:t xml:space="preserve">Non dà OK definitivo, distingue obbligo da best practice</w:t>
+      </w:r>
+    </w:p>
+    <w:bookmarkEnd w:id="61"/>
+    <w:bookmarkStart w:id="62" w:name="scadenze"/>
+    <w:p>
+      <w:pPr>
+        <w:pStyle w:val="Heading4"/>
+      </w:pPr>
+      <w:r>
+        <w:t xml:space="preserve">⏰ 5. Scadenze</w:t>
+      </w:r>
+    </w:p>
+    <w:p>
+      <w:pPr>
+        <w:numPr>
+          <w:ilvl w:val="0"/>
+          <w:numId w:val="1024"/>
+        </w:numPr>
+        <w:pStyle w:val="Compact"/>
+      </w:pPr>
+      <w:r>
+        <w:rPr>
+          <w:bCs/>
+          <w:b/>
+        </w:rPr>
+        <w:t xml:space="preserve">Ruolo:</w:t>
+      </w:r>
+      <w:r>
+        <w:t xml:space="preserve"> </w:t>
+      </w:r>
+      <w:r>
+        <w:t xml:space="preserve">Gestione termini e scadenze</w:t>
+      </w:r>
+    </w:p>
+    <w:p>
+      <w:pPr>
+        <w:numPr>
+          <w:ilvl w:val="0"/>
+          <w:numId w:val="1024"/>
+        </w:numPr>
+        <w:pStyle w:val="Compact"/>
+      </w:pPr>
+      <w:r>
+        <w:rPr>
+          <w:bCs/>
+          <w:b/>
+        </w:rPr>
+        <w:t xml:space="preserve">Modello:</w:t>
+      </w:r>
+      <w:r>
+        <w:t xml:space="preserve"> </w:t>
+      </w:r>
+      <w:r>
+        <w:t xml:space="preserve">Qwen-72B</w:t>
+      </w:r>
+    </w:p>
+    <w:p>
+      <w:pPr>
+        <w:numPr>
+          <w:ilvl w:val="0"/>
+          <w:numId w:val="1024"/>
+        </w:numPr>
+        <w:pStyle w:val="Compact"/>
+      </w:pPr>
+      <w:r>
+        <w:rPr>
+          <w:bCs/>
+          <w:b/>
+        </w:rPr>
+        <w:t xml:space="preserve">Temperatura:</w:t>
+      </w:r>
+      <w:r>
+        <w:t xml:space="preserve"> </w:t>
+      </w:r>
+      <w:r>
+        <w:t xml:space="preserve">0.1</w:t>
+      </w:r>
+    </w:p>
+    <w:p>
+      <w:pPr>
+        <w:numPr>
+          <w:ilvl w:val="0"/>
+          <w:numId w:val="1024"/>
+        </w:numPr>
+        <w:pStyle w:val="Compact"/>
+      </w:pPr>
+      <w:r>
+        <w:rPr>
+          <w:bCs/>
+          <w:b/>
+        </w:rPr>
+        <w:t xml:space="preserve">Output:</w:t>
+      </w:r>
+      <w:r>
+        <w:t xml:space="preserve"> </w:t>
+      </w:r>
+      <w:r>
+        <w:t xml:space="preserve">Cronoprogramma con date calcolate</w:t>
+      </w:r>
+    </w:p>
+    <w:p>
+      <w:pPr>
+        <w:numPr>
+          <w:ilvl w:val="0"/>
+          <w:numId w:val="1024"/>
+        </w:numPr>
+        <w:pStyle w:val="Compact"/>
+      </w:pPr>
+      <w:r>
+        <w:rPr>
+          <w:bCs/>
+          <w:b/>
+        </w:rPr>
+        <w:t xml:space="preserve">Regole critiche:</w:t>
+      </w:r>
+      <w:r>
+        <w:t xml:space="preserve"> </w:t>
+      </w:r>
+      <w:r>
+        <w:t xml:space="preserve">Distingue perentori da ordinatori, calcola in giorni solari</w:t>
+      </w:r>
+    </w:p>
+    <w:bookmarkEnd w:id="62"/>
+    <w:bookmarkStart w:id="63" w:name="ricercatore"/>
+    <w:p>
+      <w:pPr>
+        <w:pStyle w:val="Heading4"/>
+      </w:pPr>
+      <w:r>
+        <w:t xml:space="preserve">🔍 6. Ricercatore</w:t>
+      </w:r>
+    </w:p>
+    <w:p>
+      <w:pPr>
+        <w:numPr>
+          <w:ilvl w:val="0"/>
+          <w:numId w:val="1025"/>
+        </w:numPr>
+        <w:pStyle w:val="Compact"/>
+      </w:pPr>
+      <w:r>
+        <w:rPr>
+          <w:bCs/>
+          <w:b/>
+        </w:rPr>
+        <w:t xml:space="preserve">Ruolo:</w:t>
+      </w:r>
+      <w:r>
+        <w:t xml:space="preserve"> </w:t>
+      </w:r>
+      <w:r>
+        <w:t xml:space="preserve">Ricerca normativa notarile</w:t>
+      </w:r>
+    </w:p>
+    <w:p>
+      <w:pPr>
+        <w:numPr>
+          <w:ilvl w:val="0"/>
+          <w:numId w:val="1025"/>
+        </w:numPr>
+        <w:pStyle w:val="Compact"/>
+      </w:pPr>
+      <w:r>
+        <w:rPr>
+          <w:bCs/>
+          <w:b/>
+        </w:rPr>
+        <w:t xml:space="preserve">Modello:</w:t>
+      </w:r>
+      <w:r>
+        <w:t xml:space="preserve"> </w:t>
+      </w:r>
+      <w:r>
         <w:t xml:space="preserve">Nemotron-70B</w:t>
       </w:r>
     </w:p>
@@ -3968,7 +5482,7 @@
       <w:pPr>
         <w:numPr>
           <w:ilvl w:val="0"/>
-          <w:numId w:val="1020"/>
+          <w:numId w:val="1025"/>
         </w:numPr>
         <w:pStyle w:val="Compact"/>
       </w:pPr>
@@ -3983,14 +5497,14 @@
         <w:t xml:space="preserve"> </w:t>
       </w:r>
       <w:r>
-        <w:t xml:space="preserve">0.15</w:t>
-      </w:r>
-    </w:p>
-    <w:p>
-      <w:pPr>
-        <w:numPr>
-          <w:ilvl w:val="0"/>
-          <w:numId w:val="1020"/>
+        <w:t xml:space="preserve">0.2</w:t>
+      </w:r>
+    </w:p>
+    <w:p>
+      <w:pPr>
+        <w:numPr>
+          <w:ilvl w:val="0"/>
+          <w:numId w:val="1025"/>
         </w:numPr>
         <w:pStyle w:val="Compact"/>
       </w:pPr>
@@ -4005,14 +5519,14 @@
         <w:t xml:space="preserve"> </w:t>
       </w:r>
       <w:r>
-        <w:t xml:space="preserve">Report con documenti mancanti e agevolazioni</w:t>
-      </w:r>
-    </w:p>
-    <w:p>
-      <w:pPr>
-        <w:numPr>
-          <w:ilvl w:val="0"/>
-          <w:numId w:val="1020"/>
+        <w:t xml:space="preserve">Quadro normativo, circolari CNN, giurisprudenza</w:t>
+      </w:r>
+    </w:p>
+    <w:p>
+      <w:pPr>
+        <w:numPr>
+          <w:ilvl w:val="0"/>
+          <w:numId w:val="1025"/>
         </w:numPr>
         <w:pStyle w:val="Compact"/>
       </w:pPr>
@@ -4027,24 +5541,24 @@
         <w:t xml:space="preserve"> </w:t>
       </w:r>
       <w:r>
-        <w:t xml:space="preserve">Non dà parere positivo assoluto se manca documentazione</w:t>
-      </w:r>
-    </w:p>
-    <w:bookmarkEnd w:id="55"/>
-    <w:bookmarkStart w:id="56" w:name="controllo"/>
+        <w:t xml:space="preserve">Non inventa norme, distingue vigente da abrogata</w:t>
+      </w:r>
+    </w:p>
+    <w:bookmarkEnd w:id="63"/>
+    <w:bookmarkStart w:id="64" w:name="firma"/>
     <w:p>
       <w:pPr>
         <w:pStyle w:val="Heading4"/>
       </w:pPr>
       <w:r>
-        <w:t xml:space="preserve">📋 4. Controllo</w:t>
-      </w:r>
-    </w:p>
-    <w:p>
-      <w:pPr>
-        <w:numPr>
-          <w:ilvl w:val="0"/>
-          <w:numId w:val="1021"/>
+        <w:t xml:space="preserve">✍️ 7. Firma</w:t>
+      </w:r>
+    </w:p>
+    <w:p>
+      <w:pPr>
+        <w:numPr>
+          <w:ilvl w:val="0"/>
+          <w:numId w:val="1026"/>
         </w:numPr>
         <w:pStyle w:val="Compact"/>
       </w:pPr>
@@ -4059,14 +5573,14 @@
         <w:t xml:space="preserve"> </w:t>
       </w:r>
       <w:r>
-        <w:t xml:space="preserve">Controllo documenti e coerenza</w:t>
-      </w:r>
-    </w:p>
-    <w:p>
-      <w:pPr>
-        <w:numPr>
-          <w:ilvl w:val="0"/>
-          <w:numId w:val="1021"/>
+        <w:t xml:space="preserve">Supporto firma digitale</w:t>
+      </w:r>
+    </w:p>
+    <w:p>
+      <w:pPr>
+        <w:numPr>
+          <w:ilvl w:val="0"/>
+          <w:numId w:val="1026"/>
         </w:numPr>
         <w:pStyle w:val="Compact"/>
       </w:pPr>
@@ -4088,7 +5602,7 @@
       <w:pPr>
         <w:numPr>
           <w:ilvl w:val="0"/>
-          <w:numId w:val="1021"/>
+          <w:numId w:val="1026"/>
         </w:numPr>
         <w:pStyle w:val="Compact"/>
       </w:pPr>
@@ -4110,7 +5624,7 @@
       <w:pPr>
         <w:numPr>
           <w:ilvl w:val="0"/>
-          <w:numId w:val="1021"/>
+          <w:numId w:val="1026"/>
         </w:numPr>
         <w:pStyle w:val="Compact"/>
       </w:pPr>
@@ -4125,366 +5639,6 @@
         <w:t xml:space="preserve"> </w:t>
       </w:r>
       <w:r>
-        <w:t xml:space="preserve">Checklist obbligatori/facoltativi, alert firme</w:t>
-      </w:r>
-    </w:p>
-    <w:p>
-      <w:pPr>
-        <w:numPr>
-          <w:ilvl w:val="0"/>
-          <w:numId w:val="1021"/>
-        </w:numPr>
-        <w:pStyle w:val="Compact"/>
-      </w:pPr>
-      <w:r>
-        <w:rPr>
-          <w:bCs/>
-          <w:b/>
-        </w:rPr>
-        <w:t xml:space="preserve">Regole critiche:</w:t>
-      </w:r>
-      <w:r>
-        <w:t xml:space="preserve"> </w:t>
-      </w:r>
-      <w:r>
-        <w:t xml:space="preserve">Non dà OK definitivo, distingue obbligo da best practice</w:t>
-      </w:r>
-    </w:p>
-    <w:bookmarkEnd w:id="56"/>
-    <w:bookmarkStart w:id="57" w:name="scadenze"/>
-    <w:p>
-      <w:pPr>
-        <w:pStyle w:val="Heading4"/>
-      </w:pPr>
-      <w:r>
-        <w:t xml:space="preserve">⏰ 5. Scadenze</w:t>
-      </w:r>
-    </w:p>
-    <w:p>
-      <w:pPr>
-        <w:numPr>
-          <w:ilvl w:val="0"/>
-          <w:numId w:val="1022"/>
-        </w:numPr>
-        <w:pStyle w:val="Compact"/>
-      </w:pPr>
-      <w:r>
-        <w:rPr>
-          <w:bCs/>
-          <w:b/>
-        </w:rPr>
-        <w:t xml:space="preserve">Ruolo:</w:t>
-      </w:r>
-      <w:r>
-        <w:t xml:space="preserve"> </w:t>
-      </w:r>
-      <w:r>
-        <w:t xml:space="preserve">Gestione termini e scadenze</w:t>
-      </w:r>
-    </w:p>
-    <w:p>
-      <w:pPr>
-        <w:numPr>
-          <w:ilvl w:val="0"/>
-          <w:numId w:val="1022"/>
-        </w:numPr>
-        <w:pStyle w:val="Compact"/>
-      </w:pPr>
-      <w:r>
-        <w:rPr>
-          <w:bCs/>
-          <w:b/>
-        </w:rPr>
-        <w:t xml:space="preserve">Modello:</w:t>
-      </w:r>
-      <w:r>
-        <w:t xml:space="preserve"> </w:t>
-      </w:r>
-      <w:r>
-        <w:t xml:space="preserve">Qwen-72B</w:t>
-      </w:r>
-    </w:p>
-    <w:p>
-      <w:pPr>
-        <w:numPr>
-          <w:ilvl w:val="0"/>
-          <w:numId w:val="1022"/>
-        </w:numPr>
-        <w:pStyle w:val="Compact"/>
-      </w:pPr>
-      <w:r>
-        <w:rPr>
-          <w:bCs/>
-          <w:b/>
-        </w:rPr>
-        <w:t xml:space="preserve">Temperatura:</w:t>
-      </w:r>
-      <w:r>
-        <w:t xml:space="preserve"> </w:t>
-      </w:r>
-      <w:r>
-        <w:t xml:space="preserve">0.1</w:t>
-      </w:r>
-    </w:p>
-    <w:p>
-      <w:pPr>
-        <w:numPr>
-          <w:ilvl w:val="0"/>
-          <w:numId w:val="1022"/>
-        </w:numPr>
-        <w:pStyle w:val="Compact"/>
-      </w:pPr>
-      <w:r>
-        <w:rPr>
-          <w:bCs/>
-          <w:b/>
-        </w:rPr>
-        <w:t xml:space="preserve">Output:</w:t>
-      </w:r>
-      <w:r>
-        <w:t xml:space="preserve"> </w:t>
-      </w:r>
-      <w:r>
-        <w:t xml:space="preserve">Cronoprogramma con date calcolate</w:t>
-      </w:r>
-    </w:p>
-    <w:p>
-      <w:pPr>
-        <w:numPr>
-          <w:ilvl w:val="0"/>
-          <w:numId w:val="1022"/>
-        </w:numPr>
-        <w:pStyle w:val="Compact"/>
-      </w:pPr>
-      <w:r>
-        <w:rPr>
-          <w:bCs/>
-          <w:b/>
-        </w:rPr>
-        <w:t xml:space="preserve">Regole critiche:</w:t>
-      </w:r>
-      <w:r>
-        <w:t xml:space="preserve"> </w:t>
-      </w:r>
-      <w:r>
-        <w:t xml:space="preserve">Distingue perentori da ordinatori, calcola in giorni solari</w:t>
-      </w:r>
-    </w:p>
-    <w:bookmarkEnd w:id="57"/>
-    <w:bookmarkStart w:id="58" w:name="ricercatore"/>
-    <w:p>
-      <w:pPr>
-        <w:pStyle w:val="Heading4"/>
-      </w:pPr>
-      <w:r>
-        <w:t xml:space="preserve">🔍 6. Ricercatore</w:t>
-      </w:r>
-    </w:p>
-    <w:p>
-      <w:pPr>
-        <w:numPr>
-          <w:ilvl w:val="0"/>
-          <w:numId w:val="1023"/>
-        </w:numPr>
-        <w:pStyle w:val="Compact"/>
-      </w:pPr>
-      <w:r>
-        <w:rPr>
-          <w:bCs/>
-          <w:b/>
-        </w:rPr>
-        <w:t xml:space="preserve">Ruolo:</w:t>
-      </w:r>
-      <w:r>
-        <w:t xml:space="preserve"> </w:t>
-      </w:r>
-      <w:r>
-        <w:t xml:space="preserve">Ricerca normativa notarile</w:t>
-      </w:r>
-    </w:p>
-    <w:p>
-      <w:pPr>
-        <w:numPr>
-          <w:ilvl w:val="0"/>
-          <w:numId w:val="1023"/>
-        </w:numPr>
-        <w:pStyle w:val="Compact"/>
-      </w:pPr>
-      <w:r>
-        <w:rPr>
-          <w:bCs/>
-          <w:b/>
-        </w:rPr>
-        <w:t xml:space="preserve">Modello:</w:t>
-      </w:r>
-      <w:r>
-        <w:t xml:space="preserve"> </w:t>
-      </w:r>
-      <w:r>
-        <w:t xml:space="preserve">Nemotron-70B</w:t>
-      </w:r>
-    </w:p>
-    <w:p>
-      <w:pPr>
-        <w:numPr>
-          <w:ilvl w:val="0"/>
-          <w:numId w:val="1023"/>
-        </w:numPr>
-        <w:pStyle w:val="Compact"/>
-      </w:pPr>
-      <w:r>
-        <w:rPr>
-          <w:bCs/>
-          <w:b/>
-        </w:rPr>
-        <w:t xml:space="preserve">Temperatura:</w:t>
-      </w:r>
-      <w:r>
-        <w:t xml:space="preserve"> </w:t>
-      </w:r>
-      <w:r>
-        <w:t xml:space="preserve">0.2</w:t>
-      </w:r>
-    </w:p>
-    <w:p>
-      <w:pPr>
-        <w:numPr>
-          <w:ilvl w:val="0"/>
-          <w:numId w:val="1023"/>
-        </w:numPr>
-        <w:pStyle w:val="Compact"/>
-      </w:pPr>
-      <w:r>
-        <w:rPr>
-          <w:bCs/>
-          <w:b/>
-        </w:rPr>
-        <w:t xml:space="preserve">Output:</w:t>
-      </w:r>
-      <w:r>
-        <w:t xml:space="preserve"> </w:t>
-      </w:r>
-      <w:r>
-        <w:t xml:space="preserve">Quadro normativo, circolari CNN, giurisprudenza</w:t>
-      </w:r>
-    </w:p>
-    <w:p>
-      <w:pPr>
-        <w:numPr>
-          <w:ilvl w:val="0"/>
-          <w:numId w:val="1023"/>
-        </w:numPr>
-        <w:pStyle w:val="Compact"/>
-      </w:pPr>
-      <w:r>
-        <w:rPr>
-          <w:bCs/>
-          <w:b/>
-        </w:rPr>
-        <w:t xml:space="preserve">Regole critiche:</w:t>
-      </w:r>
-      <w:r>
-        <w:t xml:space="preserve"> </w:t>
-      </w:r>
-      <w:r>
-        <w:t xml:space="preserve">Non inventa norme, distingue vigente da abrogata</w:t>
-      </w:r>
-    </w:p>
-    <w:bookmarkEnd w:id="58"/>
-    <w:bookmarkStart w:id="59" w:name="firma"/>
-    <w:p>
-      <w:pPr>
-        <w:pStyle w:val="Heading4"/>
-      </w:pPr>
-      <w:r>
-        <w:t xml:space="preserve">✍️ 7. Firma</w:t>
-      </w:r>
-    </w:p>
-    <w:p>
-      <w:pPr>
-        <w:numPr>
-          <w:ilvl w:val="0"/>
-          <w:numId w:val="1024"/>
-        </w:numPr>
-        <w:pStyle w:val="Compact"/>
-      </w:pPr>
-      <w:r>
-        <w:rPr>
-          <w:bCs/>
-          <w:b/>
-        </w:rPr>
-        <w:t xml:space="preserve">Ruolo:</w:t>
-      </w:r>
-      <w:r>
-        <w:t xml:space="preserve"> </w:t>
-      </w:r>
-      <w:r>
-        <w:t xml:space="preserve">Supporto firma digitale</w:t>
-      </w:r>
-    </w:p>
-    <w:p>
-      <w:pPr>
-        <w:numPr>
-          <w:ilvl w:val="0"/>
-          <w:numId w:val="1024"/>
-        </w:numPr>
-        <w:pStyle w:val="Compact"/>
-      </w:pPr>
-      <w:r>
-        <w:rPr>
-          <w:bCs/>
-          <w:b/>
-        </w:rPr>
-        <w:t xml:space="preserve">Modello:</w:t>
-      </w:r>
-      <w:r>
-        <w:t xml:space="preserve"> </w:t>
-      </w:r>
-      <w:r>
-        <w:t xml:space="preserve">Qwen-72B</w:t>
-      </w:r>
-    </w:p>
-    <w:p>
-      <w:pPr>
-        <w:numPr>
-          <w:ilvl w:val="0"/>
-          <w:numId w:val="1024"/>
-        </w:numPr>
-        <w:pStyle w:val="Compact"/>
-      </w:pPr>
-      <w:r>
-        <w:rPr>
-          <w:bCs/>
-          <w:b/>
-        </w:rPr>
-        <w:t xml:space="preserve">Temperatura:</w:t>
-      </w:r>
-      <w:r>
-        <w:t xml:space="preserve"> </w:t>
-      </w:r>
-      <w:r>
-        <w:t xml:space="preserve">0.1</w:t>
-      </w:r>
-    </w:p>
-    <w:p>
-      <w:pPr>
-        <w:numPr>
-          <w:ilvl w:val="0"/>
-          <w:numId w:val="1024"/>
-        </w:numPr>
-        <w:pStyle w:val="Compact"/>
-      </w:pPr>
-      <w:r>
-        <w:rPr>
-          <w:bCs/>
-          <w:b/>
-        </w:rPr>
-        <w:t xml:space="preserve">Output:</w:t>
-      </w:r>
-      <w:r>
-        <w:t xml:space="preserve"> </w:t>
-      </w:r>
-      <w:r>
         <w:t xml:space="preserve">Istruzioni passo-passo per provider</w:t>
       </w:r>
     </w:p>
@@ -4492,7 +5646,7 @@
       <w:pPr>
         <w:numPr>
           <w:ilvl w:val="0"/>
-          <w:numId w:val="1024"/>
+          <w:numId w:val="1026"/>
         </w:numPr>
         <w:pStyle w:val="Compact"/>
       </w:pPr>
@@ -4529,7 +5683,7 @@
         <w:t xml:space="preserve">Notaio AI — Powered by GeneForge AI</w:t>
       </w:r>
       <w:r>
-        <w:br/>
+        <w:t xml:space="preserve"> </w:t>
       </w:r>
       <w:r>
         <w:rPr>
@@ -4539,7 +5693,7 @@
         <w:t xml:space="preserve">© 2026 — Tutti i diritti riservati</w:t>
       </w:r>
       <w:r>
-        <w:br/>
+        <w:t xml:space="preserve"> </w:t>
       </w:r>
       <w:r>
         <w:rPr>
@@ -4549,20 +5703,20 @@
         <w:t xml:space="preserve">Manuale redatto per i Notai e gli Studi Notarili italiani</w:t>
       </w:r>
       <w:r>
-        <w:br/>
+        <w:t xml:space="preserve"> </w:t>
       </w:r>
       <w:r>
         <w:rPr>
           <w:iCs/>
           <w:i/>
         </w:rPr>
-        <w:t xml:space="preserve">Versione 1.0 — 3 Maggio 2026</w:t>
-      </w:r>
-    </w:p>
-    <w:bookmarkEnd w:id="59"/>
-    <w:bookmarkEnd w:id="60"/>
-    <w:bookmarkEnd w:id="61"/>
-    <w:bookmarkEnd w:id="62"/>
+        <w:t xml:space="preserve">Versione 1.1 — 26 Aprile 2026</w:t>
+      </w:r>
+    </w:p>
+    <w:bookmarkEnd w:id="64"/>
+    <w:bookmarkEnd w:id="65"/>
+    <w:bookmarkEnd w:id="66"/>
+    <w:bookmarkEnd w:id="67"/>
     <w:sectPr/>
   </w:body>
 </w:document>
@@ -4936,34 +6090,7 @@
     <w:abstractNumId w:val="991"/>
   </w:num>
   <w:num w:numId="1008">
-    <w:abstractNumId w:val="99411"/>
-    <w:lvlOverride w:ilvl="0">
-      <w:startOverride w:val="1"/>
-    </w:lvlOverride>
-    <w:lvlOverride w:ilvl="1">
-      <w:startOverride w:val="1"/>
-    </w:lvlOverride>
-    <w:lvlOverride w:ilvl="2">
-      <w:startOverride w:val="1"/>
-    </w:lvlOverride>
-    <w:lvlOverride w:ilvl="3">
-      <w:startOverride w:val="1"/>
-    </w:lvlOverride>
-    <w:lvlOverride w:ilvl="4">
-      <w:startOverride w:val="1"/>
-    </w:lvlOverride>
-    <w:lvlOverride w:ilvl="5">
-      <w:startOverride w:val="1"/>
-    </w:lvlOverride>
-    <w:lvlOverride w:ilvl="6">
-      <w:startOverride w:val="1"/>
-    </w:lvlOverride>
-    <w:lvlOverride w:ilvl="7">
-      <w:startOverride w:val="1"/>
-    </w:lvlOverride>
-    <w:lvlOverride w:ilvl="8">
-      <w:startOverride w:val="1"/>
-    </w:lvlOverride>
+    <w:abstractNumId w:val="991"/>
   </w:num>
   <w:num w:numId="1009">
     <w:abstractNumId w:val="99411"/>
@@ -5026,10 +6153,64 @@
     </w:lvlOverride>
   </w:num>
   <w:num w:numId="1011">
-    <w:abstractNumId w:val="991"/>
+    <w:abstractNumId w:val="99411"/>
+    <w:lvlOverride w:ilvl="0">
+      <w:startOverride w:val="1"/>
+    </w:lvlOverride>
+    <w:lvlOverride w:ilvl="1">
+      <w:startOverride w:val="1"/>
+    </w:lvlOverride>
+    <w:lvlOverride w:ilvl="2">
+      <w:startOverride w:val="1"/>
+    </w:lvlOverride>
+    <w:lvlOverride w:ilvl="3">
+      <w:startOverride w:val="1"/>
+    </w:lvlOverride>
+    <w:lvlOverride w:ilvl="4">
+      <w:startOverride w:val="1"/>
+    </w:lvlOverride>
+    <w:lvlOverride w:ilvl="5">
+      <w:startOverride w:val="1"/>
+    </w:lvlOverride>
+    <w:lvlOverride w:ilvl="6">
+      <w:startOverride w:val="1"/>
+    </w:lvlOverride>
+    <w:lvlOverride w:ilvl="7">
+      <w:startOverride w:val="1"/>
+    </w:lvlOverride>
+    <w:lvlOverride w:ilvl="8">
+      <w:startOverride w:val="1"/>
+    </w:lvlOverride>
   </w:num>
   <w:num w:numId="1012">
-    <w:abstractNumId w:val="991"/>
+    <w:abstractNumId w:val="99411"/>
+    <w:lvlOverride w:ilvl="0">
+      <w:startOverride w:val="1"/>
+    </w:lvlOverride>
+    <w:lvlOverride w:ilvl="1">
+      <w:startOverride w:val="1"/>
+    </w:lvlOverride>
+    <w:lvlOverride w:ilvl="2">
+      <w:startOverride w:val="1"/>
+    </w:lvlOverride>
+    <w:lvlOverride w:ilvl="3">
+      <w:startOverride w:val="1"/>
+    </w:lvlOverride>
+    <w:lvlOverride w:ilvl="4">
+      <w:startOverride w:val="1"/>
+    </w:lvlOverride>
+    <w:lvlOverride w:ilvl="5">
+      <w:startOverride w:val="1"/>
+    </w:lvlOverride>
+    <w:lvlOverride w:ilvl="6">
+      <w:startOverride w:val="1"/>
+    </w:lvlOverride>
+    <w:lvlOverride w:ilvl="7">
+      <w:startOverride w:val="1"/>
+    </w:lvlOverride>
+    <w:lvlOverride w:ilvl="8">
+      <w:startOverride w:val="1"/>
+    </w:lvlOverride>
   </w:num>
   <w:num w:numId="1013">
     <w:abstractNumId w:val="99411"/>
@@ -5065,7 +6246,34 @@
     <w:abstractNumId w:val="991"/>
   </w:num>
   <w:num w:numId="1015">
-    <w:abstractNumId w:val="991"/>
+    <w:abstractNumId w:val="99411"/>
+    <w:lvlOverride w:ilvl="0">
+      <w:startOverride w:val="1"/>
+    </w:lvlOverride>
+    <w:lvlOverride w:ilvl="1">
+      <w:startOverride w:val="1"/>
+    </w:lvlOverride>
+    <w:lvlOverride w:ilvl="2">
+      <w:startOverride w:val="1"/>
+    </w:lvlOverride>
+    <w:lvlOverride w:ilvl="3">
+      <w:startOverride w:val="1"/>
+    </w:lvlOverride>
+    <w:lvlOverride w:ilvl="4">
+      <w:startOverride w:val="1"/>
+    </w:lvlOverride>
+    <w:lvlOverride w:ilvl="5">
+      <w:startOverride w:val="1"/>
+    </w:lvlOverride>
+    <w:lvlOverride w:ilvl="6">
+      <w:startOverride w:val="1"/>
+    </w:lvlOverride>
+    <w:lvlOverride w:ilvl="7">
+      <w:startOverride w:val="1"/>
+    </w:lvlOverride>
+    <w:lvlOverride w:ilvl="8">
+      <w:startOverride w:val="1"/>
+    </w:lvlOverride>
   </w:num>
   <w:num w:numId="1016">
     <w:abstractNumId w:val="991"/>
@@ -5092,6 +6300,12 @@
     <w:abstractNumId w:val="991"/>
   </w:num>
   <w:num w:numId="1024">
+    <w:abstractNumId w:val="991"/>
+  </w:num>
+  <w:num w:numId="1025">
+    <w:abstractNumId w:val="991"/>
+  </w:num>
+  <w:num w:numId="1026">
     <w:abstractNumId w:val="991"/>
   </w:num>
 </w:numbering>

</xml_diff>

<commit_message>
Aggiorna manuale Notaio AI v1.2 — Notaio Sintetico, responsive, dark mode, FAQ aggiornate
</commit_message>
<xml_diff>
--- a/NOTAIO_AI_MANUALE_IT.docx
+++ b/NOTAIO_AI_MANUALE_IT.docx
@@ -2,7 +2,7 @@
 <file path=word/document.xml><?xml version="1.0" encoding="utf-8"?>
 <w:document xmlns:w="http://schemas.openxmlformats.org/wordprocessingml/2006/main" xmlns:m="http://schemas.openxmlformats.org/officeDocument/2006/math" xmlns:r="http://schemas.openxmlformats.org/officeDocument/2006/relationships" xmlns:o="urn:schemas-microsoft-com:office:office" xmlns:v="urn:schemas-microsoft-com:vml" xmlns:w10="urn:schemas-microsoft-com:office:word" xmlns:a="http://schemas.openxmlformats.org/drawingml/2006/main" xmlns:pic="http://schemas.openxmlformats.org/drawingml/2006/picture" xmlns:wp="http://schemas.openxmlformats.org/drawingml/2006/wordprocessingDrawing">
   <w:body>
-    <w:bookmarkStart w:id="67" w:name="notaio-ai-manuale-utente"/>
+    <w:bookmarkStart w:id="71" w:name="notaio-ai-manuale-utente"/>
     <w:p>
       <w:pPr>
         <w:pStyle w:val="Heading1"/>
@@ -26,7 +26,7 @@
         <w:t xml:space="preserve"> </w:t>
       </w:r>
       <w:r>
-        <w:t xml:space="preserve">1.1</w:t>
+        <w:t xml:space="preserve">1.2</w:t>
       </w:r>
       <w:r>
         <w:t xml:space="preserve"> </w:t>
@@ -42,7 +42,7 @@
         <w:t xml:space="preserve"> </w:t>
       </w:r>
       <w:r>
-        <w:t xml:space="preserve">26 Aprile 2026</w:t>
+        <w:t xml:space="preserve">4 Maggio 2026</w:t>
       </w:r>
       <w:r>
         <w:t xml:space="preserve"> </w:t>
@@ -290,6 +290,28 @@
       </w:r>
       <w:r>
         <w:t xml:space="preserve">InfoCert, Aruba, Namirial</w:t>
+      </w:r>
+    </w:p>
+    <w:p>
+      <w:pPr>
+        <w:numPr>
+          <w:ilvl w:val="0"/>
+          <w:numId w:val="1001"/>
+        </w:numPr>
+        <w:pStyle w:val="Compact"/>
+      </w:pPr>
+      <w:r>
+        <w:rPr>
+          <w:bCs/>
+          <w:b/>
+        </w:rPr>
+        <w:t xml:space="preserve">Notaio Sintetico</w:t>
+      </w:r>
+      <w:r>
+        <w:t xml:space="preserve"> </w:t>
+      </w:r>
+      <w:r>
+        <w:t xml:space="preserve">— consulenza strategica in chat per ogni dubbio di procedura</w:t>
       </w:r>
     </w:p>
     <w:bookmarkEnd w:id="21"/>
@@ -488,6 +510,66 @@
             </w:pPr>
             <w:r>
               <w:t xml:space="preserve">PDF per la stampa, DOCX per le modifiche, MD per l’archivio</w:t>
+            </w:r>
+          </w:p>
+        </w:tc>
+      </w:tr>
+      <w:tr>
+        <w:tc>
+          <w:tcPr/>
+          <w:p>
+            <w:pPr>
+              <w:pStyle w:val="Compact"/>
+              <w:jc w:val="left"/>
+            </w:pPr>
+            <w:r>
+              <w:rPr>
+                <w:bCs/>
+                <w:b/>
+              </w:rPr>
+              <w:t xml:space="preserve">Responsive</w:t>
+            </w:r>
+          </w:p>
+        </w:tc>
+        <w:tc>
+          <w:tcPr/>
+          <w:p>
+            <w:pPr>
+              <w:pStyle w:val="Compact"/>
+              <w:jc w:val="left"/>
+            </w:pPr>
+            <w:r>
+              <w:t xml:space="preserve">Funziona su desktop, tablet e smartphone</w:t>
+            </w:r>
+          </w:p>
+        </w:tc>
+      </w:tr>
+      <w:tr>
+        <w:tc>
+          <w:tcPr/>
+          <w:p>
+            <w:pPr>
+              <w:pStyle w:val="Compact"/>
+              <w:jc w:val="left"/>
+            </w:pPr>
+            <w:r>
+              <w:rPr>
+                <w:bCs/>
+                <w:b/>
+              </w:rPr>
+              <w:t xml:space="preserve">Dark mode</w:t>
+            </w:r>
+          </w:p>
+        </w:tc>
+        <w:tc>
+          <w:tcPr/>
+          <w:p>
+            <w:pPr>
+              <w:pStyle w:val="Compact"/>
+              <w:jc w:val="left"/>
+            </w:pPr>
+            <w:r>
+              <w:t xml:space="preserve">Interfaccia scura ottimizzata per lunghe sessioni di lavoro</w:t>
             </w:r>
           </w:p>
         </w:tc>
@@ -2574,22 +2656,199 @@
     </w:p>
     <w:bookmarkEnd w:id="35"/>
     <w:bookmarkEnd w:id="36"/>
-    <w:bookmarkStart w:id="40" w:name="esempi-concreti"/>
+    <w:bookmarkStart w:id="40" w:name="notaio-sintetico-consulenza-strategica"/>
     <w:p>
       <w:pPr>
         <w:pStyle w:val="Heading2"/>
       </w:pPr>
       <w:r>
-        <w:t xml:space="preserve">6. Esempi Concreti</w:t>
-      </w:r>
-    </w:p>
-    <w:bookmarkStart w:id="37" w:name="prima-casa-under-36-compravendita"/>
+        <w:t xml:space="preserve">6. Notaio Sintetico — Consulenza Strategica</w:t>
+      </w:r>
+    </w:p>
+    <w:bookmarkStart w:id="37" w:name="cosè"/>
     <w:p>
       <w:pPr>
         <w:pStyle w:val="Heading3"/>
       </w:pPr>
       <w:r>
-        <w:t xml:space="preserve">6.1 Prima Casa Under 36 — Compravendita</w:t>
+        <w:t xml:space="preserve">Cos’è</w:t>
+      </w:r>
+    </w:p>
+    <w:p>
+      <w:pPr>
+        <w:pStyle w:val="FirstParagraph"/>
+      </w:pPr>
+      <w:r>
+        <w:t xml:space="preserve">Il</w:t>
+      </w:r>
+      <w:r>
+        <w:t xml:space="preserve"> </w:t>
+      </w:r>
+      <w:r>
+        <w:rPr>
+          <w:bCs/>
+          <w:b/>
+        </w:rPr>
+        <w:t xml:space="preserve">Notaio Sintetico</w:t>
+      </w:r>
+      <w:r>
+        <w:t xml:space="preserve"> </w:t>
+      </w:r>
+      <w:r>
+        <w:t xml:space="preserve">è un assistente AI in chat integrato nell’applicazione. Non sostituisce il Notaio, ma offre una</w:t>
+      </w:r>
+      <w:r>
+        <w:t xml:space="preserve"> </w:t>
+      </w:r>
+      <w:r>
+        <w:rPr>
+          <w:bCs/>
+          <w:b/>
+        </w:rPr>
+        <w:t xml:space="preserve">consulenza rapida</w:t>
+      </w:r>
+      <w:r>
+        <w:t xml:space="preserve"> </w:t>
+      </w:r>
+      <w:r>
+        <w:t xml:space="preserve">su:</w:t>
+      </w:r>
+      <w:r>
+        <w:t xml:space="preserve"> </w:t>
+      </w:r>
+      <w:r>
+        <w:t xml:space="preserve">- Quali documenti servono per un determinato atto</w:t>
+      </w:r>
+      <w:r>
+        <w:t xml:space="preserve"> </w:t>
+      </w:r>
+      <w:r>
+        <w:t xml:space="preserve">- Come procedere in casi particolari</w:t>
+      </w:r>
+      <w:r>
+        <w:t xml:space="preserve"> </w:t>
+      </w:r>
+      <w:r>
+        <w:t xml:space="preserve">- Quali norme si applicano</w:t>
+      </w:r>
+      <w:r>
+        <w:t xml:space="preserve"> </w:t>
+      </w:r>
+      <w:r>
+        <w:t xml:space="preserve">- Dubbi di procedura prima del rogito</w:t>
+      </w:r>
+    </w:p>
+    <w:bookmarkEnd w:id="37"/>
+    <w:bookmarkStart w:id="38" w:name="come-si-usa"/>
+    <w:p>
+      <w:pPr>
+        <w:pStyle w:val="Heading3"/>
+      </w:pPr>
+      <w:r>
+        <w:t xml:space="preserve">Come si usa</w:t>
+      </w:r>
+    </w:p>
+    <w:p>
+      <w:pPr>
+        <w:numPr>
+          <w:ilvl w:val="0"/>
+          <w:numId w:val="1011"/>
+        </w:numPr>
+        <w:pStyle w:val="Compact"/>
+      </w:pPr>
+      <w:r>
+        <w:t xml:space="preserve">Compila il form con il tipo di atto che ti interessa</w:t>
+      </w:r>
+    </w:p>
+    <w:p>
+      <w:pPr>
+        <w:numPr>
+          <w:ilvl w:val="0"/>
+          <w:numId w:val="1011"/>
+        </w:numPr>
+        <w:pStyle w:val="Compact"/>
+      </w:pPr>
+      <w:r>
+        <w:t xml:space="preserve">Clicca su</w:t>
+      </w:r>
+      <w:r>
+        <w:t xml:space="preserve"> </w:t>
+      </w:r>
+      <w:r>
+        <w:rPr>
+          <w:bCs/>
+          <w:b/>
+        </w:rPr>
+        <w:t xml:space="preserve">“</w:t>
+      </w:r>
+      <w:r>
+        <w:rPr>
+          <w:bCs/>
+          <w:b/>
+        </w:rPr>
+        <w:t xml:space="preserve">💬 Chiedi al Notaio Sintetico</w:t>
+      </w:r>
+      <w:r>
+        <w:rPr>
+          <w:bCs/>
+          <w:b/>
+        </w:rPr>
+        <w:t xml:space="preserve">”</w:t>
+      </w:r>
+      <w:r>
+        <w:t xml:space="preserve"> </w:t>
+      </w:r>
+      <w:r>
+        <w:t xml:space="preserve">(nella colonna destra, sopra il pulsante</w:t>
+      </w:r>
+      <w:r>
+        <w:t xml:space="preserve"> </w:t>
+      </w:r>
+      <w:r>
+        <w:t xml:space="preserve">“</w:t>
+      </w:r>
+      <w:r>
+        <w:t xml:space="preserve">Genera Atto</w:t>
+      </w:r>
+      <w:r>
+        <w:t xml:space="preserve">”</w:t>
+      </w:r>
+      <w:r>
+        <w:t xml:space="preserve">)</w:t>
+      </w:r>
+    </w:p>
+    <w:p>
+      <w:pPr>
+        <w:numPr>
+          <w:ilvl w:val="0"/>
+          <w:numId w:val="1011"/>
+        </w:numPr>
+        <w:pStyle w:val="Compact"/>
+      </w:pPr>
+      <w:r>
+        <w:t xml:space="preserve">Si apre una finestra a tutto schermo con la chat</w:t>
+      </w:r>
+    </w:p>
+    <w:p>
+      <w:pPr>
+        <w:numPr>
+          <w:ilvl w:val="0"/>
+          <w:numId w:val="1011"/>
+        </w:numPr>
+        <w:pStyle w:val="Compact"/>
+      </w:pPr>
+      <w:r>
+        <w:t xml:space="preserve">Scrivi la tua domanda e premi</w:t>
+      </w:r>
+      <w:r>
+        <w:t xml:space="preserve"> </w:t>
+      </w:r>
+      <w:r>
+        <w:rPr>
+          <w:bCs/>
+          <w:b/>
+        </w:rPr>
+        <w:t xml:space="preserve">Invia</w:t>
       </w:r>
     </w:p>
     <w:p>
@@ -2597,17 +2856,105 @@
         <w:pStyle w:val="BlockText"/>
       </w:pPr>
       <w:r>
-        <w:rPr>
-          <w:bCs/>
-          <w:b/>
-        </w:rPr>
-        <w:t xml:space="preserve">Caso:</w:t>
-      </w:r>
-      <w:r>
-        <w:t xml:space="preserve"> </w:t>
-      </w:r>
-      <w:r>
-        <w:t xml:space="preserve">Laura Verdi, 28 anni, ISEE €22.000, acquista la sua prima casa da Mario Rossi per €180.000.</w:t>
+        <w:t xml:space="preserve">🧘</w:t>
+      </w:r>
+      <w:r>
+        <w:t xml:space="preserve"> </w:t>
+      </w:r>
+      <w:r>
+        <w:rPr>
+          <w:bCs/>
+          <w:b/>
+        </w:rPr>
+        <w:t xml:space="preserve">Meditazione in corso…</w:t>
+      </w:r>
+      <w:r>
+        <w:t xml:space="preserve"> </w:t>
+      </w:r>
+      <w:r>
+        <w:t xml:space="preserve">Mentre Nemotron elabora la risposta, vedrai questo indicatore. La risposta arriva in 30–60 secondi.</w:t>
+      </w:r>
+    </w:p>
+    <w:bookmarkEnd w:id="38"/>
+    <w:bookmarkStart w:id="39" w:name="esempi-di-domande"/>
+    <w:p>
+      <w:pPr>
+        <w:pStyle w:val="Heading3"/>
+      </w:pPr>
+      <w:r>
+        <w:t xml:space="preserve">Esempi di domande</w:t>
+      </w:r>
+    </w:p>
+    <w:p>
+      <w:pPr>
+        <w:numPr>
+          <w:ilvl w:val="0"/>
+          <w:numId w:val="1012"/>
+        </w:numPr>
+        <w:pStyle w:val="Compact"/>
+      </w:pPr>
+      <w:r>
+        <w:t xml:space="preserve">“</w:t>
+      </w:r>
+      <w:r>
+        <w:t xml:space="preserve">Quali documenti servono per una procura in caso di compravendita?</w:t>
+      </w:r>
+      <w:r>
+        <w:t xml:space="preserve">”</w:t>
+      </w:r>
+    </w:p>
+    <w:p>
+      <w:pPr>
+        <w:numPr>
+          <w:ilvl w:val="0"/>
+          <w:numId w:val="1012"/>
+        </w:numPr>
+        <w:pStyle w:val="Compact"/>
+      </w:pPr>
+      <w:r>
+        <w:t xml:space="preserve">“</w:t>
+      </w:r>
+      <w:r>
+        <w:t xml:space="preserve">L’acquirente under 36 ha diritto all’imposta di bollo agevolata?</w:t>
+      </w:r>
+      <w:r>
+        <w:t xml:space="preserve">”</w:t>
+      </w:r>
+    </w:p>
+    <w:p>
+      <w:pPr>
+        <w:numPr>
+          <w:ilvl w:val="0"/>
+          <w:numId w:val="1012"/>
+        </w:numPr>
+        <w:pStyle w:val="Compact"/>
+      </w:pPr>
+      <w:r>
+        <w:t xml:space="preserve">“</w:t>
+      </w:r>
+      <w:r>
+        <w:t xml:space="preserve">Quanto tempo ho per registrare l’atto di costituzione SRL?</w:t>
+      </w:r>
+      <w:r>
+        <w:t xml:space="preserve">”</w:t>
+      </w:r>
+    </w:p>
+    <w:p>
+      <w:pPr>
+        <w:numPr>
+          <w:ilvl w:val="0"/>
+          <w:numId w:val="1012"/>
+        </w:numPr>
+        <w:pStyle w:val="Compact"/>
+      </w:pPr>
+      <w:r>
+        <w:t xml:space="preserve">“</w:t>
+      </w:r>
+      <w:r>
+        <w:t xml:space="preserve">Serve l’assenso del coniuge per la donazione di un immobile?</w:t>
+      </w:r>
+      <w:r>
+        <w:t xml:space="preserve">”</w:t>
       </w:r>
     </w:p>
     <w:p>
@@ -2615,391 +2962,23 @@
         <w:pStyle w:val="BlockText"/>
       </w:pPr>
       <w:r>
-        <w:rPr>
-          <w:bCs/>
-          <w:b/>
-        </w:rPr>
-        <w:t xml:space="preserve">Agevolazione:</w:t>
-      </w:r>
-      <w:r>
-        <w:t xml:space="preserve"> </w:t>
-      </w:r>
-      <w:r>
-        <w:t xml:space="preserve">art. 1 commi 67-71 L. 234/2021 (prima casa under 36)</w:t>
-      </w:r>
-    </w:p>
-    <w:p>
-      <w:pPr>
-        <w:numPr>
-          <w:ilvl w:val="0"/>
-          <w:numId w:val="1011"/>
-        </w:numPr>
-        <w:pStyle w:val="Compact"/>
-      </w:pPr>
-      <w:r>
-        <w:t xml:space="preserve">Seleziona</w:t>
-      </w:r>
-      <w:r>
-        <w:t xml:space="preserve"> </w:t>
-      </w:r>
-      <w:r>
-        <w:rPr>
-          <w:bCs/>
-          <w:b/>
-        </w:rPr>
-        <w:t xml:space="preserve">“</w:t>
-      </w:r>
-      <w:r>
-        <w:rPr>
-          <w:bCs/>
-          <w:b/>
-        </w:rPr>
-        <w:t xml:space="preserve">Compravendita immobiliare</w:t>
-      </w:r>
-      <w:r>
-        <w:rPr>
-          <w:bCs/>
-          <w:b/>
-        </w:rPr>
-        <w:t xml:space="preserve">”</w:t>
-      </w:r>
-    </w:p>
-    <w:p>
-      <w:pPr>
-        <w:numPr>
-          <w:ilvl w:val="0"/>
-          <w:numId w:val="1011"/>
-        </w:numPr>
-        <w:pStyle w:val="Compact"/>
-      </w:pPr>
-      <w:r>
-        <w:t xml:space="preserve">Inserisci i dati nel form</w:t>
-      </w:r>
-    </w:p>
-    <w:p>
-      <w:pPr>
-        <w:numPr>
-          <w:ilvl w:val="0"/>
-          <w:numId w:val="1011"/>
-        </w:numPr>
-        <w:pStyle w:val="Compact"/>
-      </w:pPr>
-      <w:r>
-        <w:t xml:space="preserve">Clicca</w:t>
-      </w:r>
-      <w:r>
-        <w:t xml:space="preserve"> </w:t>
-      </w:r>
-      <w:r>
-        <w:rPr>
-          <w:bCs/>
-          <w:b/>
-        </w:rPr>
-        <w:t xml:space="preserve">“</w:t>
-      </w:r>
-      <w:r>
-        <w:rPr>
-          <w:bCs/>
-          <w:b/>
-        </w:rPr>
-        <w:t xml:space="preserve">Genera Atto</w:t>
-      </w:r>
-      <w:r>
-        <w:rPr>
-          <w:bCs/>
-          <w:b/>
-        </w:rPr>
-        <w:t xml:space="preserve">”</w:t>
-      </w:r>
-    </w:p>
-    <w:p>
-      <w:pPr>
-        <w:numPr>
-          <w:ilvl w:val="0"/>
-          <w:numId w:val="1011"/>
-        </w:numPr>
-        <w:pStyle w:val="Compact"/>
-      </w:pPr>
-      <w:r>
-        <w:t xml:space="preserve">Il sistema genera 5 sezioni: Catasto, Conformità, Atto, Controllo, Scadenze</w:t>
-      </w:r>
-    </w:p>
-    <w:p>
-      <w:pPr>
-        <w:numPr>
-          <w:ilvl w:val="0"/>
-          <w:numId w:val="1011"/>
-        </w:numPr>
-        <w:pStyle w:val="Compact"/>
-      </w:pPr>
-      <w:r>
-        <w:t xml:space="preserve">Rivedi il documento e scarica in PDF/DOCX</w:t>
-      </w:r>
-    </w:p>
-    <w:bookmarkEnd w:id="37"/>
-    <w:bookmarkStart w:id="38" w:name="costituzione-srl"/>
-    <w:p>
-      <w:pPr>
-        <w:pStyle w:val="Heading3"/>
-      </w:pPr>
-      <w:r>
-        <w:t xml:space="preserve">6.2 Costituzione SRL</w:t>
-      </w:r>
-    </w:p>
-    <w:p>
-      <w:pPr>
-        <w:pStyle w:val="BlockText"/>
-      </w:pPr>
-      <w:r>
-        <w:rPr>
-          <w:bCs/>
-          <w:b/>
-        </w:rPr>
-        <w:t xml:space="preserve">Caso:</w:t>
-      </w:r>
-      <w:r>
-        <w:t xml:space="preserve"> </w:t>
-      </w:r>
-      <w:r>
-        <w:t xml:space="preserve">Marco Rossi (60%) e Paolo Bianchi (40%) costituiscono la</w:t>
-      </w:r>
-      <w:r>
-        <w:t xml:space="preserve"> </w:t>
-      </w:r>
-      <w:r>
-        <w:t xml:space="preserve">“</w:t>
-      </w:r>
-      <w:r>
-        <w:t xml:space="preserve">Rossi &amp; Bianchi SRL</w:t>
-      </w:r>
-      <w:r>
-        <w:t xml:space="preserve">”</w:t>
-      </w:r>
-      <w:r>
-        <w:t xml:space="preserve"> </w:t>
-      </w:r>
-      <w:r>
-        <w:t xml:space="preserve">con capitale €10.000.</w:t>
-      </w:r>
-    </w:p>
-    <w:p>
-      <w:pPr>
-        <w:numPr>
-          <w:ilvl w:val="0"/>
-          <w:numId w:val="1012"/>
-        </w:numPr>
-        <w:pStyle w:val="Compact"/>
-      </w:pPr>
-      <w:r>
-        <w:t xml:space="preserve">Seleziona</w:t>
-      </w:r>
-      <w:r>
-        <w:t xml:space="preserve"> </w:t>
-      </w:r>
-      <w:r>
-        <w:rPr>
-          <w:bCs/>
-          <w:b/>
-        </w:rPr>
-        <w:t xml:space="preserve">“</w:t>
-      </w:r>
-      <w:r>
-        <w:rPr>
-          <w:bCs/>
-          <w:b/>
-        </w:rPr>
-        <w:t xml:space="preserve">Costituzione SRL</w:t>
-      </w:r>
-      <w:r>
-        <w:rPr>
-          <w:bCs/>
-          <w:b/>
-        </w:rPr>
-        <w:t xml:space="preserve">”</w:t>
-      </w:r>
-    </w:p>
-    <w:p>
-      <w:pPr>
-        <w:numPr>
-          <w:ilvl w:val="0"/>
-          <w:numId w:val="1012"/>
-        </w:numPr>
-        <w:pStyle w:val="Compact"/>
-      </w:pPr>
-      <w:r>
-        <w:t xml:space="preserve">Compila: Soci, Denominazione, Sede, Oggetto, Capitale, Amministratore, Statuto</w:t>
-      </w:r>
-    </w:p>
-    <w:p>
-      <w:pPr>
-        <w:numPr>
-          <w:ilvl w:val="0"/>
-          <w:numId w:val="1012"/>
-        </w:numPr>
-        <w:pStyle w:val="Compact"/>
-      </w:pPr>
-      <w:r>
-        <w:t xml:space="preserve">Clicca</w:t>
-      </w:r>
-      <w:r>
-        <w:t xml:space="preserve"> </w:t>
-      </w:r>
-      <w:r>
-        <w:rPr>
-          <w:bCs/>
-          <w:b/>
-        </w:rPr>
-        <w:t xml:space="preserve">“</w:t>
-      </w:r>
-      <w:r>
-        <w:rPr>
-          <w:bCs/>
-          <w:b/>
-        </w:rPr>
-        <w:t xml:space="preserve">Genera Atto</w:t>
-      </w:r>
-      <w:r>
-        <w:rPr>
-          <w:bCs/>
-          <w:b/>
-        </w:rPr>
-        <w:t xml:space="preserve">”</w:t>
-      </w:r>
-    </w:p>
-    <w:p>
-      <w:pPr>
-        <w:numPr>
-          <w:ilvl w:val="0"/>
-          <w:numId w:val="1012"/>
-        </w:numPr>
-        <w:pStyle w:val="Compact"/>
-      </w:pPr>
-      <w:r>
-        <w:t xml:space="preserve">Il sistema genera 3 sezioni: Atto di Costituzione SRL, Controllo Documenti, Scadenze (iscrizione REA, PEC, ecc.)</w:t>
-      </w:r>
-    </w:p>
-    <w:bookmarkEnd w:id="38"/>
-    <w:bookmarkStart w:id="39" w:name="testamento-olografo-pubblico"/>
-    <w:p>
-      <w:pPr>
-        <w:pStyle w:val="Heading3"/>
-      </w:pPr>
-      <w:r>
-        <w:t xml:space="preserve">6.3 Testamento Olografo Pubblico</w:t>
-      </w:r>
-    </w:p>
-    <w:p>
-      <w:pPr>
-        <w:pStyle w:val="BlockText"/>
-      </w:pPr>
-      <w:r>
-        <w:rPr>
-          <w:bCs/>
-          <w:b/>
-        </w:rPr>
-        <w:t xml:space="preserve">Caso:</w:t>
-      </w:r>
-      <w:r>
-        <w:t xml:space="preserve"> </w:t>
-      </w:r>
-      <w:r>
-        <w:t xml:space="preserve">Carlo Verdi, 70 anni, vuole lasciare i beni ai figli Marco e Anna in parti uguali.</w:t>
-      </w:r>
-    </w:p>
-    <w:p>
-      <w:pPr>
-        <w:numPr>
-          <w:ilvl w:val="0"/>
-          <w:numId w:val="1013"/>
-        </w:numPr>
-        <w:pStyle w:val="Compact"/>
-      </w:pPr>
-      <w:r>
-        <w:t xml:space="preserve">Seleziona</w:t>
-      </w:r>
-      <w:r>
-        <w:t xml:space="preserve"> </w:t>
-      </w:r>
-      <w:r>
-        <w:rPr>
-          <w:bCs/>
-          <w:b/>
-        </w:rPr>
-        <w:t xml:space="preserve">“</w:t>
-      </w:r>
-      <w:r>
-        <w:rPr>
-          <w:bCs/>
-          <w:b/>
-        </w:rPr>
-        <w:t xml:space="preserve">Testamento</w:t>
-      </w:r>
-      <w:r>
-        <w:rPr>
-          <w:bCs/>
-          <w:b/>
-        </w:rPr>
-        <w:t xml:space="preserve">”</w:t>
-      </w:r>
-    </w:p>
-    <w:p>
-      <w:pPr>
-        <w:numPr>
-          <w:ilvl w:val="0"/>
-          <w:numId w:val="1013"/>
-        </w:numPr>
-        <w:pStyle w:val="Compact"/>
-      </w:pPr>
-      <w:r>
-        <w:t xml:space="preserve">Compila: Testatore, Eredi, Legati, Esecutore, Disposizioni</w:t>
-      </w:r>
-    </w:p>
-    <w:p>
-      <w:pPr>
-        <w:numPr>
-          <w:ilvl w:val="0"/>
-          <w:numId w:val="1013"/>
-        </w:numPr>
-        <w:pStyle w:val="Compact"/>
-      </w:pPr>
-      <w:r>
-        <w:t xml:space="preserve">Clicca</w:t>
-      </w:r>
-      <w:r>
-        <w:t xml:space="preserve"> </w:t>
-      </w:r>
-      <w:r>
-        <w:rPr>
-          <w:bCs/>
-          <w:b/>
-        </w:rPr>
-        <w:t xml:space="preserve">“</w:t>
-      </w:r>
-      <w:r>
-        <w:rPr>
-          <w:bCs/>
-          <w:b/>
-        </w:rPr>
-        <w:t xml:space="preserve">Genera Atto</w:t>
-      </w:r>
-      <w:r>
-        <w:rPr>
-          <w:bCs/>
-          <w:b/>
-        </w:rPr>
-        <w:t xml:space="preserve">”</w:t>
-      </w:r>
-    </w:p>
-    <w:p>
-      <w:pPr>
-        <w:numPr>
-          <w:ilvl w:val="0"/>
-          <w:numId w:val="1013"/>
-        </w:numPr>
-        <w:pStyle w:val="Compact"/>
-      </w:pPr>
-      <w:r>
-        <w:t xml:space="preserve">Il sistema genera il corpo giuridico del testamento con normativa artt. 587-602 c.c.</w:t>
+        <w:t xml:space="preserve">⚠️</w:t>
+      </w:r>
+      <w:r>
+        <w:t xml:space="preserve"> </w:t>
+      </w:r>
+      <w:r>
+        <w:rPr>
+          <w:bCs/>
+          <w:b/>
+        </w:rPr>
+        <w:t xml:space="preserve">Attenzione:</w:t>
+      </w:r>
+      <w:r>
+        <w:t xml:space="preserve"> </w:t>
+      </w:r>
+      <w:r>
+        <w:t xml:space="preserve">Il Notaio Sintetico fornisce indicazioni di massima. Per decisioni definitive, consulta sempre la normativa vigente e la giurisprudenza aggiornata.</w:t>
       </w:r>
     </w:p>
     <w:p>
@@ -3011,30 +2990,212 @@
     </w:p>
     <w:bookmarkEnd w:id="39"/>
     <w:bookmarkEnd w:id="40"/>
-    <w:bookmarkStart w:id="43" w:name="verifica-e-controllo-qualità"/>
+    <w:bookmarkStart w:id="44" w:name="esempi-concreti"/>
     <w:p>
       <w:pPr>
         <w:pStyle w:val="Heading2"/>
       </w:pPr>
       <w:r>
-        <w:t xml:space="preserve">7. Verifica e Controllo Qualità</w:t>
-      </w:r>
-    </w:p>
-    <w:bookmarkStart w:id="41" w:name="placeholder-e-dati-da-verificare"/>
+        <w:t xml:space="preserve">7. Esempi Concreti</w:t>
+      </w:r>
+    </w:p>
+    <w:bookmarkStart w:id="41" w:name="prima-casa-under-36-compravendita"/>
     <w:p>
       <w:pPr>
         <w:pStyle w:val="Heading3"/>
       </w:pPr>
       <w:r>
-        <w:t xml:space="preserve">Placeholder e dati da verificare</w:t>
-      </w:r>
-    </w:p>
-    <w:p>
-      <w:pPr>
-        <w:pStyle w:val="FirstParagraph"/>
-      </w:pPr>
-      <w:r>
-        <w:t xml:space="preserve">Quando l’AI non ha accesso a una banca dati esterna, inserisce indicazioni di verifica:</w:t>
+        <w:t xml:space="preserve">7.1 Prima Casa Under 36 — Compravendita</w:t>
+      </w:r>
+    </w:p>
+    <w:p>
+      <w:pPr>
+        <w:pStyle w:val="BlockText"/>
+      </w:pPr>
+      <w:r>
+        <w:rPr>
+          <w:bCs/>
+          <w:b/>
+        </w:rPr>
+        <w:t xml:space="preserve">Caso:</w:t>
+      </w:r>
+      <w:r>
+        <w:t xml:space="preserve"> </w:t>
+      </w:r>
+      <w:r>
+        <w:t xml:space="preserve">Laura Verdi, 28 anni, ISEE €22.000, acquista la sua prima casa da Mario Rossi per €180.000.</w:t>
+      </w:r>
+    </w:p>
+    <w:p>
+      <w:pPr>
+        <w:pStyle w:val="BlockText"/>
+      </w:pPr>
+      <w:r>
+        <w:rPr>
+          <w:bCs/>
+          <w:b/>
+        </w:rPr>
+        <w:t xml:space="preserve">Agevolazione:</w:t>
+      </w:r>
+      <w:r>
+        <w:t xml:space="preserve"> </w:t>
+      </w:r>
+      <w:r>
+        <w:t xml:space="preserve">art. 1 commi 67-71 L. 234/2021 (prima casa under 36)</w:t>
+      </w:r>
+    </w:p>
+    <w:p>
+      <w:pPr>
+        <w:numPr>
+          <w:ilvl w:val="0"/>
+          <w:numId w:val="1013"/>
+        </w:numPr>
+        <w:pStyle w:val="Compact"/>
+      </w:pPr>
+      <w:r>
+        <w:t xml:space="preserve">Seleziona</w:t>
+      </w:r>
+      <w:r>
+        <w:t xml:space="preserve"> </w:t>
+      </w:r>
+      <w:r>
+        <w:rPr>
+          <w:bCs/>
+          <w:b/>
+        </w:rPr>
+        <w:t xml:space="preserve">“</w:t>
+      </w:r>
+      <w:r>
+        <w:rPr>
+          <w:bCs/>
+          <w:b/>
+        </w:rPr>
+        <w:t xml:space="preserve">Compravendita immobiliare</w:t>
+      </w:r>
+      <w:r>
+        <w:rPr>
+          <w:bCs/>
+          <w:b/>
+        </w:rPr>
+        <w:t xml:space="preserve">”</w:t>
+      </w:r>
+    </w:p>
+    <w:p>
+      <w:pPr>
+        <w:numPr>
+          <w:ilvl w:val="0"/>
+          <w:numId w:val="1013"/>
+        </w:numPr>
+        <w:pStyle w:val="Compact"/>
+      </w:pPr>
+      <w:r>
+        <w:t xml:space="preserve">Inserisci i dati nel form</w:t>
+      </w:r>
+    </w:p>
+    <w:p>
+      <w:pPr>
+        <w:numPr>
+          <w:ilvl w:val="0"/>
+          <w:numId w:val="1013"/>
+        </w:numPr>
+        <w:pStyle w:val="Compact"/>
+      </w:pPr>
+      <w:r>
+        <w:t xml:space="preserve">Clicca</w:t>
+      </w:r>
+      <w:r>
+        <w:t xml:space="preserve"> </w:t>
+      </w:r>
+      <w:r>
+        <w:rPr>
+          <w:bCs/>
+          <w:b/>
+        </w:rPr>
+        <w:t xml:space="preserve">“</w:t>
+      </w:r>
+      <w:r>
+        <w:rPr>
+          <w:bCs/>
+          <w:b/>
+        </w:rPr>
+        <w:t xml:space="preserve">Genera Atto</w:t>
+      </w:r>
+      <w:r>
+        <w:rPr>
+          <w:bCs/>
+          <w:b/>
+        </w:rPr>
+        <w:t xml:space="preserve">”</w:t>
+      </w:r>
+    </w:p>
+    <w:p>
+      <w:pPr>
+        <w:numPr>
+          <w:ilvl w:val="0"/>
+          <w:numId w:val="1013"/>
+        </w:numPr>
+        <w:pStyle w:val="Compact"/>
+      </w:pPr>
+      <w:r>
+        <w:t xml:space="preserve">Il sistema genera 5 sezioni: Catasto, Conformità, Atto, Controllo, Scadenze</w:t>
+      </w:r>
+    </w:p>
+    <w:p>
+      <w:pPr>
+        <w:numPr>
+          <w:ilvl w:val="0"/>
+          <w:numId w:val="1013"/>
+        </w:numPr>
+        <w:pStyle w:val="Compact"/>
+      </w:pPr>
+      <w:r>
+        <w:t xml:space="preserve">Rivedi il documento e scarica in PDF/DOCX</w:t>
+      </w:r>
+    </w:p>
+    <w:bookmarkEnd w:id="41"/>
+    <w:bookmarkStart w:id="42" w:name="costituzione-srl"/>
+    <w:p>
+      <w:pPr>
+        <w:pStyle w:val="Heading3"/>
+      </w:pPr>
+      <w:r>
+        <w:t xml:space="preserve">7.2 Costituzione SRL</w:t>
+      </w:r>
+    </w:p>
+    <w:p>
+      <w:pPr>
+        <w:pStyle w:val="BlockText"/>
+      </w:pPr>
+      <w:r>
+        <w:rPr>
+          <w:bCs/>
+          <w:b/>
+        </w:rPr>
+        <w:t xml:space="preserve">Caso:</w:t>
+      </w:r>
+      <w:r>
+        <w:t xml:space="preserve"> </w:t>
+      </w:r>
+      <w:r>
+        <w:t xml:space="preserve">Marco Rossi (60%) e Paolo Bianchi (40%) costituiscono la</w:t>
+      </w:r>
+      <w:r>
+        <w:t xml:space="preserve"> </w:t>
+      </w:r>
+      <w:r>
+        <w:t xml:space="preserve">“</w:t>
+      </w:r>
+      <w:r>
+        <w:t xml:space="preserve">Rossi &amp; Bianchi SRL</w:t>
+      </w:r>
+      <w:r>
+        <w:t xml:space="preserve">”</w:t>
+      </w:r>
+      <w:r>
+        <w:t xml:space="preserve"> </w:t>
+      </w:r>
+      <w:r>
+        <w:t xml:space="preserve">con capitale €10.000.</w:t>
       </w:r>
     </w:p>
     <w:p>
@@ -3046,14 +3207,31 @@
         <w:pStyle w:val="Compact"/>
       </w:pPr>
       <w:r>
-        <w:rPr>
-          <w:bCs/>
-          <w:b/>
-        </w:rPr>
-        <w:t xml:space="preserve">Visura catastale</w:t>
-      </w:r>
-      <w:r>
-        <w:t xml:space="preserve">: richiede verifica su Agenzia Entrate</w:t>
+        <w:t xml:space="preserve">Seleziona</w:t>
+      </w:r>
+      <w:r>
+        <w:t xml:space="preserve"> </w:t>
+      </w:r>
+      <w:r>
+        <w:rPr>
+          <w:bCs/>
+          <w:b/>
+        </w:rPr>
+        <w:t xml:space="preserve">“</w:t>
+      </w:r>
+      <w:r>
+        <w:rPr>
+          <w:bCs/>
+          <w:b/>
+        </w:rPr>
+        <w:t xml:space="preserve">Costituzione SRL</w:t>
+      </w:r>
+      <w:r>
+        <w:rPr>
+          <w:bCs/>
+          <w:b/>
+        </w:rPr>
+        <w:t xml:space="preserve">”</w:t>
       </w:r>
     </w:p>
     <w:p>
@@ -3065,14 +3243,7 @@
         <w:pStyle w:val="Compact"/>
       </w:pPr>
       <w:r>
-        <w:rPr>
-          <w:bCs/>
-          <w:b/>
-        </w:rPr>
-        <w:t xml:space="preserve">APE</w:t>
-      </w:r>
-      <w:r>
-        <w:t xml:space="preserve">: richiede commissione se mancante</w:t>
+        <w:t xml:space="preserve">Compila: Soci, Denominazione, Sede, Oggetto, Capitale, Amministratore, Statuto</w:t>
       </w:r>
     </w:p>
     <w:p>
@@ -3084,14 +3255,53 @@
         <w:pStyle w:val="Compact"/>
       </w:pPr>
       <w:r>
-        <w:rPr>
-          <w:bCs/>
-          <w:b/>
-        </w:rPr>
-        <w:t xml:space="preserve">Ipoteche</w:t>
-      </w:r>
-      <w:r>
-        <w:t xml:space="preserve">: richiede visura ipotecaria in Conservatoria</w:t>
+        <w:t xml:space="preserve">Clicca</w:t>
+      </w:r>
+      <w:r>
+        <w:t xml:space="preserve"> </w:t>
+      </w:r>
+      <w:r>
+        <w:rPr>
+          <w:bCs/>
+          <w:b/>
+        </w:rPr>
+        <w:t xml:space="preserve">“</w:t>
+      </w:r>
+      <w:r>
+        <w:rPr>
+          <w:bCs/>
+          <w:b/>
+        </w:rPr>
+        <w:t xml:space="preserve">Genera Atto</w:t>
+      </w:r>
+      <w:r>
+        <w:rPr>
+          <w:bCs/>
+          <w:b/>
+        </w:rPr>
+        <w:t xml:space="preserve">”</w:t>
+      </w:r>
+    </w:p>
+    <w:p>
+      <w:pPr>
+        <w:numPr>
+          <w:ilvl w:val="0"/>
+          <w:numId w:val="1014"/>
+        </w:numPr>
+        <w:pStyle w:val="Compact"/>
+      </w:pPr>
+      <w:r>
+        <w:t xml:space="preserve">Il sistema genera 3 sezioni: Atto di Costituzione SRL, Controllo Documenti, Scadenze (iscrizione REA, PEC, ecc.)</w:t>
+      </w:r>
+    </w:p>
+    <w:bookmarkEnd w:id="42"/>
+    <w:bookmarkStart w:id="43" w:name="testamento-olografo-pubblico"/>
+    <w:p>
+      <w:pPr>
+        <w:pStyle w:val="Heading3"/>
+      </w:pPr>
+      <w:r>
+        <w:t xml:space="preserve">7.3 Testamento Olografo Pubblico</w:t>
       </w:r>
     </w:p>
     <w:p>
@@ -3099,49 +3309,54 @@
         <w:pStyle w:val="BlockText"/>
       </w:pPr>
       <w:r>
-        <w:t xml:space="preserve">⚠️</w:t>
-      </w:r>
-      <w:r>
-        <w:t xml:space="preserve"> </w:t>
-      </w:r>
-      <w:r>
-        <w:rPr>
-          <w:bCs/>
-          <w:b/>
-        </w:rPr>
-        <w:t xml:space="preserve">L’AI non inventa mai dati catastali, numeri di sentenza o norme.</w:t>
-      </w:r>
-      <w:r>
-        <w:t xml:space="preserve"> </w:t>
-      </w:r>
-      <w:r>
-        <w:t xml:space="preserve">Se non è certa, indica</w:t>
-      </w:r>
-      <w:r>
-        <w:t xml:space="preserve"> </w:t>
-      </w:r>
-      <w:r>
+        <w:rPr>
+          <w:bCs/>
+          <w:b/>
+        </w:rPr>
+        <w:t xml:space="preserve">Caso:</w:t>
+      </w:r>
+      <w:r>
+        <w:t xml:space="preserve"> </w:t>
+      </w:r>
+      <w:r>
+        <w:t xml:space="preserve">Carlo Verdi, 70 anni, vuole lasciare i beni ai figli Marco e Anna in parti uguali.</w:t>
+      </w:r>
+    </w:p>
+    <w:p>
+      <w:pPr>
+        <w:numPr>
+          <w:ilvl w:val="0"/>
+          <w:numId w:val="1015"/>
+        </w:numPr>
+        <w:pStyle w:val="Compact"/>
+      </w:pPr>
+      <w:r>
+        <w:t xml:space="preserve">Seleziona</w:t>
+      </w:r>
+      <w:r>
+        <w:t xml:space="preserve"> </w:t>
+      </w:r>
+      <w:r>
+        <w:rPr>
+          <w:bCs/>
+          <w:b/>
+        </w:rPr>
         <w:t xml:space="preserve">“</w:t>
       </w:r>
       <w:r>
-        <w:t xml:space="preserve">da verificare</w:t>
-      </w:r>
-      <w:r>
+        <w:rPr>
+          <w:bCs/>
+          <w:b/>
+        </w:rPr>
+        <w:t xml:space="preserve">Testamento</w:t>
+      </w:r>
+      <w:r>
+        <w:rPr>
+          <w:bCs/>
+          <w:b/>
+        </w:rPr>
         <w:t xml:space="preserve">”</w:t>
       </w:r>
-      <w:r>
-        <w:t xml:space="preserve">.</w:t>
-      </w:r>
-    </w:p>
-    <w:bookmarkEnd w:id="41"/>
-    <w:bookmarkStart w:id="42" w:name="regole-di-sicurezza"/>
-    <w:p>
-      <w:pPr>
-        <w:pStyle w:val="Heading3"/>
-      </w:pPr>
-      <w:r>
-        <w:t xml:space="preserve">Regole di sicurezza</w:t>
-      </w:r>
     </w:p>
     <w:p>
       <w:pPr>
@@ -3152,11 +3367,7 @@
         <w:pStyle w:val="Compact"/>
       </w:pPr>
       <w:r>
-        <w:rPr>
-          <w:bCs/>
-          <w:b/>
-        </w:rPr>
-        <w:t xml:space="preserve">Non firmare mai un atto senza revisione umana</w:t>
+        <w:t xml:space="preserve">Compila: Testatore, Eredi, Legati, Esecutore, Disposizioni</w:t>
       </w:r>
     </w:p>
     <w:p>
@@ -3168,17 +3379,31 @@
         <w:pStyle w:val="Compact"/>
       </w:pPr>
       <w:r>
-        <w:rPr>
-          <w:bCs/>
-          <w:b/>
-        </w:rPr>
-        <w:t xml:space="preserve">Verificare sempre le citazioni giurisprudenziali</w:t>
-      </w:r>
-      <w:r>
-        <w:t xml:space="preserve"> </w:t>
-      </w:r>
-      <w:r>
-        <w:t xml:space="preserve">su database ufficiali</w:t>
+        <w:t xml:space="preserve">Clicca</w:t>
+      </w:r>
+      <w:r>
+        <w:t xml:space="preserve"> </w:t>
+      </w:r>
+      <w:r>
+        <w:rPr>
+          <w:bCs/>
+          <w:b/>
+        </w:rPr>
+        <w:t xml:space="preserve">“</w:t>
+      </w:r>
+      <w:r>
+        <w:rPr>
+          <w:bCs/>
+          <w:b/>
+        </w:rPr>
+        <w:t xml:space="preserve">Genera Atto</w:t>
+      </w:r>
+      <w:r>
+        <w:rPr>
+          <w:bCs/>
+          <w:b/>
+        </w:rPr>
+        <w:t xml:space="preserve">”</w:t>
       </w:r>
     </w:p>
     <w:p>
@@ -3190,39 +3415,7 @@
         <w:pStyle w:val="Compact"/>
       </w:pPr>
       <w:r>
-        <w:rPr>
-          <w:bCs/>
-          <w:b/>
-        </w:rPr>
-        <w:t xml:space="preserve">Controllare i calcoli fiscali</w:t>
-      </w:r>
-      <w:r>
-        <w:t xml:space="preserve"> </w:t>
-      </w:r>
-      <w:r>
-        <w:t xml:space="preserve">con il proprio software contabile</w:t>
-      </w:r>
-    </w:p>
-    <w:p>
-      <w:pPr>
-        <w:numPr>
-          <w:ilvl w:val="0"/>
-          <w:numId w:val="1015"/>
-        </w:numPr>
-        <w:pStyle w:val="Compact"/>
-      </w:pPr>
-      <w:r>
-        <w:rPr>
-          <w:bCs/>
-          <w:b/>
-        </w:rPr>
-        <w:t xml:space="preserve">Validare le date delle scadenze</w:t>
-      </w:r>
-      <w:r>
-        <w:t xml:space="preserve"> </w:t>
-      </w:r>
-      <w:r>
-        <w:t xml:space="preserve">con il calendario notarile</w:t>
+        <w:t xml:space="preserve">Il sistema genera il corpo giuridico del testamento con normativa artt. 587-602 c.c.</w:t>
       </w:r>
     </w:p>
     <w:p>
@@ -3232,18 +3425,241 @@
         </w:pict>
       </w:r>
     </w:p>
-    <w:bookmarkEnd w:id="42"/>
     <w:bookmarkEnd w:id="43"/>
-    <w:bookmarkStart w:id="46" w:name="faq-e-troubleshooting"/>
+    <w:bookmarkEnd w:id="44"/>
+    <w:bookmarkStart w:id="47" w:name="verifica-e-controllo-qualità"/>
     <w:p>
       <w:pPr>
         <w:pStyle w:val="Heading2"/>
       </w:pPr>
       <w:r>
-        <w:t xml:space="preserve">8. FAQ e Troubleshooting</w:t>
-      </w:r>
-    </w:p>
-    <w:bookmarkStart w:id="44" w:name="domande-frequenti"/>
+        <w:t xml:space="preserve">8. Verifica e Controllo Qualità</w:t>
+      </w:r>
+    </w:p>
+    <w:bookmarkStart w:id="45" w:name="placeholder-e-dati-da-verificare"/>
+    <w:p>
+      <w:pPr>
+        <w:pStyle w:val="Heading3"/>
+      </w:pPr>
+      <w:r>
+        <w:t xml:space="preserve">Placeholder e dati da verificare</w:t>
+      </w:r>
+    </w:p>
+    <w:p>
+      <w:pPr>
+        <w:pStyle w:val="FirstParagraph"/>
+      </w:pPr>
+      <w:r>
+        <w:t xml:space="preserve">Quando l’AI non ha accesso a una banca dati esterna, inserisce indicazioni di verifica:</w:t>
+      </w:r>
+    </w:p>
+    <w:p>
+      <w:pPr>
+        <w:numPr>
+          <w:ilvl w:val="0"/>
+          <w:numId w:val="1016"/>
+        </w:numPr>
+        <w:pStyle w:val="Compact"/>
+      </w:pPr>
+      <w:r>
+        <w:rPr>
+          <w:bCs/>
+          <w:b/>
+        </w:rPr>
+        <w:t xml:space="preserve">Visura catastale</w:t>
+      </w:r>
+      <w:r>
+        <w:t xml:space="preserve">: richiede verifica su Agenzia Entrate</w:t>
+      </w:r>
+    </w:p>
+    <w:p>
+      <w:pPr>
+        <w:numPr>
+          <w:ilvl w:val="0"/>
+          <w:numId w:val="1016"/>
+        </w:numPr>
+        <w:pStyle w:val="Compact"/>
+      </w:pPr>
+      <w:r>
+        <w:rPr>
+          <w:bCs/>
+          <w:b/>
+        </w:rPr>
+        <w:t xml:space="preserve">APE</w:t>
+      </w:r>
+      <w:r>
+        <w:t xml:space="preserve">: richiede commissione se mancante</w:t>
+      </w:r>
+    </w:p>
+    <w:p>
+      <w:pPr>
+        <w:numPr>
+          <w:ilvl w:val="0"/>
+          <w:numId w:val="1016"/>
+        </w:numPr>
+        <w:pStyle w:val="Compact"/>
+      </w:pPr>
+      <w:r>
+        <w:rPr>
+          <w:bCs/>
+          <w:b/>
+        </w:rPr>
+        <w:t xml:space="preserve">Ipoteche</w:t>
+      </w:r>
+      <w:r>
+        <w:t xml:space="preserve">: richiede visura ipotecaria in Conservatoria</w:t>
+      </w:r>
+    </w:p>
+    <w:p>
+      <w:pPr>
+        <w:pStyle w:val="BlockText"/>
+      </w:pPr>
+      <w:r>
+        <w:t xml:space="preserve">⚠️</w:t>
+      </w:r>
+      <w:r>
+        <w:t xml:space="preserve"> </w:t>
+      </w:r>
+      <w:r>
+        <w:rPr>
+          <w:bCs/>
+          <w:b/>
+        </w:rPr>
+        <w:t xml:space="preserve">L’AI non inventa mai dati catastali, numeri di sentenza o norme.</w:t>
+      </w:r>
+      <w:r>
+        <w:t xml:space="preserve"> </w:t>
+      </w:r>
+      <w:r>
+        <w:t xml:space="preserve">Se non è certa, indica</w:t>
+      </w:r>
+      <w:r>
+        <w:t xml:space="preserve"> </w:t>
+      </w:r>
+      <w:r>
+        <w:t xml:space="preserve">“</w:t>
+      </w:r>
+      <w:r>
+        <w:t xml:space="preserve">da verificare</w:t>
+      </w:r>
+      <w:r>
+        <w:t xml:space="preserve">”</w:t>
+      </w:r>
+      <w:r>
+        <w:t xml:space="preserve">.</w:t>
+      </w:r>
+    </w:p>
+    <w:bookmarkEnd w:id="45"/>
+    <w:bookmarkStart w:id="46" w:name="regole-di-sicurezza"/>
+    <w:p>
+      <w:pPr>
+        <w:pStyle w:val="Heading3"/>
+      </w:pPr>
+      <w:r>
+        <w:t xml:space="preserve">Regole di sicurezza</w:t>
+      </w:r>
+    </w:p>
+    <w:p>
+      <w:pPr>
+        <w:numPr>
+          <w:ilvl w:val="0"/>
+          <w:numId w:val="1017"/>
+        </w:numPr>
+        <w:pStyle w:val="Compact"/>
+      </w:pPr>
+      <w:r>
+        <w:rPr>
+          <w:bCs/>
+          <w:b/>
+        </w:rPr>
+        <w:t xml:space="preserve">Non firmare mai un atto senza revisione umana</w:t>
+      </w:r>
+    </w:p>
+    <w:p>
+      <w:pPr>
+        <w:numPr>
+          <w:ilvl w:val="0"/>
+          <w:numId w:val="1017"/>
+        </w:numPr>
+        <w:pStyle w:val="Compact"/>
+      </w:pPr>
+      <w:r>
+        <w:rPr>
+          <w:bCs/>
+          <w:b/>
+        </w:rPr>
+        <w:t xml:space="preserve">Verificare sempre le citazioni giurisprudenziali</w:t>
+      </w:r>
+      <w:r>
+        <w:t xml:space="preserve"> </w:t>
+      </w:r>
+      <w:r>
+        <w:t xml:space="preserve">su database ufficiali</w:t>
+      </w:r>
+    </w:p>
+    <w:p>
+      <w:pPr>
+        <w:numPr>
+          <w:ilvl w:val="0"/>
+          <w:numId w:val="1017"/>
+        </w:numPr>
+        <w:pStyle w:val="Compact"/>
+      </w:pPr>
+      <w:r>
+        <w:rPr>
+          <w:bCs/>
+          <w:b/>
+        </w:rPr>
+        <w:t xml:space="preserve">Controllare i calcoli fiscali</w:t>
+      </w:r>
+      <w:r>
+        <w:t xml:space="preserve"> </w:t>
+      </w:r>
+      <w:r>
+        <w:t xml:space="preserve">con il proprio software contabile</w:t>
+      </w:r>
+    </w:p>
+    <w:p>
+      <w:pPr>
+        <w:numPr>
+          <w:ilvl w:val="0"/>
+          <w:numId w:val="1017"/>
+        </w:numPr>
+        <w:pStyle w:val="Compact"/>
+      </w:pPr>
+      <w:r>
+        <w:rPr>
+          <w:bCs/>
+          <w:b/>
+        </w:rPr>
+        <w:t xml:space="preserve">Validare le date delle scadenze</w:t>
+      </w:r>
+      <w:r>
+        <w:t xml:space="preserve"> </w:t>
+      </w:r>
+      <w:r>
+        <w:t xml:space="preserve">con il calendario notarile</w:t>
+      </w:r>
+    </w:p>
+    <w:p>
+      <w:r>
+        <w:pict>
+          <v:rect style="width:0;height:1.5pt" o:hralign="center" o:hrstd="t" o:hr="t"/>
+        </w:pict>
+      </w:r>
+    </w:p>
+    <w:bookmarkEnd w:id="46"/>
+    <w:bookmarkEnd w:id="47"/>
+    <w:bookmarkStart w:id="50" w:name="faq-e-troubleshooting"/>
+    <w:p>
+      <w:pPr>
+        <w:pStyle w:val="Heading2"/>
+      </w:pPr>
+      <w:r>
+        <w:t xml:space="preserve">9. FAQ e Troubleshooting</w:t>
+      </w:r>
+    </w:p>
+    <w:bookmarkStart w:id="48" w:name="domande-frequenti"/>
     <w:p>
       <w:pPr>
         <w:pStyle w:val="Heading3"/>
@@ -3345,7 +3761,7 @@
         <w:t xml:space="preserve"> </w:t>
       </w:r>
       <w:r>
-        <w:t xml:space="preserve">&gt; R: Sì per la stesura atti, verifica catastale (con placeholder), controllo documenti e scadenze.</w:t>
+        <w:t xml:space="preserve">&gt; R: Sì per la stesura atti, verifica catastale (con placeholder), controllo documenti, scadenze e Notaio Sintetico.</w:t>
       </w:r>
       <w:r>
         <w:t xml:space="preserve"> </w:t>
@@ -3590,8 +4006,42 @@
         <w:t xml:space="preserve">&gt; R: Gli atti che riguardano un immobile (Compravendita, Mutuo, Divisione, Donazione) richiedono Verifica Catastale e Conformità. Gli altri (SRL, Testamento, Patto di famiglia) non le richiedono.</w:t>
       </w:r>
     </w:p>
-    <w:bookmarkEnd w:id="44"/>
-    <w:bookmarkStart w:id="45" w:name="errori-comuni-e-soluzioni"/>
+    <w:p>
+      <w:pPr>
+        <w:pStyle w:val="BodyText"/>
+      </w:pPr>
+      <w:r>
+        <w:rPr>
+          <w:bCs/>
+          <w:b/>
+        </w:rPr>
+        <w:t xml:space="preserve">D: Il Notaio Sintetico sostituisce il parere del Notaio?</w:t>
+      </w:r>
+      <w:r>
+        <w:t xml:space="preserve"> </w:t>
+      </w:r>
+      <w:r>
+        <w:t xml:space="preserve">&gt; R:</w:t>
+      </w:r>
+      <w:r>
+        <w:t xml:space="preserve"> </w:t>
+      </w:r>
+      <w:r>
+        <w:rPr>
+          <w:bCs/>
+          <w:b/>
+        </w:rPr>
+        <w:t xml:space="preserve">No.</w:t>
+      </w:r>
+      <w:r>
+        <w:t xml:space="preserve"> </w:t>
+      </w:r>
+      <w:r>
+        <w:t xml:space="preserve">È uno strumento di supporto per dubbi procedurali. Le decisioni giuridiche definitive spettano sempre al Notaio.</w:t>
+      </w:r>
+    </w:p>
+    <w:bookmarkEnd w:id="48"/>
+    <w:bookmarkStart w:id="49" w:name="errori-comuni-e-soluzioni"/>
     <w:p>
       <w:pPr>
         <w:pStyle w:val="Heading3"/>
@@ -3882,6 +4332,153 @@
           </w:p>
         </w:tc>
       </w:tr>
+      <w:tr>
+        <w:tc>
+          <w:tcPr/>
+          <w:p>
+            <w:pPr>
+              <w:pStyle w:val="Compact"/>
+              <w:jc w:val="left"/>
+            </w:pPr>
+            <w:r>
+              <w:t xml:space="preserve">“</w:t>
+            </w:r>
+            <w:r>
+              <w:t xml:space="preserve">Testo scuro su scuro</w:t>
+            </w:r>
+            <w:r>
+              <w:t xml:space="preserve">”</w:t>
+            </w:r>
+          </w:p>
+        </w:tc>
+        <w:tc>
+          <w:tcPr/>
+          <w:p>
+            <w:pPr>
+              <w:pStyle w:val="Compact"/>
+              <w:jc w:val="left"/>
+            </w:pPr>
+            <w:r>
+              <w:t xml:space="preserve">CSS non caricato</w:t>
+            </w:r>
+          </w:p>
+        </w:tc>
+        <w:tc>
+          <w:tcPr/>
+          <w:p>
+            <w:pPr>
+              <w:pStyle w:val="Compact"/>
+              <w:jc w:val="left"/>
+            </w:pPr>
+            <w:r>
+              <w:t xml:space="preserve">Ricarica la pagina con cache vuota (Ctrl+F5)</w:t>
+            </w:r>
+          </w:p>
+        </w:tc>
+      </w:tr>
+      <w:tr>
+        <w:tc>
+          <w:tcPr/>
+          <w:p>
+            <w:pPr>
+              <w:pStyle w:val="Compact"/>
+              <w:jc w:val="left"/>
+            </w:pPr>
+            <w:r>
+              <w:t xml:space="preserve">“</w:t>
+            </w:r>
+            <w:r>
+              <w:t xml:space="preserve">Dropdown bianco</w:t>
+            </w:r>
+            <w:r>
+              <w:t xml:space="preserve">”</w:t>
+            </w:r>
+          </w:p>
+        </w:tc>
+        <w:tc>
+          <w:tcPr/>
+          <w:p>
+            <w:pPr>
+              <w:pStyle w:val="Compact"/>
+              <w:jc w:val="left"/>
+            </w:pPr>
+            <w:r>
+              <w:t xml:space="preserve">Tema chiaro di Quasar</w:t>
+            </w:r>
+          </w:p>
+        </w:tc>
+        <w:tc>
+          <w:tcPr/>
+          <w:p>
+            <w:pPr>
+              <w:pStyle w:val="Compact"/>
+              <w:jc w:val="left"/>
+            </w:pPr>
+            <w:r>
+              <w:t xml:space="preserve">Verifica che</w:t>
+            </w:r>
+            <w:r>
+              <w:t xml:space="preserve"> </w:t>
+            </w:r>
+            <w:r>
+              <w:rPr>
+                <w:rStyle w:val="VerbatimChar"/>
+              </w:rPr>
+              <w:t xml:space="preserve">ui.dark_mode().enable()</w:t>
+            </w:r>
+            <w:r>
+              <w:t xml:space="preserve"> </w:t>
+            </w:r>
+            <w:r>
+              <w:t xml:space="preserve">sia attivo</w:t>
+            </w:r>
+          </w:p>
+        </w:tc>
+      </w:tr>
+      <w:tr>
+        <w:tc>
+          <w:tcPr/>
+          <w:p>
+            <w:pPr>
+              <w:pStyle w:val="Compact"/>
+              <w:jc w:val="left"/>
+            </w:pPr>
+            <w:r>
+              <w:t xml:space="preserve">“</w:t>
+            </w:r>
+            <w:r>
+              <w:t xml:space="preserve">Bottone non si aggiorna</w:t>
+            </w:r>
+            <w:r>
+              <w:t xml:space="preserve">”</w:t>
+            </w:r>
+          </w:p>
+        </w:tc>
+        <w:tc>
+          <w:tcPr/>
+          <w:p>
+            <w:pPr>
+              <w:pStyle w:val="Compact"/>
+              <w:jc w:val="left"/>
+            </w:pPr>
+            <w:r>
+              <w:t xml:space="preserve">Cache del browser</w:t>
+            </w:r>
+          </w:p>
+        </w:tc>
+        <w:tc>
+          <w:tcPr/>
+          <w:p>
+            <w:pPr>
+              <w:pStyle w:val="Compact"/>
+              <w:jc w:val="left"/>
+            </w:pPr>
+            <w:r>
+              <w:t xml:space="preserve">Chiudi e riapri il browser</w:t>
+            </w:r>
+          </w:p>
+        </w:tc>
+      </w:tr>
     </w:tbl>
     <w:p>
       <w:r>
@@ -3890,18 +4487,18 @@
         </w:pict>
       </w:r>
     </w:p>
-    <w:bookmarkEnd w:id="45"/>
-    <w:bookmarkEnd w:id="46"/>
-    <w:bookmarkStart w:id="56" w:name="prezzi-e-servizi-commerciali"/>
+    <w:bookmarkEnd w:id="49"/>
+    <w:bookmarkEnd w:id="50"/>
+    <w:bookmarkStart w:id="60" w:name="prezzi-e-servizi-commerciali"/>
     <w:p>
       <w:pPr>
         <w:pStyle w:val="Heading2"/>
       </w:pPr>
       <w:r>
-        <w:t xml:space="preserve">9. Prezzi e Servizi Commerciali</w:t>
-      </w:r>
-    </w:p>
-    <w:bookmarkStart w:id="47" w:name="modello-di-business"/>
+        <w:t xml:space="preserve">10. Prezzi e Servizi Commerciali</w:t>
+      </w:r>
+    </w:p>
+    <w:bookmarkStart w:id="51" w:name="modello-di-business"/>
     <w:p>
       <w:pPr>
         <w:pStyle w:val="Heading3"/>
@@ -3931,8 +4528,8 @@
         <w:t xml:space="preserve">: il sistema viene installato fisicamente nello studio su hardware NVIDIA DGX SPARK (acquistato separatamente). I dati non escono mai dall’ufficio.</w:t>
       </w:r>
     </w:p>
-    <w:bookmarkEnd w:id="47"/>
-    <w:bookmarkStart w:id="48" w:name="pacchetti-disponibili"/>
+    <w:bookmarkEnd w:id="51"/>
+    <w:bookmarkStart w:id="52" w:name="pacchetti-disponibili"/>
     <w:p>
       <w:pPr>
         <w:pStyle w:val="Heading3"/>
@@ -4170,8 +4767,8 @@
         </w:tc>
       </w:tr>
     </w:tbl>
-    <w:bookmarkEnd w:id="48"/>
-    <w:bookmarkStart w:id="52" w:name="cosa-include-ogni-pacchetto"/>
+    <w:bookmarkEnd w:id="52"/>
+    <w:bookmarkStart w:id="56" w:name="cosa-include-ogni-pacchetto"/>
     <w:p>
       <w:pPr>
         <w:pStyle w:val="Heading3"/>
@@ -4180,7 +4777,7 @@
         <w:t xml:space="preserve">Cosa include ogni pacchetto</w:t>
       </w:r>
     </w:p>
-    <w:bookmarkStart w:id="49" w:name="base-500mese"/>
+    <w:bookmarkStart w:id="53" w:name="base-500mese"/>
     <w:p>
       <w:pPr>
         <w:pStyle w:val="Heading4"/>
@@ -4193,7 +4790,7 @@
       <w:pPr>
         <w:numPr>
           <w:ilvl w:val="0"/>
-          <w:numId w:val="1016"/>
+          <w:numId w:val="1018"/>
         </w:numPr>
         <w:pStyle w:val="Compact"/>
       </w:pPr>
@@ -4205,7 +4802,7 @@
       <w:pPr>
         <w:numPr>
           <w:ilvl w:val="0"/>
-          <w:numId w:val="1016"/>
+          <w:numId w:val="1018"/>
         </w:numPr>
         <w:pStyle w:val="Compact"/>
       </w:pPr>
@@ -4217,7 +4814,7 @@
       <w:pPr>
         <w:numPr>
           <w:ilvl w:val="0"/>
-          <w:numId w:val="1016"/>
+          <w:numId w:val="1018"/>
         </w:numPr>
         <w:pStyle w:val="Compact"/>
       </w:pPr>
@@ -4229,7 +4826,7 @@
       <w:pPr>
         <w:numPr>
           <w:ilvl w:val="0"/>
-          <w:numId w:val="1016"/>
+          <w:numId w:val="1018"/>
         </w:numPr>
         <w:pStyle w:val="Compact"/>
       </w:pPr>
@@ -4241,7 +4838,7 @@
       <w:pPr>
         <w:numPr>
           <w:ilvl w:val="0"/>
-          <w:numId w:val="1016"/>
+          <w:numId w:val="1018"/>
         </w:numPr>
         <w:pStyle w:val="Compact"/>
       </w:pPr>
@@ -4249,8 +4846,8 @@
         <w:t xml:space="preserve">Supporto email (24h SLA)</w:t>
       </w:r>
     </w:p>
-    <w:bookmarkEnd w:id="49"/>
-    <w:bookmarkStart w:id="50" w:name="professional-1.000mese"/>
+    <w:bookmarkEnd w:id="53"/>
+    <w:bookmarkStart w:id="54" w:name="professional-1.000mese"/>
     <w:p>
       <w:pPr>
         <w:pStyle w:val="Heading4"/>
@@ -4263,7 +4860,7 @@
       <w:pPr>
         <w:numPr>
           <w:ilvl w:val="0"/>
-          <w:numId w:val="1017"/>
+          <w:numId w:val="1019"/>
         </w:numPr>
         <w:pStyle w:val="Compact"/>
       </w:pPr>
@@ -4275,7 +4872,7 @@
       <w:pPr>
         <w:numPr>
           <w:ilvl w:val="0"/>
-          <w:numId w:val="1017"/>
+          <w:numId w:val="1019"/>
         </w:numPr>
         <w:pStyle w:val="Compact"/>
       </w:pPr>
@@ -4287,7 +4884,7 @@
       <w:pPr>
         <w:numPr>
           <w:ilvl w:val="0"/>
-          <w:numId w:val="1017"/>
+          <w:numId w:val="1019"/>
         </w:numPr>
         <w:pStyle w:val="Compact"/>
       </w:pPr>
@@ -4299,7 +4896,7 @@
       <w:pPr>
         <w:numPr>
           <w:ilvl w:val="0"/>
-          <w:numId w:val="1017"/>
+          <w:numId w:val="1019"/>
         </w:numPr>
         <w:pStyle w:val="Compact"/>
       </w:pPr>
@@ -4311,7 +4908,7 @@
       <w:pPr>
         <w:numPr>
           <w:ilvl w:val="0"/>
-          <w:numId w:val="1017"/>
+          <w:numId w:val="1019"/>
         </w:numPr>
         <w:pStyle w:val="Compact"/>
       </w:pPr>
@@ -4323,7 +4920,7 @@
       <w:pPr>
         <w:numPr>
           <w:ilvl w:val="0"/>
-          <w:numId w:val="1017"/>
+          <w:numId w:val="1019"/>
         </w:numPr>
         <w:pStyle w:val="Compact"/>
       </w:pPr>
@@ -4331,8 +4928,8 @@
         <w:t xml:space="preserve">2 sessioni di formazione</w:t>
       </w:r>
     </w:p>
-    <w:bookmarkEnd w:id="50"/>
-    <w:bookmarkStart w:id="51" w:name="enterprise-2.500mese"/>
+    <w:bookmarkEnd w:id="54"/>
+    <w:bookmarkStart w:id="55" w:name="enterprise-2.500mese"/>
     <w:p>
       <w:pPr>
         <w:pStyle w:val="Heading4"/>
@@ -4345,7 +4942,7 @@
       <w:pPr>
         <w:numPr>
           <w:ilvl w:val="0"/>
-          <w:numId w:val="1018"/>
+          <w:numId w:val="1020"/>
         </w:numPr>
         <w:pStyle w:val="Compact"/>
       </w:pPr>
@@ -4357,7 +4954,7 @@
       <w:pPr>
         <w:numPr>
           <w:ilvl w:val="0"/>
-          <w:numId w:val="1018"/>
+          <w:numId w:val="1020"/>
         </w:numPr>
         <w:pStyle w:val="Compact"/>
       </w:pPr>
@@ -4369,7 +4966,7 @@
       <w:pPr>
         <w:numPr>
           <w:ilvl w:val="0"/>
-          <w:numId w:val="1018"/>
+          <w:numId w:val="1020"/>
         </w:numPr>
         <w:pStyle w:val="Compact"/>
       </w:pPr>
@@ -4381,7 +4978,7 @@
       <w:pPr>
         <w:numPr>
           <w:ilvl w:val="0"/>
-          <w:numId w:val="1018"/>
+          <w:numId w:val="1020"/>
         </w:numPr>
         <w:pStyle w:val="Compact"/>
       </w:pPr>
@@ -4393,7 +4990,7 @@
       <w:pPr>
         <w:numPr>
           <w:ilvl w:val="0"/>
-          <w:numId w:val="1018"/>
+          <w:numId w:val="1020"/>
         </w:numPr>
         <w:pStyle w:val="Compact"/>
       </w:pPr>
@@ -4405,7 +5002,7 @@
       <w:pPr>
         <w:numPr>
           <w:ilvl w:val="0"/>
-          <w:numId w:val="1018"/>
+          <w:numId w:val="1020"/>
         </w:numPr>
         <w:pStyle w:val="Compact"/>
       </w:pPr>
@@ -4413,9 +5010,9 @@
         <w:t xml:space="preserve">Cluster HA (2 DGX SPARK)</w:t>
       </w:r>
     </w:p>
-    <w:bookmarkEnd w:id="51"/>
-    <w:bookmarkEnd w:id="52"/>
-    <w:bookmarkStart w:id="53" w:name="hardware-prerequisito"/>
+    <w:bookmarkEnd w:id="55"/>
+    <w:bookmarkEnd w:id="56"/>
+    <w:bookmarkStart w:id="57" w:name="hardware-prerequisito"/>
     <w:p>
       <w:pPr>
         <w:pStyle w:val="Heading3"/>
@@ -4456,8 +5053,8 @@
         <w:t xml:space="preserve">- &lt; 35 dB in operazione (adatto a ufficio)</w:t>
       </w:r>
     </w:p>
-    <w:bookmarkEnd w:id="53"/>
-    <w:bookmarkStart w:id="54" w:name="roi-stimato"/>
+    <w:bookmarkEnd w:id="57"/>
+    <w:bookmarkStart w:id="58" w:name="roi-stimato"/>
     <w:p>
       <w:pPr>
         <w:pStyle w:val="Heading3"/>
@@ -4625,8 +5222,8 @@
         </w:tc>
       </w:tr>
     </w:tbl>
-    <w:bookmarkEnd w:id="54"/>
-    <w:bookmarkStart w:id="55" w:name="contatti-commerciali"/>
+    <w:bookmarkEnd w:id="58"/>
+    <w:bookmarkStart w:id="59" w:name="contatti-commerciali"/>
     <w:p>
       <w:pPr>
         <w:pStyle w:val="Heading3"/>
@@ -4639,7 +5236,7 @@
       <w:pPr>
         <w:numPr>
           <w:ilvl w:val="0"/>
-          <w:numId w:val="1019"/>
+          <w:numId w:val="1021"/>
         </w:numPr>
         <w:pStyle w:val="Compact"/>
       </w:pPr>
@@ -4661,7 +5258,7 @@
       <w:pPr>
         <w:numPr>
           <w:ilvl w:val="0"/>
-          <w:numId w:val="1019"/>
+          <w:numId w:val="1021"/>
         </w:numPr>
         <w:pStyle w:val="Compact"/>
       </w:pPr>
@@ -4683,7 +5280,7 @@
       <w:pPr>
         <w:numPr>
           <w:ilvl w:val="0"/>
-          <w:numId w:val="1019"/>
+          <w:numId w:val="1021"/>
         </w:numPr>
         <w:pStyle w:val="Compact"/>
       </w:pPr>
@@ -4708,18 +5305,18 @@
         </w:pict>
       </w:r>
     </w:p>
-    <w:bookmarkEnd w:id="55"/>
-    <w:bookmarkEnd w:id="56"/>
-    <w:bookmarkStart w:id="66" w:name="gli-agenti-ai-di-notaio-ai-dettaglio"/>
+    <w:bookmarkEnd w:id="59"/>
+    <w:bookmarkEnd w:id="60"/>
+    <w:bookmarkStart w:id="70" w:name="gli-agenti-ai-di-notaio-ai-dettaglio"/>
     <w:p>
       <w:pPr>
         <w:pStyle w:val="Heading2"/>
       </w:pPr>
       <w:r>
-        <w:t xml:space="preserve">10. Gli Agenti AI di Notaio AI — Dettaglio</w:t>
-      </w:r>
-    </w:p>
-    <w:bookmarkStart w:id="57" w:name="panoramica-1"/>
+        <w:t xml:space="preserve">11. Gli Agenti AI di Notaio AI — Dettaglio</w:t>
+      </w:r>
+    </w:p>
+    <w:bookmarkStart w:id="61" w:name="panoramica-1"/>
     <w:p>
       <w:pPr>
         <w:pStyle w:val="Heading3"/>
@@ -4749,8 +5346,8 @@
         <w:t xml:space="preserve">, ciascuno con una propria identità, competenze e regole di comportamento. Il sistema sceglie automaticamente l’agente giusto per ogni compito.</w:t>
       </w:r>
     </w:p>
-    <w:bookmarkEnd w:id="57"/>
-    <w:bookmarkStart w:id="65" w:name="i-7-agenti"/>
+    <w:bookmarkEnd w:id="61"/>
+    <w:bookmarkStart w:id="69" w:name="i-7-agenti"/>
     <w:p>
       <w:pPr>
         <w:pStyle w:val="Heading3"/>
@@ -4759,7 +5356,7 @@
         <w:t xml:space="preserve">I 7 agenti</w:t>
       </w:r>
     </w:p>
-    <w:bookmarkStart w:id="58" w:name="attista"/>
+    <w:bookmarkStart w:id="62" w:name="attista"/>
     <w:p>
       <w:pPr>
         <w:pStyle w:val="Heading4"/>
@@ -4772,7 +5369,7 @@
       <w:pPr>
         <w:numPr>
           <w:ilvl w:val="0"/>
-          <w:numId w:val="1020"/>
+          <w:numId w:val="1022"/>
         </w:numPr>
         <w:pStyle w:val="Compact"/>
       </w:pPr>
@@ -4794,7 +5391,7 @@
       <w:pPr>
         <w:numPr>
           <w:ilvl w:val="0"/>
-          <w:numId w:val="1020"/>
+          <w:numId w:val="1022"/>
         </w:numPr>
         <w:pStyle w:val="Compact"/>
       </w:pPr>
@@ -4816,7 +5413,7 @@
       <w:pPr>
         <w:numPr>
           <w:ilvl w:val="0"/>
-          <w:numId w:val="1020"/>
+          <w:numId w:val="1022"/>
         </w:numPr>
         <w:pStyle w:val="Compact"/>
       </w:pPr>
@@ -4838,7 +5435,7 @@
       <w:pPr>
         <w:numPr>
           <w:ilvl w:val="0"/>
-          <w:numId w:val="1020"/>
+          <w:numId w:val="1022"/>
         </w:numPr>
         <w:pStyle w:val="Compact"/>
       </w:pPr>
@@ -4860,7 +5457,7 @@
       <w:pPr>
         <w:numPr>
           <w:ilvl w:val="0"/>
-          <w:numId w:val="1020"/>
+          <w:numId w:val="1022"/>
         </w:numPr>
         <w:pStyle w:val="Compact"/>
       </w:pPr>
@@ -4882,7 +5479,7 @@
       <w:pPr>
         <w:numPr>
           <w:ilvl w:val="0"/>
-          <w:numId w:val="1020"/>
+          <w:numId w:val="1022"/>
         </w:numPr>
         <w:pStyle w:val="Compact"/>
       </w:pPr>
@@ -4900,8 +5497,8 @@
         <w:t xml:space="preserve">Compravendita, Costituzione SRL, Testamento, Patto di famiglia, Mutuo, Divisione, Donazione</w:t>
       </w:r>
     </w:p>
-    <w:bookmarkEnd w:id="58"/>
-    <w:bookmarkStart w:id="59" w:name="catasto"/>
+    <w:bookmarkEnd w:id="62"/>
+    <w:bookmarkStart w:id="63" w:name="catasto"/>
     <w:p>
       <w:pPr>
         <w:pStyle w:val="Heading4"/>
@@ -4914,7 +5511,7 @@
       <w:pPr>
         <w:numPr>
           <w:ilvl w:val="0"/>
-          <w:numId w:val="1021"/>
+          <w:numId w:val="1023"/>
         </w:numPr>
         <w:pStyle w:val="Compact"/>
       </w:pPr>
@@ -4936,7 +5533,7 @@
       <w:pPr>
         <w:numPr>
           <w:ilvl w:val="0"/>
-          <w:numId w:val="1021"/>
+          <w:numId w:val="1023"/>
         </w:numPr>
         <w:pStyle w:val="Compact"/>
       </w:pPr>
@@ -4958,7 +5555,7 @@
       <w:pPr>
         <w:numPr>
           <w:ilvl w:val="0"/>
-          <w:numId w:val="1021"/>
+          <w:numId w:val="1023"/>
         </w:numPr>
         <w:pStyle w:val="Compact"/>
       </w:pPr>
@@ -4980,7 +5577,7 @@
       <w:pPr>
         <w:numPr>
           <w:ilvl w:val="0"/>
-          <w:numId w:val="1021"/>
+          <w:numId w:val="1023"/>
         </w:numPr>
         <w:pStyle w:val="Compact"/>
       </w:pPr>
@@ -5002,7 +5599,7 @@
       <w:pPr>
         <w:numPr>
           <w:ilvl w:val="0"/>
-          <w:numId w:val="1021"/>
+          <w:numId w:val="1023"/>
         </w:numPr>
         <w:pStyle w:val="Compact"/>
       </w:pPr>
@@ -5024,7 +5621,7 @@
       <w:pPr>
         <w:numPr>
           <w:ilvl w:val="0"/>
-          <w:numId w:val="1021"/>
+          <w:numId w:val="1023"/>
         </w:numPr>
         <w:pStyle w:val="Compact"/>
       </w:pPr>
@@ -5042,8 +5639,8 @@
         <w:t xml:space="preserve">Solo per atti immobiliari (Compravendita, Mutuo, Divisione, Donazione)</w:t>
       </w:r>
     </w:p>
-    <w:bookmarkEnd w:id="59"/>
-    <w:bookmarkStart w:id="60" w:name="conformità"/>
+    <w:bookmarkEnd w:id="63"/>
+    <w:bookmarkStart w:id="64" w:name="conformità"/>
     <w:p>
       <w:pPr>
         <w:pStyle w:val="Heading4"/>
@@ -5056,7 +5653,7 @@
       <w:pPr>
         <w:numPr>
           <w:ilvl w:val="0"/>
-          <w:numId w:val="1022"/>
+          <w:numId w:val="1024"/>
         </w:numPr>
         <w:pStyle w:val="Compact"/>
       </w:pPr>
@@ -5078,7 +5675,7 @@
       <w:pPr>
         <w:numPr>
           <w:ilvl w:val="0"/>
-          <w:numId w:val="1022"/>
+          <w:numId w:val="1024"/>
         </w:numPr>
         <w:pStyle w:val="Compact"/>
       </w:pPr>
@@ -5100,7 +5697,7 @@
       <w:pPr>
         <w:numPr>
           <w:ilvl w:val="0"/>
-          <w:numId w:val="1022"/>
+          <w:numId w:val="1024"/>
         </w:numPr>
         <w:pStyle w:val="Compact"/>
       </w:pPr>
@@ -5122,7 +5719,7 @@
       <w:pPr>
         <w:numPr>
           <w:ilvl w:val="0"/>
-          <w:numId w:val="1022"/>
+          <w:numId w:val="1024"/>
         </w:numPr>
         <w:pStyle w:val="Compact"/>
       </w:pPr>
@@ -5144,7 +5741,7 @@
       <w:pPr>
         <w:numPr>
           <w:ilvl w:val="0"/>
-          <w:numId w:val="1022"/>
+          <w:numId w:val="1024"/>
         </w:numPr>
         <w:pStyle w:val="Compact"/>
       </w:pPr>
@@ -5166,7 +5763,7 @@
       <w:pPr>
         <w:numPr>
           <w:ilvl w:val="0"/>
-          <w:numId w:val="1022"/>
+          <w:numId w:val="1024"/>
         </w:numPr>
         <w:pStyle w:val="Compact"/>
       </w:pPr>
@@ -5184,8 +5781,8 @@
         <w:t xml:space="preserve">Solo per atti immobiliari</w:t>
       </w:r>
     </w:p>
-    <w:bookmarkEnd w:id="60"/>
-    <w:bookmarkStart w:id="61" w:name="controllo"/>
+    <w:bookmarkEnd w:id="64"/>
+    <w:bookmarkStart w:id="65" w:name="controllo"/>
     <w:p>
       <w:pPr>
         <w:pStyle w:val="Heading4"/>
@@ -5198,7 +5795,7 @@
       <w:pPr>
         <w:numPr>
           <w:ilvl w:val="0"/>
-          <w:numId w:val="1023"/>
+          <w:numId w:val="1025"/>
         </w:numPr>
         <w:pStyle w:val="Compact"/>
       </w:pPr>
@@ -5220,7 +5817,7 @@
       <w:pPr>
         <w:numPr>
           <w:ilvl w:val="0"/>
-          <w:numId w:val="1023"/>
+          <w:numId w:val="1025"/>
         </w:numPr>
         <w:pStyle w:val="Compact"/>
       </w:pPr>
@@ -5242,7 +5839,7 @@
       <w:pPr>
         <w:numPr>
           <w:ilvl w:val="0"/>
-          <w:numId w:val="1023"/>
+          <w:numId w:val="1025"/>
         </w:numPr>
         <w:pStyle w:val="Compact"/>
       </w:pPr>
@@ -5264,7 +5861,7 @@
       <w:pPr>
         <w:numPr>
           <w:ilvl w:val="0"/>
-          <w:numId w:val="1023"/>
+          <w:numId w:val="1025"/>
         </w:numPr>
         <w:pStyle w:val="Compact"/>
       </w:pPr>
@@ -5286,7 +5883,7 @@
       <w:pPr>
         <w:numPr>
           <w:ilvl w:val="0"/>
-          <w:numId w:val="1023"/>
+          <w:numId w:val="1025"/>
         </w:numPr>
         <w:pStyle w:val="Compact"/>
       </w:pPr>
@@ -5304,8 +5901,8 @@
         <w:t xml:space="preserve">Non dà OK definitivo, distingue obbligo da best practice</w:t>
       </w:r>
     </w:p>
-    <w:bookmarkEnd w:id="61"/>
-    <w:bookmarkStart w:id="62" w:name="scadenze"/>
+    <w:bookmarkEnd w:id="65"/>
+    <w:bookmarkStart w:id="66" w:name="scadenze"/>
     <w:p>
       <w:pPr>
         <w:pStyle w:val="Heading4"/>
@@ -5318,7 +5915,7 @@
       <w:pPr>
         <w:numPr>
           <w:ilvl w:val="0"/>
-          <w:numId w:val="1024"/>
+          <w:numId w:val="1026"/>
         </w:numPr>
         <w:pStyle w:val="Compact"/>
       </w:pPr>
@@ -5340,7 +5937,7 @@
       <w:pPr>
         <w:numPr>
           <w:ilvl w:val="0"/>
-          <w:numId w:val="1024"/>
+          <w:numId w:val="1026"/>
         </w:numPr>
         <w:pStyle w:val="Compact"/>
       </w:pPr>
@@ -5362,7 +5959,7 @@
       <w:pPr>
         <w:numPr>
           <w:ilvl w:val="0"/>
-          <w:numId w:val="1024"/>
+          <w:numId w:val="1026"/>
         </w:numPr>
         <w:pStyle w:val="Compact"/>
       </w:pPr>
@@ -5384,7 +5981,7 @@
       <w:pPr>
         <w:numPr>
           <w:ilvl w:val="0"/>
-          <w:numId w:val="1024"/>
+          <w:numId w:val="1026"/>
         </w:numPr>
         <w:pStyle w:val="Compact"/>
       </w:pPr>
@@ -5406,7 +6003,7 @@
       <w:pPr>
         <w:numPr>
           <w:ilvl w:val="0"/>
-          <w:numId w:val="1024"/>
+          <w:numId w:val="1026"/>
         </w:numPr>
         <w:pStyle w:val="Compact"/>
       </w:pPr>
@@ -5424,8 +6021,8 @@
         <w:t xml:space="preserve">Distingue perentori da ordinatori, calcola in giorni solari</w:t>
       </w:r>
     </w:p>
-    <w:bookmarkEnd w:id="62"/>
-    <w:bookmarkStart w:id="63" w:name="ricercatore"/>
+    <w:bookmarkEnd w:id="66"/>
+    <w:bookmarkStart w:id="67" w:name="ricercatore"/>
     <w:p>
       <w:pPr>
         <w:pStyle w:val="Heading4"/>
@@ -5438,7 +6035,7 @@
       <w:pPr>
         <w:numPr>
           <w:ilvl w:val="0"/>
-          <w:numId w:val="1025"/>
+          <w:numId w:val="1027"/>
         </w:numPr>
         <w:pStyle w:val="Compact"/>
       </w:pPr>
@@ -5460,7 +6057,7 @@
       <w:pPr>
         <w:numPr>
           <w:ilvl w:val="0"/>
-          <w:numId w:val="1025"/>
+          <w:numId w:val="1027"/>
         </w:numPr>
         <w:pStyle w:val="Compact"/>
       </w:pPr>
@@ -5482,7 +6079,7 @@
       <w:pPr>
         <w:numPr>
           <w:ilvl w:val="0"/>
-          <w:numId w:val="1025"/>
+          <w:numId w:val="1027"/>
         </w:numPr>
         <w:pStyle w:val="Compact"/>
       </w:pPr>
@@ -5504,7 +6101,7 @@
       <w:pPr>
         <w:numPr>
           <w:ilvl w:val="0"/>
-          <w:numId w:val="1025"/>
+          <w:numId w:val="1027"/>
         </w:numPr>
         <w:pStyle w:val="Compact"/>
       </w:pPr>
@@ -5526,7 +6123,7 @@
       <w:pPr>
         <w:numPr>
           <w:ilvl w:val="0"/>
-          <w:numId w:val="1025"/>
+          <w:numId w:val="1027"/>
         </w:numPr>
         <w:pStyle w:val="Compact"/>
       </w:pPr>
@@ -5544,8 +6141,8 @@
         <w:t xml:space="preserve">Non inventa norme, distingue vigente da abrogata</w:t>
       </w:r>
     </w:p>
-    <w:bookmarkEnd w:id="63"/>
-    <w:bookmarkStart w:id="64" w:name="firma"/>
+    <w:bookmarkEnd w:id="67"/>
+    <w:bookmarkStart w:id="68" w:name="firma"/>
     <w:p>
       <w:pPr>
         <w:pStyle w:val="Heading4"/>
@@ -5558,7 +6155,7 @@
       <w:pPr>
         <w:numPr>
           <w:ilvl w:val="0"/>
-          <w:numId w:val="1026"/>
+          <w:numId w:val="1028"/>
         </w:numPr>
         <w:pStyle w:val="Compact"/>
       </w:pPr>
@@ -5580,7 +6177,7 @@
       <w:pPr>
         <w:numPr>
           <w:ilvl w:val="0"/>
-          <w:numId w:val="1026"/>
+          <w:numId w:val="1028"/>
         </w:numPr>
         <w:pStyle w:val="Compact"/>
       </w:pPr>
@@ -5602,7 +6199,7 @@
       <w:pPr>
         <w:numPr>
           <w:ilvl w:val="0"/>
-          <w:numId w:val="1026"/>
+          <w:numId w:val="1028"/>
         </w:numPr>
         <w:pStyle w:val="Compact"/>
       </w:pPr>
@@ -5624,7 +6221,7 @@
       <w:pPr>
         <w:numPr>
           <w:ilvl w:val="0"/>
-          <w:numId w:val="1026"/>
+          <w:numId w:val="1028"/>
         </w:numPr>
         <w:pStyle w:val="Compact"/>
       </w:pPr>
@@ -5646,7 +6243,7 @@
       <w:pPr>
         <w:numPr>
           <w:ilvl w:val="0"/>
-          <w:numId w:val="1026"/>
+          <w:numId w:val="1028"/>
         </w:numPr>
         <w:pStyle w:val="Compact"/>
       </w:pPr>
@@ -5710,13 +6307,13 @@
           <w:iCs/>
           <w:i/>
         </w:rPr>
-        <w:t xml:space="preserve">Versione 1.1 — 26 Aprile 2026</w:t>
-      </w:r>
-    </w:p>
-    <w:bookmarkEnd w:id="64"/>
-    <w:bookmarkEnd w:id="65"/>
-    <w:bookmarkEnd w:id="66"/>
-    <w:bookmarkEnd w:id="67"/>
+        <w:t xml:space="preserve">Versione 1.2 — 4 Maggio 2026</w:t>
+      </w:r>
+    </w:p>
+    <w:bookmarkEnd w:id="68"/>
+    <w:bookmarkEnd w:id="69"/>
+    <w:bookmarkEnd w:id="70"/>
+    <w:bookmarkEnd w:id="71"/>
     <w:sectPr/>
   </w:body>
 </w:document>
@@ -6183,34 +6780,7 @@
     </w:lvlOverride>
   </w:num>
   <w:num w:numId="1012">
-    <w:abstractNumId w:val="99411"/>
-    <w:lvlOverride w:ilvl="0">
-      <w:startOverride w:val="1"/>
-    </w:lvlOverride>
-    <w:lvlOverride w:ilvl="1">
-      <w:startOverride w:val="1"/>
-    </w:lvlOverride>
-    <w:lvlOverride w:ilvl="2">
-      <w:startOverride w:val="1"/>
-    </w:lvlOverride>
-    <w:lvlOverride w:ilvl="3">
-      <w:startOverride w:val="1"/>
-    </w:lvlOverride>
-    <w:lvlOverride w:ilvl="4">
-      <w:startOverride w:val="1"/>
-    </w:lvlOverride>
-    <w:lvlOverride w:ilvl="5">
-      <w:startOverride w:val="1"/>
-    </w:lvlOverride>
-    <w:lvlOverride w:ilvl="6">
-      <w:startOverride w:val="1"/>
-    </w:lvlOverride>
-    <w:lvlOverride w:ilvl="7">
-      <w:startOverride w:val="1"/>
-    </w:lvlOverride>
-    <w:lvlOverride w:ilvl="8">
-      <w:startOverride w:val="1"/>
-    </w:lvlOverride>
+    <w:abstractNumId w:val="991"/>
   </w:num>
   <w:num w:numId="1013">
     <w:abstractNumId w:val="99411"/>
@@ -6243,7 +6813,34 @@
     </w:lvlOverride>
   </w:num>
   <w:num w:numId="1014">
-    <w:abstractNumId w:val="991"/>
+    <w:abstractNumId w:val="99411"/>
+    <w:lvlOverride w:ilvl="0">
+      <w:startOverride w:val="1"/>
+    </w:lvlOverride>
+    <w:lvlOverride w:ilvl="1">
+      <w:startOverride w:val="1"/>
+    </w:lvlOverride>
+    <w:lvlOverride w:ilvl="2">
+      <w:startOverride w:val="1"/>
+    </w:lvlOverride>
+    <w:lvlOverride w:ilvl="3">
+      <w:startOverride w:val="1"/>
+    </w:lvlOverride>
+    <w:lvlOverride w:ilvl="4">
+      <w:startOverride w:val="1"/>
+    </w:lvlOverride>
+    <w:lvlOverride w:ilvl="5">
+      <w:startOverride w:val="1"/>
+    </w:lvlOverride>
+    <w:lvlOverride w:ilvl="6">
+      <w:startOverride w:val="1"/>
+    </w:lvlOverride>
+    <w:lvlOverride w:ilvl="7">
+      <w:startOverride w:val="1"/>
+    </w:lvlOverride>
+    <w:lvlOverride w:ilvl="8">
+      <w:startOverride w:val="1"/>
+    </w:lvlOverride>
   </w:num>
   <w:num w:numId="1015">
     <w:abstractNumId w:val="99411"/>
@@ -6279,7 +6876,34 @@
     <w:abstractNumId w:val="991"/>
   </w:num>
   <w:num w:numId="1017">
-    <w:abstractNumId w:val="991"/>
+    <w:abstractNumId w:val="99411"/>
+    <w:lvlOverride w:ilvl="0">
+      <w:startOverride w:val="1"/>
+    </w:lvlOverride>
+    <w:lvlOverride w:ilvl="1">
+      <w:startOverride w:val="1"/>
+    </w:lvlOverride>
+    <w:lvlOverride w:ilvl="2">
+      <w:startOverride w:val="1"/>
+    </w:lvlOverride>
+    <w:lvlOverride w:ilvl="3">
+      <w:startOverride w:val="1"/>
+    </w:lvlOverride>
+    <w:lvlOverride w:ilvl="4">
+      <w:startOverride w:val="1"/>
+    </w:lvlOverride>
+    <w:lvlOverride w:ilvl="5">
+      <w:startOverride w:val="1"/>
+    </w:lvlOverride>
+    <w:lvlOverride w:ilvl="6">
+      <w:startOverride w:val="1"/>
+    </w:lvlOverride>
+    <w:lvlOverride w:ilvl="7">
+      <w:startOverride w:val="1"/>
+    </w:lvlOverride>
+    <w:lvlOverride w:ilvl="8">
+      <w:startOverride w:val="1"/>
+    </w:lvlOverride>
   </w:num>
   <w:num w:numId="1018">
     <w:abstractNumId w:val="991"/>
@@ -6306,6 +6930,12 @@
     <w:abstractNumId w:val="991"/>
   </w:num>
   <w:num w:numId="1026">
+    <w:abstractNumId w:val="991"/>
+  </w:num>
+  <w:num w:numId="1027">
+    <w:abstractNumId w:val="991"/>
+  </w:num>
+  <w:num w:numId="1028">
     <w:abstractNumId w:val="991"/>
   </w:num>
 </w:numbering>

</xml_diff>

<commit_message>
Rimuove riferimento numerico '7' dagli agenti — nomenclatura generica
</commit_message>
<xml_diff>
--- a/NOTAIO_AI_MANUALE_IT.docx
+++ b/NOTAIO_AI_MANUALE_IT.docx
@@ -830,13 +830,13 @@
     </w:p>
     <w:bookmarkEnd w:id="26"/>
     <w:bookmarkEnd w:id="27"/>
-    <w:bookmarkStart w:id="28" w:name="gli-7-agenti-notarili"/>
+    <w:bookmarkStart w:id="28" w:name="gli-agenti-notarili"/>
     <w:p>
       <w:pPr>
         <w:pStyle w:val="Heading2"/>
       </w:pPr>
       <w:r>
-        <w:t xml:space="preserve">3. Gli 7 Agenti Notarili</w:t>
+        <w:t xml:space="preserve">3. Gli agenti notarili</w:t>
       </w:r>
     </w:p>
     <w:p>
@@ -4795,7 +4795,7 @@
         <w:pStyle w:val="Compact"/>
       </w:pPr>
       <w:r>
-        <w:t xml:space="preserve">7 agenti AI standard</w:t>
+        <w:t xml:space="preserve">Agenti AI standard</w:t>
       </w:r>
     </w:p>
     <w:p>
@@ -4865,7 +4865,7 @@
         <w:pStyle w:val="Compact"/>
       </w:pPr>
       <w:r>
-        <w:t xml:space="preserve">7 agenti + 1 agente custom</w:t>
+        <w:t xml:space="preserve">Agenti AI + 1 agente custom</w:t>
       </w:r>
     </w:p>
     <w:p>
@@ -4947,7 +4947,7 @@
         <w:pStyle w:val="Compact"/>
       </w:pPr>
       <w:r>
-        <w:t xml:space="preserve">7 agenti + 3 agenti custom</w:t>
+        <w:t xml:space="preserve">Agenti AI + 3 agenti custom</w:t>
       </w:r>
     </w:p>
     <w:p>
@@ -5340,20 +5340,20 @@
           <w:bCs/>
           <w:b/>
         </w:rPr>
-        <w:t xml:space="preserve">7 agenti AI specializzati</w:t>
+        <w:t xml:space="preserve">agenti AI specializzati</w:t>
       </w:r>
       <w:r>
         <w:t xml:space="preserve">, ciascuno con una propria identità, competenze e regole di comportamento. Il sistema sceglie automaticamente l’agente giusto per ogni compito.</w:t>
       </w:r>
     </w:p>
     <w:bookmarkEnd w:id="61"/>
-    <w:bookmarkStart w:id="69" w:name="i-7-agenti"/>
+    <w:bookmarkStart w:id="69" w:name="gli-agenti"/>
     <w:p>
       <w:pPr>
         <w:pStyle w:val="Heading3"/>
       </w:pPr>
       <w:r>
-        <w:t xml:space="preserve">I 7 agenti</w:t>
+        <w:t xml:space="preserve">Gli agenti</w:t>
       </w:r>
     </w:p>
     <w:bookmarkStart w:id="62" w:name="attista"/>

</xml_diff>

<commit_message>
Aggiorna manuale Notaio AI v1.3 — 14 atti raggruppati per categoria, selettore a due livelli
</commit_message>
<xml_diff>
--- a/NOTAIO_AI_MANUALE_IT.docx
+++ b/NOTAIO_AI_MANUALE_IT.docx
@@ -2,7 +2,7 @@
 <file path=word/document.xml><?xml version="1.0" encoding="utf-8"?>
 <w:document xmlns:w="http://schemas.openxmlformats.org/wordprocessingml/2006/main" xmlns:m="http://schemas.openxmlformats.org/officeDocument/2006/math" xmlns:r="http://schemas.openxmlformats.org/officeDocument/2006/relationships" xmlns:o="urn:schemas-microsoft-com:office:office" xmlns:v="urn:schemas-microsoft-com:vml" xmlns:w10="urn:schemas-microsoft-com:office:word" xmlns:a="http://schemas.openxmlformats.org/drawingml/2006/main" xmlns:pic="http://schemas.openxmlformats.org/drawingml/2006/picture" xmlns:wp="http://schemas.openxmlformats.org/drawingml/2006/wordprocessingDrawing">
   <w:body>
-    <w:bookmarkStart w:id="71" w:name="notaio-ai-manuale-utente"/>
+    <w:bookmarkStart w:id="75" w:name="notaio-ai-manuale-utente"/>
     <w:p>
       <w:pPr>
         <w:pStyle w:val="Heading1"/>
@@ -26,7 +26,7 @@
         <w:t xml:space="preserve"> </w:t>
       </w:r>
       <w:r>
-        <w:t xml:space="preserve">1.2</w:t>
+        <w:t xml:space="preserve">1.3</w:t>
       </w:r>
       <w:r>
         <w:t xml:space="preserve"> </w:t>
@@ -1242,7 +1242,7 @@
       </w:r>
     </w:p>
     <w:bookmarkEnd w:id="28"/>
-    <w:bookmarkStart w:id="30" w:name="selettore-tipo-atto-e-form-dedicate"/>
+    <w:bookmarkStart w:id="34" w:name="selettore-tipo-atto-e-form-dedicate"/>
     <w:p>
       <w:pPr>
         <w:pStyle w:val="Heading2"/>
@@ -1295,6 +1295,16 @@
       </w:r>
       <w:r>
         <w:t xml:space="preserve">— scegli quello che ti serve e il form si adatta automaticamente.</w:t>
+      </w:r>
+    </w:p>
+    <w:bookmarkEnd w:id="29"/>
+    <w:bookmarkStart w:id="30" w:name="atti-immobiliari"/>
+    <w:p>
+      <w:pPr>
+        <w:pStyle w:val="Heading3"/>
+      </w:pPr>
+      <w:r>
+        <w:t xml:space="preserve">🏠 Atti Immobiliari</w:t>
       </w:r>
     </w:p>
     <w:tbl>
@@ -1442,31 +1452,31 @@
                 <w:bCs/>
                 <w:b/>
               </w:rPr>
-              <w:t xml:space="preserve">Costituzione SRL</w:t>
-            </w:r>
-          </w:p>
-        </w:tc>
-        <w:tc>
-          <w:tcPr/>
-          <w:p>
-            <w:pPr>
-              <w:pStyle w:val="Compact"/>
-              <w:jc w:val="left"/>
-            </w:pPr>
-            <w:r>
-              <w:t xml:space="preserve">Soci, Denominazione, Sede, Oggetto, Capitale, Amministratore, Statuto</w:t>
-            </w:r>
-          </w:p>
-        </w:tc>
-        <w:tc>
-          <w:tcPr/>
-          <w:p>
-            <w:pPr>
-              <w:pStyle w:val="Compact"/>
-              <w:jc w:val="left"/>
-            </w:pPr>
-            <w:r>
-              <w:t xml:space="preserve">3 fasi</w:t>
+              <w:t xml:space="preserve">Mutuo ipotecario</w:t>
+            </w:r>
+          </w:p>
+        </w:tc>
+        <w:tc>
+          <w:tcPr/>
+          <w:p>
+            <w:pPr>
+              <w:pStyle w:val="Compact"/>
+              <w:jc w:val="left"/>
+            </w:pPr>
+            <w:r>
+              <w:t xml:space="preserve">Mutuatario, Istituto, Importo, Tasso, Durata, Immobile garanzia</w:t>
+            </w:r>
+          </w:p>
+        </w:tc>
+        <w:tc>
+          <w:tcPr/>
+          <w:p>
+            <w:pPr>
+              <w:pStyle w:val="Compact"/>
+              <w:jc w:val="left"/>
+            </w:pPr>
+            <w:r>
+              <w:t xml:space="preserve">5 fasi</w:t>
             </w:r>
           </w:p>
         </w:tc>
@@ -1481,6 +1491,245 @@
             </w:pPr>
             <w:r>
               <w:t xml:space="preserve">3</w:t>
+            </w:r>
+          </w:p>
+        </w:tc>
+        <w:tc>
+          <w:tcPr/>
+          <w:p>
+            <w:pPr>
+              <w:pStyle w:val="Compact"/>
+              <w:jc w:val="left"/>
+            </w:pPr>
+            <w:r>
+              <w:rPr>
+                <w:bCs/>
+                <w:b/>
+              </w:rPr>
+              <w:t xml:space="preserve">Cancellazione Ipoteca</w:t>
+            </w:r>
+          </w:p>
+        </w:tc>
+        <w:tc>
+          <w:tcPr/>
+          <w:p>
+            <w:pPr>
+              <w:pStyle w:val="Compact"/>
+              <w:jc w:val="left"/>
+            </w:pPr>
+            <w:r>
+              <w:t xml:space="preserve">Debitore, Istituto, Immobile, Data estinzione, Importo</w:t>
+            </w:r>
+          </w:p>
+        </w:tc>
+        <w:tc>
+          <w:tcPr/>
+          <w:p>
+            <w:pPr>
+              <w:pStyle w:val="Compact"/>
+              <w:jc w:val="left"/>
+            </w:pPr>
+            <w:r>
+              <w:t xml:space="preserve">5 fasi</w:t>
+            </w:r>
+          </w:p>
+        </w:tc>
+      </w:tr>
+      <w:tr>
+        <w:tc>
+          <w:tcPr/>
+          <w:p>
+            <w:pPr>
+              <w:pStyle w:val="Compact"/>
+              <w:jc w:val="left"/>
+            </w:pPr>
+            <w:r>
+              <w:t xml:space="preserve">4</w:t>
+            </w:r>
+          </w:p>
+        </w:tc>
+        <w:tc>
+          <w:tcPr/>
+          <w:p>
+            <w:pPr>
+              <w:pStyle w:val="Compact"/>
+              <w:jc w:val="left"/>
+            </w:pPr>
+            <w:r>
+              <w:rPr>
+                <w:bCs/>
+                <w:b/>
+              </w:rPr>
+              <w:t xml:space="preserve">Donazione</w:t>
+            </w:r>
+          </w:p>
+        </w:tc>
+        <w:tc>
+          <w:tcPr/>
+          <w:p>
+            <w:pPr>
+              <w:pStyle w:val="Compact"/>
+              <w:jc w:val="left"/>
+            </w:pPr>
+            <w:r>
+              <w:t xml:space="preserve">Donante, Donatario, Bene, Regime fiscale, Oneri</w:t>
+            </w:r>
+          </w:p>
+        </w:tc>
+        <w:tc>
+          <w:tcPr/>
+          <w:p>
+            <w:pPr>
+              <w:pStyle w:val="Compact"/>
+              <w:jc w:val="left"/>
+            </w:pPr>
+            <w:r>
+              <w:t xml:space="preserve">5 fasi</w:t>
+            </w:r>
+          </w:p>
+        </w:tc>
+      </w:tr>
+      <w:tr>
+        <w:tc>
+          <w:tcPr/>
+          <w:p>
+            <w:pPr>
+              <w:pStyle w:val="Compact"/>
+              <w:jc w:val="left"/>
+            </w:pPr>
+            <w:r>
+              <w:t xml:space="preserve">5</w:t>
+            </w:r>
+          </w:p>
+        </w:tc>
+        <w:tc>
+          <w:tcPr/>
+          <w:p>
+            <w:pPr>
+              <w:pStyle w:val="Compact"/>
+              <w:jc w:val="left"/>
+            </w:pPr>
+            <w:r>
+              <w:rPr>
+                <w:bCs/>
+                <w:b/>
+              </w:rPr>
+              <w:t xml:space="preserve">Divisione</w:t>
+            </w:r>
+          </w:p>
+        </w:tc>
+        <w:tc>
+          <w:tcPr/>
+          <w:p>
+            <w:pPr>
+              <w:pStyle w:val="Compact"/>
+              <w:jc w:val="left"/>
+            </w:pPr>
+            <w:r>
+              <w:t xml:space="preserve">Coeredi, Bene, Quote, Modalità</w:t>
+            </w:r>
+          </w:p>
+        </w:tc>
+        <w:tc>
+          <w:tcPr/>
+          <w:p>
+            <w:pPr>
+              <w:pStyle w:val="Compact"/>
+              <w:jc w:val="left"/>
+            </w:pPr>
+            <w:r>
+              <w:t xml:space="preserve">5 fasi</w:t>
+            </w:r>
+          </w:p>
+        </w:tc>
+      </w:tr>
+    </w:tbl>
+    <w:bookmarkEnd w:id="30"/>
+    <w:bookmarkStart w:id="31" w:name="atti-di-famiglia-e-successione"/>
+    <w:p>
+      <w:pPr>
+        <w:pStyle w:val="Heading3"/>
+      </w:pPr>
+      <w:r>
+        <w:t xml:space="preserve">👨‍👩‍👧 Atti di Famiglia e Successione</w:t>
+      </w:r>
+    </w:p>
+    <w:tbl>
+      <w:tblPr>
+        <w:tblStyle w:val="Table"/>
+        <w:tblW w:type="pct" w:w="5000"/>
+        <w:tblLook w:firstRow="1" w:lastRow="0" w:firstColumn="0" w:lastColumn="0" w:noHBand="0" w:noVBand="0" w:val="0020"/>
+        <w:jc w:val="start"/>
+      </w:tblPr>
+      <w:tblGrid>
+        <w:gridCol w:w="505"/>
+        <w:gridCol w:w="2359"/>
+        <w:gridCol w:w="2527"/>
+        <w:gridCol w:w="2527"/>
+      </w:tblGrid>
+      <w:tr>
+        <w:trPr>
+          <w:tblHeader w:val="true"/>
+        </w:trPr>
+        <w:tc>
+          <w:tcPr/>
+          <w:p>
+            <w:pPr>
+              <w:pStyle w:val="Compact"/>
+              <w:jc w:val="left"/>
+            </w:pPr>
+            <w:r>
+              <w:t xml:space="preserve">#</w:t>
+            </w:r>
+          </w:p>
+        </w:tc>
+        <w:tc>
+          <w:tcPr/>
+          <w:p>
+            <w:pPr>
+              <w:pStyle w:val="Compact"/>
+              <w:jc w:val="left"/>
+            </w:pPr>
+            <w:r>
+              <w:t xml:space="preserve">Tipo di Atto</w:t>
+            </w:r>
+          </w:p>
+        </w:tc>
+        <w:tc>
+          <w:tcPr/>
+          <w:p>
+            <w:pPr>
+              <w:pStyle w:val="Compact"/>
+              <w:jc w:val="left"/>
+            </w:pPr>
+            <w:r>
+              <w:t xml:space="preserve">Form dedicate</w:t>
+            </w:r>
+          </w:p>
+        </w:tc>
+        <w:tc>
+          <w:tcPr/>
+          <w:p>
+            <w:pPr>
+              <w:pStyle w:val="Compact"/>
+              <w:jc w:val="left"/>
+            </w:pPr>
+            <w:r>
+              <w:t xml:space="preserve">Fasi workflow</w:t>
+            </w:r>
+          </w:p>
+        </w:tc>
+      </w:tr>
+      <w:tr>
+        <w:tc>
+          <w:tcPr/>
+          <w:p>
+            <w:pPr>
+              <w:pStyle w:val="Compact"/>
+              <w:jc w:val="left"/>
+            </w:pPr>
+            <w:r>
+              <w:t xml:space="preserve">6</w:t>
             </w:r>
           </w:p>
         </w:tc>
@@ -1534,7 +1783,7 @@
               <w:jc w:val="left"/>
             </w:pPr>
             <w:r>
-              <w:t xml:space="preserve">4</w:t>
+              <w:t xml:space="preserve">7</w:t>
             </w:r>
           </w:p>
         </w:tc>
@@ -1588,7 +1837,7 @@
               <w:jc w:val="left"/>
             </w:pPr>
             <w:r>
-              <w:t xml:space="preserve">5</w:t>
+              <w:t xml:space="preserve">8</w:t>
             </w:r>
           </w:p>
         </w:tc>
@@ -1604,31 +1853,31 @@
                 <w:bCs/>
                 <w:b/>
               </w:rPr>
-              <w:t xml:space="preserve">Mutuo ipotecario</w:t>
-            </w:r>
-          </w:p>
-        </w:tc>
-        <w:tc>
-          <w:tcPr/>
-          <w:p>
-            <w:pPr>
-              <w:pStyle w:val="Compact"/>
-              <w:jc w:val="left"/>
-            </w:pPr>
-            <w:r>
-              <w:t xml:space="preserve">Mutuatario, Istituto, Importo, Tasso, Durata, Immobile garanzia</w:t>
-            </w:r>
-          </w:p>
-        </w:tc>
-        <w:tc>
-          <w:tcPr/>
-          <w:p>
-            <w:pPr>
-              <w:pStyle w:val="Compact"/>
-              <w:jc w:val="left"/>
-            </w:pPr>
-            <w:r>
-              <w:t xml:space="preserve">5 fasi</w:t>
+              <w:t xml:space="preserve">Accettazione di Eredità</w:t>
+            </w:r>
+          </w:p>
+        </w:tc>
+        <w:tc>
+          <w:tcPr/>
+          <w:p>
+            <w:pPr>
+              <w:pStyle w:val="Compact"/>
+              <w:jc w:val="left"/>
+            </w:pPr>
+            <w:r>
+              <w:t xml:space="preserve">Defunto, Erede, Bene, Modalità</w:t>
+            </w:r>
+          </w:p>
+        </w:tc>
+        <w:tc>
+          <w:tcPr/>
+          <w:p>
+            <w:pPr>
+              <w:pStyle w:val="Compact"/>
+              <w:jc w:val="left"/>
+            </w:pPr>
+            <w:r>
+              <w:t xml:space="preserve">3 fasi</w:t>
             </w:r>
           </w:p>
         </w:tc>
@@ -1642,7 +1891,7 @@
               <w:jc w:val="left"/>
             </w:pPr>
             <w:r>
-              <w:t xml:space="preserve">6</w:t>
+              <w:t xml:space="preserve">9</w:t>
             </w:r>
           </w:p>
         </w:tc>
@@ -1658,31 +1907,31 @@
                 <w:bCs/>
                 <w:b/>
               </w:rPr>
-              <w:t xml:space="preserve">Divisione</w:t>
-            </w:r>
-          </w:p>
-        </w:tc>
-        <w:tc>
-          <w:tcPr/>
-          <w:p>
-            <w:pPr>
-              <w:pStyle w:val="Compact"/>
-              <w:jc w:val="left"/>
-            </w:pPr>
-            <w:r>
-              <w:t xml:space="preserve">Coeredi, Bene, Quote, Modalità</w:t>
-            </w:r>
-          </w:p>
-        </w:tc>
-        <w:tc>
-          <w:tcPr/>
-          <w:p>
-            <w:pPr>
-              <w:pStyle w:val="Compact"/>
-              <w:jc w:val="left"/>
-            </w:pPr>
-            <w:r>
-              <w:t xml:space="preserve">5 fasi</w:t>
+              <w:t xml:space="preserve">Rinuncia all’Eredità</w:t>
+            </w:r>
+          </w:p>
+        </w:tc>
+        <w:tc>
+          <w:tcPr/>
+          <w:p>
+            <w:pPr>
+              <w:pStyle w:val="Compact"/>
+              <w:jc w:val="left"/>
+            </w:pPr>
+            <w:r>
+              <w:t xml:space="preserve">Defunto, Erede, Motivo</w:t>
+            </w:r>
+          </w:p>
+        </w:tc>
+        <w:tc>
+          <w:tcPr/>
+          <w:p>
+            <w:pPr>
+              <w:pStyle w:val="Compact"/>
+              <w:jc w:val="left"/>
+            </w:pPr>
+            <w:r>
+              <w:t xml:space="preserve">3 fasi</w:t>
             </w:r>
           </w:p>
         </w:tc>
@@ -1696,7 +1945,7 @@
               <w:jc w:val="left"/>
             </w:pPr>
             <w:r>
-              <w:t xml:space="preserve">7</w:t>
+              <w:t xml:space="preserve">10</w:t>
             </w:r>
           </w:p>
         </w:tc>
@@ -1712,31 +1961,401 @@
                 <w:bCs/>
                 <w:b/>
               </w:rPr>
-              <w:t xml:space="preserve">Donazione</w:t>
-            </w:r>
-          </w:p>
-        </w:tc>
-        <w:tc>
-          <w:tcPr/>
-          <w:p>
-            <w:pPr>
-              <w:pStyle w:val="Compact"/>
-              <w:jc w:val="left"/>
-            </w:pPr>
-            <w:r>
-              <w:t xml:space="preserve">Donante, Donatario, Bene, Regime fiscale, Oneri</w:t>
-            </w:r>
-          </w:p>
-        </w:tc>
-        <w:tc>
-          <w:tcPr/>
-          <w:p>
-            <w:pPr>
-              <w:pStyle w:val="Compact"/>
-              <w:jc w:val="left"/>
-            </w:pPr>
-            <w:r>
-              <w:t xml:space="preserve">5 fasi</w:t>
+              <w:t xml:space="preserve">Convenzioni Matrimoniali</w:t>
+            </w:r>
+          </w:p>
+        </w:tc>
+        <w:tc>
+          <w:tcPr/>
+          <w:p>
+            <w:pPr>
+              <w:pStyle w:val="Compact"/>
+              <w:jc w:val="left"/>
+            </w:pPr>
+            <w:r>
+              <w:t xml:space="preserve">Coniugi, Regime, Beni</w:t>
+            </w:r>
+          </w:p>
+        </w:tc>
+        <w:tc>
+          <w:tcPr/>
+          <w:p>
+            <w:pPr>
+              <w:pStyle w:val="Compact"/>
+              <w:jc w:val="left"/>
+            </w:pPr>
+            <w:r>
+              <w:t xml:space="preserve">3 fasi</w:t>
+            </w:r>
+          </w:p>
+        </w:tc>
+      </w:tr>
+    </w:tbl>
+    <w:bookmarkEnd w:id="31"/>
+    <w:bookmarkStart w:id="32" w:name="atti-societari-e-commerciali"/>
+    <w:p>
+      <w:pPr>
+        <w:pStyle w:val="Heading3"/>
+      </w:pPr>
+      <w:r>
+        <w:t xml:space="preserve">🏢 Atti Societari e Commerciali</w:t>
+      </w:r>
+    </w:p>
+    <w:tbl>
+      <w:tblPr>
+        <w:tblStyle w:val="Table"/>
+        <w:tblW w:type="pct" w:w="5000"/>
+        <w:tblLook w:firstRow="1" w:lastRow="0" w:firstColumn="0" w:lastColumn="0" w:noHBand="0" w:noVBand="0" w:val="0020"/>
+        <w:jc w:val="start"/>
+      </w:tblPr>
+      <w:tblGrid>
+        <w:gridCol w:w="505"/>
+        <w:gridCol w:w="2359"/>
+        <w:gridCol w:w="2527"/>
+        <w:gridCol w:w="2527"/>
+      </w:tblGrid>
+      <w:tr>
+        <w:trPr>
+          <w:tblHeader w:val="true"/>
+        </w:trPr>
+        <w:tc>
+          <w:tcPr/>
+          <w:p>
+            <w:pPr>
+              <w:pStyle w:val="Compact"/>
+              <w:jc w:val="left"/>
+            </w:pPr>
+            <w:r>
+              <w:t xml:space="preserve">#</w:t>
+            </w:r>
+          </w:p>
+        </w:tc>
+        <w:tc>
+          <w:tcPr/>
+          <w:p>
+            <w:pPr>
+              <w:pStyle w:val="Compact"/>
+              <w:jc w:val="left"/>
+            </w:pPr>
+            <w:r>
+              <w:t xml:space="preserve">Tipo di Atto</w:t>
+            </w:r>
+          </w:p>
+        </w:tc>
+        <w:tc>
+          <w:tcPr/>
+          <w:p>
+            <w:pPr>
+              <w:pStyle w:val="Compact"/>
+              <w:jc w:val="left"/>
+            </w:pPr>
+            <w:r>
+              <w:t xml:space="preserve">Form dedicate</w:t>
+            </w:r>
+          </w:p>
+        </w:tc>
+        <w:tc>
+          <w:tcPr/>
+          <w:p>
+            <w:pPr>
+              <w:pStyle w:val="Compact"/>
+              <w:jc w:val="left"/>
+            </w:pPr>
+            <w:r>
+              <w:t xml:space="preserve">Fasi workflow</w:t>
+            </w:r>
+          </w:p>
+        </w:tc>
+      </w:tr>
+      <w:tr>
+        <w:tc>
+          <w:tcPr/>
+          <w:p>
+            <w:pPr>
+              <w:pStyle w:val="Compact"/>
+              <w:jc w:val="left"/>
+            </w:pPr>
+            <w:r>
+              <w:t xml:space="preserve">11</w:t>
+            </w:r>
+          </w:p>
+        </w:tc>
+        <w:tc>
+          <w:tcPr/>
+          <w:p>
+            <w:pPr>
+              <w:pStyle w:val="Compact"/>
+              <w:jc w:val="left"/>
+            </w:pPr>
+            <w:r>
+              <w:rPr>
+                <w:bCs/>
+                <w:b/>
+              </w:rPr>
+              <w:t xml:space="preserve">Costituzione SRL</w:t>
+            </w:r>
+          </w:p>
+        </w:tc>
+        <w:tc>
+          <w:tcPr/>
+          <w:p>
+            <w:pPr>
+              <w:pStyle w:val="Compact"/>
+              <w:jc w:val="left"/>
+            </w:pPr>
+            <w:r>
+              <w:t xml:space="preserve">Soci, Denominazione, Sede, Oggetto, Capitale, Amministratore, Statuto</w:t>
+            </w:r>
+          </w:p>
+        </w:tc>
+        <w:tc>
+          <w:tcPr/>
+          <w:p>
+            <w:pPr>
+              <w:pStyle w:val="Compact"/>
+              <w:jc w:val="left"/>
+            </w:pPr>
+            <w:r>
+              <w:t xml:space="preserve">3 fasi</w:t>
+            </w:r>
+          </w:p>
+        </w:tc>
+      </w:tr>
+      <w:tr>
+        <w:tc>
+          <w:tcPr/>
+          <w:p>
+            <w:pPr>
+              <w:pStyle w:val="Compact"/>
+              <w:jc w:val="left"/>
+            </w:pPr>
+            <w:r>
+              <w:t xml:space="preserve">12</w:t>
+            </w:r>
+          </w:p>
+        </w:tc>
+        <w:tc>
+          <w:tcPr/>
+          <w:p>
+            <w:pPr>
+              <w:pStyle w:val="Compact"/>
+              <w:jc w:val="left"/>
+            </w:pPr>
+            <w:r>
+              <w:rPr>
+                <w:bCs/>
+                <w:b/>
+              </w:rPr>
+              <w:t xml:space="preserve">Verbale di Assemblea Straordinaria</w:t>
+            </w:r>
+          </w:p>
+        </w:tc>
+        <w:tc>
+          <w:tcPr/>
+          <w:p>
+            <w:pPr>
+              <w:pStyle w:val="Compact"/>
+              <w:jc w:val="left"/>
+            </w:pPr>
+            <w:r>
+              <w:t xml:space="preserve">Società, Data, Delibere, Partecipanti</w:t>
+            </w:r>
+          </w:p>
+        </w:tc>
+        <w:tc>
+          <w:tcPr/>
+          <w:p>
+            <w:pPr>
+              <w:pStyle w:val="Compact"/>
+              <w:jc w:val="left"/>
+            </w:pPr>
+            <w:r>
+              <w:t xml:space="preserve">3 fasi</w:t>
+            </w:r>
+          </w:p>
+        </w:tc>
+      </w:tr>
+    </w:tbl>
+    <w:bookmarkEnd w:id="32"/>
+    <w:bookmarkStart w:id="33" w:name="atti-di-procura-e-giurisdizione"/>
+    <w:p>
+      <w:pPr>
+        <w:pStyle w:val="Heading3"/>
+      </w:pPr>
+      <w:r>
+        <w:t xml:space="preserve">⚖️ Atti di Procura e Giurisdizione</w:t>
+      </w:r>
+    </w:p>
+    <w:tbl>
+      <w:tblPr>
+        <w:tblStyle w:val="Table"/>
+        <w:tblW w:type="pct" w:w="5000"/>
+        <w:tblLook w:firstRow="1" w:lastRow="0" w:firstColumn="0" w:lastColumn="0" w:noHBand="0" w:noVBand="0" w:val="0020"/>
+        <w:jc w:val="start"/>
+      </w:tblPr>
+      <w:tblGrid>
+        <w:gridCol w:w="505"/>
+        <w:gridCol w:w="2359"/>
+        <w:gridCol w:w="2527"/>
+        <w:gridCol w:w="2527"/>
+      </w:tblGrid>
+      <w:tr>
+        <w:trPr>
+          <w:tblHeader w:val="true"/>
+        </w:trPr>
+        <w:tc>
+          <w:tcPr/>
+          <w:p>
+            <w:pPr>
+              <w:pStyle w:val="Compact"/>
+              <w:jc w:val="left"/>
+            </w:pPr>
+            <w:r>
+              <w:t xml:space="preserve">#</w:t>
+            </w:r>
+          </w:p>
+        </w:tc>
+        <w:tc>
+          <w:tcPr/>
+          <w:p>
+            <w:pPr>
+              <w:pStyle w:val="Compact"/>
+              <w:jc w:val="left"/>
+            </w:pPr>
+            <w:r>
+              <w:t xml:space="preserve">Tipo di Atto</w:t>
+            </w:r>
+          </w:p>
+        </w:tc>
+        <w:tc>
+          <w:tcPr/>
+          <w:p>
+            <w:pPr>
+              <w:pStyle w:val="Compact"/>
+              <w:jc w:val="left"/>
+            </w:pPr>
+            <w:r>
+              <w:t xml:space="preserve">Form dedicate</w:t>
+            </w:r>
+          </w:p>
+        </w:tc>
+        <w:tc>
+          <w:tcPr/>
+          <w:p>
+            <w:pPr>
+              <w:pStyle w:val="Compact"/>
+              <w:jc w:val="left"/>
+            </w:pPr>
+            <w:r>
+              <w:t xml:space="preserve">Fasi workflow</w:t>
+            </w:r>
+          </w:p>
+        </w:tc>
+      </w:tr>
+      <w:tr>
+        <w:tc>
+          <w:tcPr/>
+          <w:p>
+            <w:pPr>
+              <w:pStyle w:val="Compact"/>
+              <w:jc w:val="left"/>
+            </w:pPr>
+            <w:r>
+              <w:t xml:space="preserve">13</w:t>
+            </w:r>
+          </w:p>
+        </w:tc>
+        <w:tc>
+          <w:tcPr/>
+          <w:p>
+            <w:pPr>
+              <w:pStyle w:val="Compact"/>
+              <w:jc w:val="left"/>
+            </w:pPr>
+            <w:r>
+              <w:rPr>
+                <w:bCs/>
+                <w:b/>
+              </w:rPr>
+              <w:t xml:space="preserve">Procura Speciale o Generale</w:t>
+            </w:r>
+          </w:p>
+        </w:tc>
+        <w:tc>
+          <w:tcPr/>
+          <w:p>
+            <w:pPr>
+              <w:pStyle w:val="Compact"/>
+              <w:jc w:val="left"/>
+            </w:pPr>
+            <w:r>
+              <w:t xml:space="preserve">Mandante, Procuratore, Oggetto, Termine</w:t>
+            </w:r>
+          </w:p>
+        </w:tc>
+        <w:tc>
+          <w:tcPr/>
+          <w:p>
+            <w:pPr>
+              <w:pStyle w:val="Compact"/>
+              <w:jc w:val="left"/>
+            </w:pPr>
+            <w:r>
+              <w:t xml:space="preserve">3 fasi</w:t>
+            </w:r>
+          </w:p>
+        </w:tc>
+      </w:tr>
+      <w:tr>
+        <w:tc>
+          <w:tcPr/>
+          <w:p>
+            <w:pPr>
+              <w:pStyle w:val="Compact"/>
+              <w:jc w:val="left"/>
+            </w:pPr>
+            <w:r>
+              <w:t xml:space="preserve">14</w:t>
+            </w:r>
+          </w:p>
+        </w:tc>
+        <w:tc>
+          <w:tcPr/>
+          <w:p>
+            <w:pPr>
+              <w:pStyle w:val="Compact"/>
+              <w:jc w:val="left"/>
+            </w:pPr>
+            <w:r>
+              <w:rPr>
+                <w:bCs/>
+                <w:b/>
+              </w:rPr>
+              <w:t xml:space="preserve">Atto di Notorietà</w:t>
+            </w:r>
+          </w:p>
+        </w:tc>
+        <w:tc>
+          <w:tcPr/>
+          <w:p>
+            <w:pPr>
+              <w:pStyle w:val="Compact"/>
+              <w:jc w:val="left"/>
+            </w:pPr>
+            <w:r>
+              <w:t xml:space="preserve">Dichiarante, Fatto, Finalità</w:t>
+            </w:r>
+          </w:p>
+        </w:tc>
+        <w:tc>
+          <w:tcPr/>
+          <w:p>
+            <w:pPr>
+              <w:pStyle w:val="Compact"/>
+              <w:jc w:val="left"/>
+            </w:pPr>
+            <w:r>
+              <w:t xml:space="preserve">3 fasi</w:t>
             </w:r>
           </w:p>
         </w:tc>
@@ -1773,9 +2392,9 @@
         </w:pict>
       </w:r>
     </w:p>
-    <w:bookmarkEnd w:id="29"/>
-    <w:bookmarkEnd w:id="30"/>
-    <w:bookmarkStart w:id="36" w:name="Xd5f55d4fdeb3b3364a4d8aa1778895de4dc96c2"/>
+    <w:bookmarkEnd w:id="33"/>
+    <w:bookmarkEnd w:id="34"/>
+    <w:bookmarkStart w:id="40" w:name="Xd5f55d4fdeb3b3364a4d8aa1778895de4dc96c2"/>
     <w:p>
       <w:pPr>
         <w:pStyle w:val="Heading2"/>
@@ -1784,7 +2403,7 @@
         <w:t xml:space="preserve">5. Workflow per Tipo di Atto — Guida Passo-passo</w:t>
       </w:r>
     </w:p>
-    <w:bookmarkStart w:id="31" w:name="panoramica-del-flusso"/>
+    <w:bookmarkStart w:id="35" w:name="panoramica-del-flusso"/>
     <w:p>
       <w:pPr>
         <w:pStyle w:val="Heading3"/>
@@ -1869,8 +2488,8 @@
         <w:t xml:space="preserve">Inserimento dati → Stesura Atto → Controllo → Scadenze</w:t>
       </w:r>
     </w:p>
-    <w:bookmarkEnd w:id="31"/>
-    <w:bookmarkStart w:id="32" w:name="passo-1-selezione-e-inserimento-dati"/>
+    <w:bookmarkEnd w:id="35"/>
+    <w:bookmarkStart w:id="36" w:name="passo-1-selezione-e-inserimento-dati"/>
     <w:p>
       <w:pPr>
         <w:pStyle w:val="Heading3"/>
@@ -1909,7 +2528,35 @@
         <w:pStyle w:val="Compact"/>
       </w:pPr>
       <w:r>
-        <w:t xml:space="preserve">Seleziona il</w:t>
+        <w:t xml:space="preserve">Seleziona prima la</w:t>
+      </w:r>
+      <w:r>
+        <w:t xml:space="preserve"> </w:t>
+      </w:r>
+      <w:r>
+        <w:rPr>
+          <w:bCs/>
+          <w:b/>
+        </w:rPr>
+        <w:t xml:space="preserve">Categoria</w:t>
+      </w:r>
+      <w:r>
+        <w:t xml:space="preserve"> </w:t>
+      </w:r>
+      <w:r>
+        <w:t xml:space="preserve">(Immobiliari, Famiglia, Societari, Procura)</w:t>
+      </w:r>
+    </w:p>
+    <w:p>
+      <w:pPr>
+        <w:numPr>
+          <w:ilvl w:val="0"/>
+          <w:numId w:val="1004"/>
+        </w:numPr>
+        <w:pStyle w:val="Compact"/>
+      </w:pPr>
+      <w:r>
+        <w:t xml:space="preserve">Poi seleziona il</w:t>
       </w:r>
       <w:r>
         <w:t xml:space="preserve"> </w:t>
@@ -1925,7 +2572,7 @@
         <w:t xml:space="preserve"> </w:t>
       </w:r>
       <w:r>
-        <w:t xml:space="preserve">dal menu a tendina in cima alla colonna sinistra</w:t>
+        <w:t xml:space="preserve">dal secondo menu — il form si adatta automaticamente</w:t>
       </w:r>
     </w:p>
     <w:p>
@@ -1972,10 +2619,10 @@
           <w:bCs/>
           <w:b/>
         </w:rPr>
-        <w:t xml:space="preserve">Costituzione SRL</w:t>
-      </w:r>
-      <w:r>
-        <w:t xml:space="preserve">: Dati Società (soci, denominazione, sede, oggetto, capitale, amministratore, statuto)</w:t>
+        <w:t xml:space="preserve">Mutuo ipotecario</w:t>
+      </w:r>
+      <w:r>
+        <w:t xml:space="preserve">: Dati Mutuo (mutuatario, istituto, importo, tasso, durata, immobile garanzia)</w:t>
       </w:r>
     </w:p>
     <w:p>
@@ -1991,10 +2638,10 @@
           <w:bCs/>
           <w:b/>
         </w:rPr>
-        <w:t xml:space="preserve">Testamento</w:t>
-      </w:r>
-      <w:r>
-        <w:t xml:space="preserve">: Dati Testatore, Eredi, Legati, Esecutore, Disposizioni</w:t>
+        <w:t xml:space="preserve">Cancellazione Ipoteca</w:t>
+      </w:r>
+      <w:r>
+        <w:t xml:space="preserve">: Debitore, Istituto, Immobile, Data estinzione, Importo</w:t>
       </w:r>
     </w:p>
     <w:p>
@@ -2010,10 +2657,10 @@
           <w:bCs/>
           <w:b/>
         </w:rPr>
-        <w:t xml:space="preserve">Patto di famiglia</w:t>
-      </w:r>
-      <w:r>
-        <w:t xml:space="preserve">: Dati Contraenti, Bene, Regime, Durata, Successori</w:t>
+        <w:t xml:space="preserve">Donazione</w:t>
+      </w:r>
+      <w:r>
+        <w:t xml:space="preserve">: Dati Donazione (donante, donatario, bene, regime fiscale, oneri)</w:t>
       </w:r>
     </w:p>
     <w:p>
@@ -2029,10 +2676,10 @@
           <w:bCs/>
           <w:b/>
         </w:rPr>
-        <w:t xml:space="preserve">Mutuo ipotecario</w:t>
-      </w:r>
-      <w:r>
-        <w:t xml:space="preserve">: Dati Mutuo (mutuatario, istituto, importo, tasso, durata, immobile garanzia)</w:t>
+        <w:t xml:space="preserve">Divisione</w:t>
+      </w:r>
+      <w:r>
+        <w:t xml:space="preserve">: Dati Divisione (coeredi, bene, quote, modalità)</w:t>
       </w:r>
     </w:p>
     <w:p>
@@ -2048,10 +2695,10 @@
           <w:bCs/>
           <w:b/>
         </w:rPr>
-        <w:t xml:space="preserve">Divisione</w:t>
-      </w:r>
-      <w:r>
-        <w:t xml:space="preserve">: Dati Divisione (coeredi, bene, quote, modalità)</w:t>
+        <w:t xml:space="preserve">Testamento</w:t>
+      </w:r>
+      <w:r>
+        <w:t xml:space="preserve">: Dati Testatore, Eredi, Legati, Esecutore, Disposizioni</w:t>
       </w:r>
     </w:p>
     <w:p>
@@ -2067,10 +2714,143 @@
           <w:bCs/>
           <w:b/>
         </w:rPr>
-        <w:t xml:space="preserve">Donazione</w:t>
-      </w:r>
-      <w:r>
-        <w:t xml:space="preserve">: Dati Donazione (donante, donatario, bene, regime fiscale, oneri)</w:t>
+        <w:t xml:space="preserve">Patto di famiglia</w:t>
+      </w:r>
+      <w:r>
+        <w:t xml:space="preserve">: Dati Contraenti, Bene, Regime, Durata, Successori</w:t>
+      </w:r>
+    </w:p>
+    <w:p>
+      <w:pPr>
+        <w:numPr>
+          <w:ilvl w:val="1"/>
+          <w:numId w:val="1005"/>
+        </w:numPr>
+        <w:pStyle w:val="Compact"/>
+      </w:pPr>
+      <w:r>
+        <w:rPr>
+          <w:bCs/>
+          <w:b/>
+        </w:rPr>
+        <w:t xml:space="preserve">Accettazione di Eredità</w:t>
+      </w:r>
+      <w:r>
+        <w:t xml:space="preserve">: Defunto, Erede, Bene, Modalità</w:t>
+      </w:r>
+    </w:p>
+    <w:p>
+      <w:pPr>
+        <w:numPr>
+          <w:ilvl w:val="1"/>
+          <w:numId w:val="1005"/>
+        </w:numPr>
+        <w:pStyle w:val="Compact"/>
+      </w:pPr>
+      <w:r>
+        <w:rPr>
+          <w:bCs/>
+          <w:b/>
+        </w:rPr>
+        <w:t xml:space="preserve">Rinuncia all’Eredità</w:t>
+      </w:r>
+      <w:r>
+        <w:t xml:space="preserve">: Defunto, Erede, Motivo</w:t>
+      </w:r>
+    </w:p>
+    <w:p>
+      <w:pPr>
+        <w:numPr>
+          <w:ilvl w:val="1"/>
+          <w:numId w:val="1005"/>
+        </w:numPr>
+        <w:pStyle w:val="Compact"/>
+      </w:pPr>
+      <w:r>
+        <w:rPr>
+          <w:bCs/>
+          <w:b/>
+        </w:rPr>
+        <w:t xml:space="preserve">Convenzioni Matrimoniali</w:t>
+      </w:r>
+      <w:r>
+        <w:t xml:space="preserve">: Coniugi, Regime, Beni</w:t>
+      </w:r>
+    </w:p>
+    <w:p>
+      <w:pPr>
+        <w:numPr>
+          <w:ilvl w:val="1"/>
+          <w:numId w:val="1005"/>
+        </w:numPr>
+        <w:pStyle w:val="Compact"/>
+      </w:pPr>
+      <w:r>
+        <w:rPr>
+          <w:bCs/>
+          <w:b/>
+        </w:rPr>
+        <w:t xml:space="preserve">Costituzione SRL</w:t>
+      </w:r>
+      <w:r>
+        <w:t xml:space="preserve">: Dati Società (soci, denominazione, sede, oggetto, capitale, amministratore, statuto)</w:t>
+      </w:r>
+    </w:p>
+    <w:p>
+      <w:pPr>
+        <w:numPr>
+          <w:ilvl w:val="1"/>
+          <w:numId w:val="1005"/>
+        </w:numPr>
+        <w:pStyle w:val="Compact"/>
+      </w:pPr>
+      <w:r>
+        <w:rPr>
+          <w:bCs/>
+          <w:b/>
+        </w:rPr>
+        <w:t xml:space="preserve">Verbale di Assemblea Straordinaria</w:t>
+      </w:r>
+      <w:r>
+        <w:t xml:space="preserve">: Società, Data, Delibere, Partecipanti</w:t>
+      </w:r>
+    </w:p>
+    <w:p>
+      <w:pPr>
+        <w:numPr>
+          <w:ilvl w:val="1"/>
+          <w:numId w:val="1005"/>
+        </w:numPr>
+        <w:pStyle w:val="Compact"/>
+      </w:pPr>
+      <w:r>
+        <w:rPr>
+          <w:bCs/>
+          <w:b/>
+        </w:rPr>
+        <w:t xml:space="preserve">Procura Speciale o Generale</w:t>
+      </w:r>
+      <w:r>
+        <w:t xml:space="preserve">: Mandante, Procuratore, Oggetto, Termine</w:t>
+      </w:r>
+    </w:p>
+    <w:p>
+      <w:pPr>
+        <w:numPr>
+          <w:ilvl w:val="1"/>
+          <w:numId w:val="1005"/>
+        </w:numPr>
+        <w:pStyle w:val="Compact"/>
+      </w:pPr>
+      <w:r>
+        <w:rPr>
+          <w:bCs/>
+          <w:b/>
+        </w:rPr>
+        <w:t xml:space="preserve">Atto di Notorietà</w:t>
+      </w:r>
+      <w:r>
+        <w:t xml:space="preserve">: Dichiarante, Fatto, Finalità</w:t>
       </w:r>
     </w:p>
     <w:p>
@@ -2125,8 +2905,8 @@
         <w:t xml:space="preserve">Seleziona il cliente dall’anagrafica (se disponibile) per pre-compilare i dati.</w:t>
       </w:r>
     </w:p>
-    <w:bookmarkEnd w:id="32"/>
-    <w:bookmarkStart w:id="33" w:name="passo-2-generazione"/>
+    <w:bookmarkEnd w:id="36"/>
+    <w:bookmarkStart w:id="37" w:name="passo-2-generazione"/>
     <w:p>
       <w:pPr>
         <w:pStyle w:val="Heading3"/>
@@ -2194,6 +2974,12 @@
           <w:b/>
         </w:rPr>
         <w:t xml:space="preserve">Per atti immobiliari (5 fasi):</w:t>
+      </w:r>
+      <w:r>
+        <w:t xml:space="preserve"> </w:t>
+      </w:r>
+      <w:r>
+        <w:t xml:space="preserve">Compravendita, Mutuo, Cancellazione Ipoteca, Donazione, Divisione</w:t>
       </w:r>
     </w:p>
     <w:p>
@@ -2320,6 +3106,12 @@
         </w:rPr>
         <w:t xml:space="preserve">Per atti non immobiliari (3 fasi):</w:t>
       </w:r>
+      <w:r>
+        <w:t xml:space="preserve"> </w:t>
+      </w:r>
+      <w:r>
+        <w:t xml:space="preserve">Testamento, Patto di famiglia, Accettazione di Eredità, Rinuncia all’Eredità, Convenzioni Matrimoniali, Costituzione SRL, Verbale di Assemblea, Procura, Atto di Notorietà</w:t>
+      </w:r>
     </w:p>
     <w:p>
       <w:pPr>
@@ -2398,8 +3190,8 @@
         <w:t xml:space="preserve">Il documento completo apparirà nell’area risultato</w:t>
       </w:r>
     </w:p>
-    <w:bookmarkEnd w:id="33"/>
-    <w:bookmarkStart w:id="34" w:name="passo-3-revisione"/>
+    <w:bookmarkEnd w:id="37"/>
+    <w:bookmarkStart w:id="38" w:name="passo-3-revisione"/>
     <w:p>
       <w:pPr>
         <w:pStyle w:val="Heading3"/>
@@ -2511,8 +3303,8 @@
         <w:t xml:space="preserve">L’AI genera SOLO il corpo giuridico. Intestazione, procura e firma sono pre-compilate dal codice Python in modo deterministico.</w:t>
       </w:r>
     </w:p>
-    <w:bookmarkEnd w:id="34"/>
-    <w:bookmarkStart w:id="35" w:name="passo-4-export"/>
+    <w:bookmarkEnd w:id="38"/>
+    <w:bookmarkStart w:id="39" w:name="passo-4-export"/>
     <w:p>
       <w:pPr>
         <w:pStyle w:val="Heading3"/>
@@ -2654,9 +3446,9 @@
         </w:pict>
       </w:r>
     </w:p>
-    <w:bookmarkEnd w:id="35"/>
-    <w:bookmarkEnd w:id="36"/>
-    <w:bookmarkStart w:id="40" w:name="notaio-sintetico-consulenza-strategica"/>
+    <w:bookmarkEnd w:id="39"/>
+    <w:bookmarkEnd w:id="40"/>
+    <w:bookmarkStart w:id="44" w:name="notaio-sintetico-consulenza-strategica"/>
     <w:p>
       <w:pPr>
         <w:pStyle w:val="Heading2"/>
@@ -2665,7 +3457,7 @@
         <w:t xml:space="preserve">6. Notaio Sintetico — Consulenza Strategica</w:t>
       </w:r>
     </w:p>
-    <w:bookmarkStart w:id="37" w:name="cosè"/>
+    <w:bookmarkStart w:id="41" w:name="cosè"/>
     <w:p>
       <w:pPr>
         <w:pStyle w:val="Heading3"/>
@@ -2738,8 +3530,8 @@
         <w:t xml:space="preserve">- Dubbi di procedura prima del rogito</w:t>
       </w:r>
     </w:p>
-    <w:bookmarkEnd w:id="37"/>
-    <w:bookmarkStart w:id="38" w:name="come-si-usa"/>
+    <w:bookmarkEnd w:id="41"/>
+    <w:bookmarkStart w:id="42" w:name="come-si-usa"/>
     <w:p>
       <w:pPr>
         <w:pStyle w:val="Heading3"/>
@@ -2875,8 +3667,8 @@
         <w:t xml:space="preserve">Mentre Nemotron elabora la risposta, vedrai questo indicatore. La risposta arriva in 30–60 secondi.</w:t>
       </w:r>
     </w:p>
-    <w:bookmarkEnd w:id="38"/>
-    <w:bookmarkStart w:id="39" w:name="esempi-di-domande"/>
+    <w:bookmarkEnd w:id="42"/>
+    <w:bookmarkStart w:id="43" w:name="esempi-di-domande"/>
     <w:p>
       <w:pPr>
         <w:pStyle w:val="Heading3"/>
@@ -2988,9 +3780,9 @@
         </w:pict>
       </w:r>
     </w:p>
-    <w:bookmarkEnd w:id="39"/>
-    <w:bookmarkEnd w:id="40"/>
-    <w:bookmarkStart w:id="44" w:name="esempi-concreti"/>
+    <w:bookmarkEnd w:id="43"/>
+    <w:bookmarkEnd w:id="44"/>
+    <w:bookmarkStart w:id="48" w:name="esempi-concreti"/>
     <w:p>
       <w:pPr>
         <w:pStyle w:val="Heading2"/>
@@ -2999,7 +3791,7 @@
         <w:t xml:space="preserve">7. Esempi Concreti</w:t>
       </w:r>
     </w:p>
-    <w:bookmarkStart w:id="41" w:name="prima-casa-under-36-compravendita"/>
+    <w:bookmarkStart w:id="45" w:name="prima-casa-under-36-compravendita"/>
     <w:p>
       <w:pPr>
         <w:pStyle w:val="Heading3"/>
@@ -3152,8 +3944,8 @@
         <w:t xml:space="preserve">Rivedi il documento e scarica in PDF/DOCX</w:t>
       </w:r>
     </w:p>
-    <w:bookmarkEnd w:id="41"/>
-    <w:bookmarkStart w:id="42" w:name="costituzione-srl"/>
+    <w:bookmarkEnd w:id="45"/>
+    <w:bookmarkStart w:id="46" w:name="costituzione-srl"/>
     <w:p>
       <w:pPr>
         <w:pStyle w:val="Heading3"/>
@@ -3294,8 +4086,8 @@
         <w:t xml:space="preserve">Il sistema genera 3 sezioni: Atto di Costituzione SRL, Controllo Documenti, Scadenze (iscrizione REA, PEC, ecc.)</w:t>
       </w:r>
     </w:p>
-    <w:bookmarkEnd w:id="42"/>
-    <w:bookmarkStart w:id="43" w:name="testamento-olografo-pubblico"/>
+    <w:bookmarkEnd w:id="46"/>
+    <w:bookmarkStart w:id="47" w:name="testamento-olografo-pubblico"/>
     <w:p>
       <w:pPr>
         <w:pStyle w:val="Heading3"/>
@@ -3425,9 +4217,9 @@
         </w:pict>
       </w:r>
     </w:p>
-    <w:bookmarkEnd w:id="43"/>
-    <w:bookmarkEnd w:id="44"/>
-    <w:bookmarkStart w:id="47" w:name="verifica-e-controllo-qualità"/>
+    <w:bookmarkEnd w:id="47"/>
+    <w:bookmarkEnd w:id="48"/>
+    <w:bookmarkStart w:id="51" w:name="verifica-e-controllo-qualità"/>
     <w:p>
       <w:pPr>
         <w:pStyle w:val="Heading2"/>
@@ -3436,7 +4228,7 @@
         <w:t xml:space="preserve">8. Verifica e Controllo Qualità</w:t>
       </w:r>
     </w:p>
-    <w:bookmarkStart w:id="45" w:name="placeholder-e-dati-da-verificare"/>
+    <w:bookmarkStart w:id="49" w:name="placeholder-e-dati-da-verificare"/>
     <w:p>
       <w:pPr>
         <w:pStyle w:val="Heading3"/>
@@ -3549,8 +4341,8 @@
         <w:t xml:space="preserve">.</w:t>
       </w:r>
     </w:p>
-    <w:bookmarkEnd w:id="45"/>
-    <w:bookmarkStart w:id="46" w:name="regole-di-sicurezza"/>
+    <w:bookmarkEnd w:id="49"/>
+    <w:bookmarkStart w:id="50" w:name="regole-di-sicurezza"/>
     <w:p>
       <w:pPr>
         <w:pStyle w:val="Heading3"/>
@@ -3648,9 +4440,9 @@
         </w:pict>
       </w:r>
     </w:p>
-    <w:bookmarkEnd w:id="46"/>
-    <w:bookmarkEnd w:id="47"/>
-    <w:bookmarkStart w:id="50" w:name="faq-e-troubleshooting"/>
+    <w:bookmarkEnd w:id="50"/>
+    <w:bookmarkEnd w:id="51"/>
+    <w:bookmarkStart w:id="54" w:name="faq-e-troubleshooting"/>
     <w:p>
       <w:pPr>
         <w:pStyle w:val="Heading2"/>
@@ -3659,7 +4451,7 @@
         <w:t xml:space="preserve">9. FAQ e Troubleshooting</w:t>
       </w:r>
     </w:p>
-    <w:bookmarkStart w:id="48" w:name="domande-frequenti"/>
+    <w:bookmarkStart w:id="52" w:name="domande-frequenti"/>
     <w:p>
       <w:pPr>
         <w:pStyle w:val="Heading3"/>
@@ -3693,10 +4485,89 @@
           <w:bCs/>
           <w:b/>
         </w:rPr>
-        <w:t xml:space="preserve">7 tipi</w:t>
-      </w:r>
-      <w:r>
-        <w:t xml:space="preserve">: Compravendita immobiliare, Costituzione SRL, Testamento, Patto di famiglia, Mutuo ipotecario, Divisione, Donazione.</w:t>
+        <w:t xml:space="preserve">14 tipi</w:t>
+      </w:r>
+      <w:r>
+        <w:t xml:space="preserve"> </w:t>
+      </w:r>
+      <w:r>
+        <w:t xml:space="preserve">raggruppati in 4 categorie:</w:t>
+      </w:r>
+      <w:r>
+        <w:t xml:space="preserve"> </w:t>
+      </w:r>
+      <w:r>
+        <w:t xml:space="preserve">&gt; - 🏠</w:t>
+      </w:r>
+      <w:r>
+        <w:t xml:space="preserve"> </w:t>
+      </w:r>
+      <w:r>
+        <w:rPr>
+          <w:bCs/>
+          <w:b/>
+        </w:rPr>
+        <w:t xml:space="preserve">Atti Immobiliari</w:t>
+      </w:r>
+      <w:r>
+        <w:t xml:space="preserve">: Compravendita, Mutuo, Cancellazione Ipoteca, Donazione, Divisione</w:t>
+      </w:r>
+      <w:r>
+        <w:t xml:space="preserve"> </w:t>
+      </w:r>
+      <w:r>
+        <w:t xml:space="preserve">&gt; - 👨‍👩‍👧</w:t>
+      </w:r>
+      <w:r>
+        <w:t xml:space="preserve"> </w:t>
+      </w:r>
+      <w:r>
+        <w:rPr>
+          <w:bCs/>
+          <w:b/>
+        </w:rPr>
+        <w:t xml:space="preserve">Atti di Famiglia e Successione</w:t>
+      </w:r>
+      <w:r>
+        <w:t xml:space="preserve">: Testamento, Patto di famiglia, Accettazione di Eredità, Rinuncia all’Eredità, Convenzioni Matrimoniali</w:t>
+      </w:r>
+      <w:r>
+        <w:t xml:space="preserve"> </w:t>
+      </w:r>
+      <w:r>
+        <w:t xml:space="preserve">&gt; - 🏢</w:t>
+      </w:r>
+      <w:r>
+        <w:t xml:space="preserve"> </w:t>
+      </w:r>
+      <w:r>
+        <w:rPr>
+          <w:bCs/>
+          <w:b/>
+        </w:rPr>
+        <w:t xml:space="preserve">Atti Societari</w:t>
+      </w:r>
+      <w:r>
+        <w:t xml:space="preserve">: Costituzione SRL, Verbale di Assemblea Straordinaria</w:t>
+      </w:r>
+      <w:r>
+        <w:t xml:space="preserve"> </w:t>
+      </w:r>
+      <w:r>
+        <w:t xml:space="preserve">&gt; - ⚖️</w:t>
+      </w:r>
+      <w:r>
+        <w:t xml:space="preserve"> </w:t>
+      </w:r>
+      <w:r>
+        <w:rPr>
+          <w:bCs/>
+          <w:b/>
+        </w:rPr>
+        <w:t xml:space="preserve">Atti di Procura e Giurisdizione</w:t>
+      </w:r>
+      <w:r>
+        <w:t xml:space="preserve">: Procura Speciale o Generale, Atto di Notorietà</w:t>
       </w:r>
     </w:p>
     <w:p>
@@ -4040,8 +4911,8 @@
         <w:t xml:space="preserve">È uno strumento di supporto per dubbi procedurali. Le decisioni giuridiche definitive spettano sempre al Notaio.</w:t>
       </w:r>
     </w:p>
-    <w:bookmarkEnd w:id="48"/>
-    <w:bookmarkStart w:id="49" w:name="errori-comuni-e-soluzioni"/>
+    <w:bookmarkEnd w:id="52"/>
+    <w:bookmarkStart w:id="53" w:name="errori-comuni-e-soluzioni"/>
     <w:p>
       <w:pPr>
         <w:pStyle w:val="Heading3"/>
@@ -4487,9 +5358,9 @@
         </w:pict>
       </w:r>
     </w:p>
-    <w:bookmarkEnd w:id="49"/>
-    <w:bookmarkEnd w:id="50"/>
-    <w:bookmarkStart w:id="60" w:name="prezzi-e-servizi-commerciali"/>
+    <w:bookmarkEnd w:id="53"/>
+    <w:bookmarkEnd w:id="54"/>
+    <w:bookmarkStart w:id="64" w:name="prezzi-e-servizi-commerciali"/>
     <w:p>
       <w:pPr>
         <w:pStyle w:val="Heading2"/>
@@ -4498,7 +5369,7 @@
         <w:t xml:space="preserve">10. Prezzi e Servizi Commerciali</w:t>
       </w:r>
     </w:p>
-    <w:bookmarkStart w:id="51" w:name="modello-di-business"/>
+    <w:bookmarkStart w:id="55" w:name="modello-di-business"/>
     <w:p>
       <w:pPr>
         <w:pStyle w:val="Heading3"/>
@@ -4528,8 +5399,8 @@
         <w:t xml:space="preserve">: il sistema viene installato fisicamente nello studio su hardware NVIDIA DGX SPARK (acquistato separatamente). I dati non escono mai dall’ufficio.</w:t>
       </w:r>
     </w:p>
-    <w:bookmarkEnd w:id="51"/>
-    <w:bookmarkStart w:id="52" w:name="pacchetti-disponibili"/>
+    <w:bookmarkEnd w:id="55"/>
+    <w:bookmarkStart w:id="56" w:name="pacchetti-disponibili"/>
     <w:p>
       <w:pPr>
         <w:pStyle w:val="Heading3"/>
@@ -4767,8 +5638,8 @@
         </w:tc>
       </w:tr>
     </w:tbl>
-    <w:bookmarkEnd w:id="52"/>
-    <w:bookmarkStart w:id="56" w:name="cosa-include-ogni-pacchetto"/>
+    <w:bookmarkEnd w:id="56"/>
+    <w:bookmarkStart w:id="60" w:name="cosa-include-ogni-pacchetto"/>
     <w:p>
       <w:pPr>
         <w:pStyle w:val="Heading3"/>
@@ -4777,7 +5648,7 @@
         <w:t xml:space="preserve">Cosa include ogni pacchetto</w:t>
       </w:r>
     </w:p>
-    <w:bookmarkStart w:id="53" w:name="base-500mese"/>
+    <w:bookmarkStart w:id="57" w:name="base-500mese"/>
     <w:p>
       <w:pPr>
         <w:pStyle w:val="Heading4"/>
@@ -4846,8 +5717,8 @@
         <w:t xml:space="preserve">Supporto email (24h SLA)</w:t>
       </w:r>
     </w:p>
-    <w:bookmarkEnd w:id="53"/>
-    <w:bookmarkStart w:id="54" w:name="professional-1.000mese"/>
+    <w:bookmarkEnd w:id="57"/>
+    <w:bookmarkStart w:id="58" w:name="professional-1.000mese"/>
     <w:p>
       <w:pPr>
         <w:pStyle w:val="Heading4"/>
@@ -4928,8 +5799,8 @@
         <w:t xml:space="preserve">2 sessioni di formazione</w:t>
       </w:r>
     </w:p>
-    <w:bookmarkEnd w:id="54"/>
-    <w:bookmarkStart w:id="55" w:name="enterprise-2.500mese"/>
+    <w:bookmarkEnd w:id="58"/>
+    <w:bookmarkStart w:id="59" w:name="enterprise-2.500mese"/>
     <w:p>
       <w:pPr>
         <w:pStyle w:val="Heading4"/>
@@ -5010,9 +5881,9 @@
         <w:t xml:space="preserve">Cluster HA (2 DGX SPARK)</w:t>
       </w:r>
     </w:p>
-    <w:bookmarkEnd w:id="55"/>
-    <w:bookmarkEnd w:id="56"/>
-    <w:bookmarkStart w:id="57" w:name="hardware-prerequisito"/>
+    <w:bookmarkEnd w:id="59"/>
+    <w:bookmarkEnd w:id="60"/>
+    <w:bookmarkStart w:id="61" w:name="hardware-prerequisito"/>
     <w:p>
       <w:pPr>
         <w:pStyle w:val="Heading3"/>
@@ -5053,8 +5924,8 @@
         <w:t xml:space="preserve">- &lt; 35 dB in operazione (adatto a ufficio)</w:t>
       </w:r>
     </w:p>
-    <w:bookmarkEnd w:id="57"/>
-    <w:bookmarkStart w:id="58" w:name="roi-stimato"/>
+    <w:bookmarkEnd w:id="61"/>
+    <w:bookmarkStart w:id="62" w:name="roi-stimato"/>
     <w:p>
       <w:pPr>
         <w:pStyle w:val="Heading3"/>
@@ -5222,8 +6093,8 @@
         </w:tc>
       </w:tr>
     </w:tbl>
-    <w:bookmarkEnd w:id="58"/>
-    <w:bookmarkStart w:id="59" w:name="contatti-commerciali"/>
+    <w:bookmarkEnd w:id="62"/>
+    <w:bookmarkStart w:id="63" w:name="contatti-commerciali"/>
     <w:p>
       <w:pPr>
         <w:pStyle w:val="Heading3"/>
@@ -5305,9 +6176,9 @@
         </w:pict>
       </w:r>
     </w:p>
-    <w:bookmarkEnd w:id="59"/>
-    <w:bookmarkEnd w:id="60"/>
-    <w:bookmarkStart w:id="70" w:name="gli-agenti-ai-di-notaio-ai-dettaglio"/>
+    <w:bookmarkEnd w:id="63"/>
+    <w:bookmarkEnd w:id="64"/>
+    <w:bookmarkStart w:id="74" w:name="gli-agenti-ai-di-notaio-ai-dettaglio"/>
     <w:p>
       <w:pPr>
         <w:pStyle w:val="Heading2"/>
@@ -5316,7 +6187,7 @@
         <w:t xml:space="preserve">11. Gli Agenti AI di Notaio AI — Dettaglio</w:t>
       </w:r>
     </w:p>
-    <w:bookmarkStart w:id="61" w:name="panoramica-1"/>
+    <w:bookmarkStart w:id="65" w:name="panoramica-1"/>
     <w:p>
       <w:pPr>
         <w:pStyle w:val="Heading3"/>
@@ -5346,8 +6217,8 @@
         <w:t xml:space="preserve">, ciascuno con una propria identità, competenze e regole di comportamento. Il sistema sceglie automaticamente l’agente giusto per ogni compito.</w:t>
       </w:r>
     </w:p>
-    <w:bookmarkEnd w:id="61"/>
-    <w:bookmarkStart w:id="69" w:name="gli-agenti"/>
+    <w:bookmarkEnd w:id="65"/>
+    <w:bookmarkStart w:id="73" w:name="gli-agenti"/>
     <w:p>
       <w:pPr>
         <w:pStyle w:val="Heading3"/>
@@ -5356,7 +6227,7 @@
         <w:t xml:space="preserve">Gli agenti</w:t>
       </w:r>
     </w:p>
-    <w:bookmarkStart w:id="62" w:name="attista"/>
+    <w:bookmarkStart w:id="66" w:name="attista"/>
     <w:p>
       <w:pPr>
         <w:pStyle w:val="Heading4"/>
@@ -5497,8 +6368,8 @@
         <w:t xml:space="preserve">Compravendita, Costituzione SRL, Testamento, Patto di famiglia, Mutuo, Divisione, Donazione</w:t>
       </w:r>
     </w:p>
-    <w:bookmarkEnd w:id="62"/>
-    <w:bookmarkStart w:id="63" w:name="catasto"/>
+    <w:bookmarkEnd w:id="66"/>
+    <w:bookmarkStart w:id="67" w:name="catasto"/>
     <w:p>
       <w:pPr>
         <w:pStyle w:val="Heading4"/>
@@ -5639,8 +6510,8 @@
         <w:t xml:space="preserve">Solo per atti immobiliari (Compravendita, Mutuo, Divisione, Donazione)</w:t>
       </w:r>
     </w:p>
-    <w:bookmarkEnd w:id="63"/>
-    <w:bookmarkStart w:id="64" w:name="conformità"/>
+    <w:bookmarkEnd w:id="67"/>
+    <w:bookmarkStart w:id="68" w:name="conformità"/>
     <w:p>
       <w:pPr>
         <w:pStyle w:val="Heading4"/>
@@ -5781,8 +6652,8 @@
         <w:t xml:space="preserve">Solo per atti immobiliari</w:t>
       </w:r>
     </w:p>
-    <w:bookmarkEnd w:id="64"/>
-    <w:bookmarkStart w:id="65" w:name="controllo"/>
+    <w:bookmarkEnd w:id="68"/>
+    <w:bookmarkStart w:id="69" w:name="controllo"/>
     <w:p>
       <w:pPr>
         <w:pStyle w:val="Heading4"/>
@@ -5901,8 +6772,8 @@
         <w:t xml:space="preserve">Non dà OK definitivo, distingue obbligo da best practice</w:t>
       </w:r>
     </w:p>
-    <w:bookmarkEnd w:id="65"/>
-    <w:bookmarkStart w:id="66" w:name="scadenze"/>
+    <w:bookmarkEnd w:id="69"/>
+    <w:bookmarkStart w:id="70" w:name="scadenze"/>
     <w:p>
       <w:pPr>
         <w:pStyle w:val="Heading4"/>
@@ -6021,8 +6892,8 @@
         <w:t xml:space="preserve">Distingue perentori da ordinatori, calcola in giorni solari</w:t>
       </w:r>
     </w:p>
-    <w:bookmarkEnd w:id="66"/>
-    <w:bookmarkStart w:id="67" w:name="ricercatore"/>
+    <w:bookmarkEnd w:id="70"/>
+    <w:bookmarkStart w:id="71" w:name="ricercatore"/>
     <w:p>
       <w:pPr>
         <w:pStyle w:val="Heading4"/>
@@ -6141,8 +7012,8 @@
         <w:t xml:space="preserve">Non inventa norme, distingue vigente da abrogata</w:t>
       </w:r>
     </w:p>
-    <w:bookmarkEnd w:id="67"/>
-    <w:bookmarkStart w:id="68" w:name="firma"/>
+    <w:bookmarkEnd w:id="71"/>
+    <w:bookmarkStart w:id="72" w:name="firma"/>
     <w:p>
       <w:pPr>
         <w:pStyle w:val="Heading4"/>
@@ -6307,13 +7178,13 @@
           <w:iCs/>
           <w:i/>
         </w:rPr>
-        <w:t xml:space="preserve">Versione 1.2 — 4 Maggio 2026</w:t>
-      </w:r>
-    </w:p>
-    <w:bookmarkEnd w:id="68"/>
-    <w:bookmarkEnd w:id="69"/>
-    <w:bookmarkEnd w:id="70"/>
-    <w:bookmarkEnd w:id="71"/>
+        <w:t xml:space="preserve">Versione 1.3 — 4 Maggio 2026</w:t>
+      </w:r>
+    </w:p>
+    <w:bookmarkEnd w:id="72"/>
+    <w:bookmarkEnd w:id="73"/>
+    <w:bookmarkEnd w:id="74"/>
+    <w:bookmarkEnd w:id="75"/>
     <w:sectPr/>
   </w:body>
 </w:document>

</xml_diff>